<commit_message>
Update CV and page
</commit_message>
<xml_diff>
--- a/docs/CV-mhidalgo-EN.docx
+++ b/docs/CV-mhidalgo-EN.docx
@@ -1,6 +1,6 @@
 
 <file path=word/document.xml><?xml version="1.0" encoding="utf-8"?>
-<w:document xmlns:wpc="http://schemas.microsoft.com/office/word/2010/wordprocessingCanvas" xmlns:cx="http://schemas.microsoft.com/office/drawing/2014/chartex" xmlns:cx1="http://schemas.microsoft.com/office/drawing/2015/9/8/chartex" xmlns:cx2="http://schemas.microsoft.com/office/drawing/2015/10/21/chartex" xmlns:cx3="http://schemas.microsoft.com/office/drawing/2016/5/9/chartex" xmlns:cx4="http://schemas.microsoft.com/office/drawing/2016/5/10/chartex" xmlns:cx5="http://schemas.microsoft.com/office/drawing/2016/5/11/chartex" xmlns:cx6="http://schemas.microsoft.com/office/drawing/2016/5/12/chartex" xmlns:cx7="http://schemas.microsoft.com/office/drawing/2016/5/13/chartex" xmlns:cx8="http://schemas.microsoft.com/office/drawing/2016/5/14/chartex" xmlns:mc="http://schemas.openxmlformats.org/markup-compatibility/2006" xmlns:aink="http://schemas.microsoft.com/office/drawing/2016/ink" xmlns:am3d="http://schemas.microsoft.com/office/drawing/2017/model3d" xmlns:o="urn:schemas-microsoft-com:office:office" xmlns:oel="http://schemas.microsoft.com/office/2019/extlst" xmlns:r="http://schemas.openxmlformats.org/officeDocument/2006/relationships" xmlns:m="http://schemas.openxmlformats.org/officeDocument/2006/math" xmlns:v="urn:schemas-microsoft-com:vml" xmlns:wp14="http://schemas.microsoft.com/office/word/2010/wordprocessingDrawing" xmlns:wp="http://schemas.openxmlformats.org/drawingml/2006/wordprocessingDrawing" xmlns:w10="urn:schemas-microsoft-com:office:word" xmlns:w="http://schemas.openxmlformats.org/wordprocessingml/2006/main" xmlns:w14="http://schemas.microsoft.com/office/word/2010/wordml" xmlns:w15="http://schemas.microsoft.com/office/word/2012/wordml" xmlns:w16cex="http://schemas.microsoft.com/office/word/2018/wordml/cex" xmlns:w16cid="http://schemas.microsoft.com/office/word/2016/wordml/cid" xmlns:w16="http://schemas.microsoft.com/office/word/2018/wordml" xmlns:w16du="http://schemas.microsoft.com/office/word/2023/wordml/word16du" xmlns:w16sdtdh="http://schemas.microsoft.com/office/word/2020/wordml/sdtdatahash" xmlns:w16se="http://schemas.microsoft.com/office/word/2015/wordml/symex" xmlns:wpg="http://schemas.microsoft.com/office/word/2010/wordprocessingGroup" xmlns:wpi="http://schemas.microsoft.com/office/word/2010/wordprocessingInk" xmlns:wne="http://schemas.microsoft.com/office/word/2006/wordml" xmlns:wps="http://schemas.microsoft.com/office/word/2010/wordprocessingShape" mc:Ignorable="w14 w15 w16se w16cid w16 w16cex w16sdtdh w16du wp14">
+<w:document xmlns:wpc="http://schemas.microsoft.com/office/word/2010/wordprocessingCanvas" xmlns:cx="http://schemas.microsoft.com/office/drawing/2014/chartex" xmlns:cx1="http://schemas.microsoft.com/office/drawing/2015/9/8/chartex" xmlns:cx2="http://schemas.microsoft.com/office/drawing/2015/10/21/chartex" xmlns:cx3="http://schemas.microsoft.com/office/drawing/2016/5/9/chartex" xmlns:cx4="http://schemas.microsoft.com/office/drawing/2016/5/10/chartex" xmlns:cx5="http://schemas.microsoft.com/office/drawing/2016/5/11/chartex" xmlns:cx6="http://schemas.microsoft.com/office/drawing/2016/5/12/chartex" xmlns:cx7="http://schemas.microsoft.com/office/drawing/2016/5/13/chartex" xmlns:cx8="http://schemas.microsoft.com/office/drawing/2016/5/14/chartex" xmlns:mc="http://schemas.openxmlformats.org/markup-compatibility/2006" xmlns:aink="http://schemas.microsoft.com/office/drawing/2016/ink" xmlns:am3d="http://schemas.microsoft.com/office/drawing/2017/model3d" xmlns:o="urn:schemas-microsoft-com:office:office" xmlns:oel="http://schemas.microsoft.com/office/2019/extlst" xmlns:r="http://schemas.openxmlformats.org/officeDocument/2006/relationships" xmlns:m="http://schemas.openxmlformats.org/officeDocument/2006/math" xmlns:v="urn:schemas-microsoft-com:vml" xmlns:wp14="http://schemas.microsoft.com/office/word/2010/wordprocessingDrawing" xmlns:wp="http://schemas.openxmlformats.org/drawingml/2006/wordprocessingDrawing" xmlns:w10="urn:schemas-microsoft-com:office:word" xmlns:w="http://schemas.openxmlformats.org/wordprocessingml/2006/main" xmlns:w14="http://schemas.microsoft.com/office/word/2010/wordml" xmlns:w15="http://schemas.microsoft.com/office/word/2012/wordml" xmlns:w16cex="http://schemas.microsoft.com/office/word/2018/wordml/cex" xmlns:w16cid="http://schemas.microsoft.com/office/word/2016/wordml/cid" xmlns:w16="http://schemas.microsoft.com/office/word/2018/wordml" xmlns:w16du="http://schemas.microsoft.com/office/word/2023/wordml/word16du" xmlns:w16sdtdh="http://schemas.microsoft.com/office/word/2020/wordml/sdtdatahash" xmlns:w16sdtfl="http://schemas.microsoft.com/office/word/2024/wordml/sdtformatlock" xmlns:w16se="http://schemas.microsoft.com/office/word/2015/wordml/symex" xmlns:wpg="http://schemas.microsoft.com/office/word/2010/wordprocessingGroup" xmlns:wpi="http://schemas.microsoft.com/office/word/2010/wordprocessingInk" xmlns:wne="http://schemas.microsoft.com/office/word/2006/wordml" xmlns:wps="http://schemas.microsoft.com/office/word/2010/wordprocessingShape" mc:Ignorable="w14 w15 w16se w16cid w16 w16cex w16sdtdh w16sdtfl w16du wp14">
   <w:body>
     <w:p>
       <w:pPr>
@@ -66,18 +66,18 @@
           <w:lang w:val="en-US" w:eastAsia="en-US"/>
         </w:rPr>
         <w:drawing>
-          <wp:anchor distT="0" distB="0" distL="114300" distR="114300" simplePos="0" relativeHeight="251659264" behindDoc="0" locked="0" layoutInCell="1" allowOverlap="1" wp14:anchorId="78480E6F" wp14:editId="7F5EB3E1">
+          <wp:anchor distT="0" distB="0" distL="114300" distR="114300" simplePos="0" relativeHeight="251659264" behindDoc="0" locked="0" layoutInCell="1" allowOverlap="1" wp14:anchorId="78480E6F" wp14:editId="67DEFC35">
             <wp:simplePos x="0" y="0"/>
             <wp:positionH relativeFrom="column">
-              <wp:posOffset>4704715</wp:posOffset>
+              <wp:posOffset>4708344</wp:posOffset>
             </wp:positionH>
             <wp:positionV relativeFrom="paragraph">
-              <wp:posOffset>16510</wp:posOffset>
+              <wp:posOffset>13335</wp:posOffset>
             </wp:positionV>
-            <wp:extent cx="1497330" cy="1495425"/>
-            <wp:effectExtent l="19050" t="0" r="7620" b="0"/>
+            <wp:extent cx="1496422" cy="1495425"/>
+            <wp:effectExtent l="0" t="0" r="0" b="0"/>
             <wp:wrapNone/>
-            <wp:docPr id="6" name="5 Imagen" descr="mhidalgonew2.png"/>
+            <wp:docPr id="6" name="5 Imagen"/>
             <wp:cNvGraphicFramePr>
               <a:graphicFrameLocks xmlns:a="http://schemas.openxmlformats.org/drawingml/2006/main" noChangeAspect="1"/>
             </wp:cNvGraphicFramePr>
@@ -85,11 +85,17 @@
               <a:graphicData uri="http://schemas.openxmlformats.org/drawingml/2006/picture">
                 <pic:pic xmlns:pic="http://schemas.openxmlformats.org/drawingml/2006/picture">
                   <pic:nvPicPr>
-                    <pic:cNvPr id="0" name="mhidalgonew2.png"/>
+                    <pic:cNvPr id="6" name="5 Imagen"/>
                     <pic:cNvPicPr/>
                   </pic:nvPicPr>
                   <pic:blipFill>
-                    <a:blip r:embed="rId8" cstate="print"/>
+                    <a:blip r:embed="rId8" cstate="print">
+                      <a:extLst>
+                        <a:ext uri="{28A0092B-C50C-407E-A947-70E740481C1C}">
+                          <a14:useLocalDpi xmlns:a14="http://schemas.microsoft.com/office/drawing/2010/main" val="0"/>
+                        </a:ext>
+                      </a:extLst>
+                    </a:blip>
                     <a:stretch>
                       <a:fillRect/>
                     </a:stretch>
@@ -97,7 +103,7 @@
                   <pic:spPr>
                     <a:xfrm>
                       <a:off x="0" y="0"/>
-                      <a:ext cx="1497330" cy="1495425"/>
+                      <a:ext cx="1496422" cy="1495425"/>
                     </a:xfrm>
                     <a:prstGeom prst="rect">
                       <a:avLst/>
@@ -263,25 +269,7 @@
           <w:szCs w:val="32"/>
           <w:lang w:val="en-GB"/>
         </w:rPr>
-        <w:t xml:space="preserve"> </w:t>
-      </w:r>
-      <w:proofErr w:type="spellStart"/>
-      <w:r>
-        <w:rPr>
-          <w:sz w:val="32"/>
-          <w:szCs w:val="32"/>
-          <w:lang w:val="en-GB"/>
-        </w:rPr>
-        <w:t>Tandil</w:t>
-      </w:r>
-      <w:proofErr w:type="spellEnd"/>
-      <w:r>
-        <w:rPr>
-          <w:sz w:val="32"/>
-          <w:szCs w:val="32"/>
-          <w:lang w:val="en-GB"/>
-        </w:rPr>
-        <w:t>, Bs. As., Argentina</w:t>
+        <w:t xml:space="preserve"> Tandil, Bs. As., Argentina</w:t>
       </w:r>
     </w:p>
     <w:p>
@@ -454,36 +442,17 @@
         </w:rPr>
         <w:t xml:space="preserve">Mail: </w:t>
       </w:r>
-      <w:r>
-        <w:fldChar w:fldCharType="begin"/>
-      </w:r>
-      <w:r>
-        <w:rPr>
-          <w:lang w:val="en-US"/>
-        </w:rPr>
-        <w:instrText>HYPERLINK "mailto:chuj4pr0@gmail.com"</w:instrText>
-      </w:r>
-      <w:r>
-        <w:fldChar w:fldCharType="separate"/>
-      </w:r>
-      <w:r>
-        <w:rPr>
-          <w:rStyle w:val="Hipervnculo"/>
-          <w:sz w:val="32"/>
-          <w:szCs w:val="32"/>
-          <w:lang w:val="en-GB"/>
-        </w:rPr>
-        <w:t>chuj4pr0@gmail.com</w:t>
-      </w:r>
-      <w:r>
-        <w:rPr>
-          <w:rStyle w:val="Hipervnculo"/>
-          <w:sz w:val="32"/>
-          <w:szCs w:val="32"/>
-          <w:lang w:val="en-GB"/>
-        </w:rPr>
-        <w:fldChar w:fldCharType="end"/>
-      </w:r>
+      <w:hyperlink r:id="rId9" w:history="1">
+        <w:r>
+          <w:rPr>
+            <w:rStyle w:val="Hipervnculo"/>
+            <w:sz w:val="32"/>
+            <w:szCs w:val="32"/>
+            <w:lang w:val="en-GB"/>
+          </w:rPr>
+          <w:t>matiasmartinhidalgo@gmail.com</w:t>
+        </w:r>
+      </w:hyperlink>
     </w:p>
     <w:p>
       <w:pPr>
@@ -538,7 +507,23 @@
           <w:szCs w:val="28"/>
           <w:lang w:val="en-GB"/>
         </w:rPr>
-        <w:t xml:space="preserve">2010 – Current </w:t>
+        <w:t xml:space="preserve">2010 – </w:t>
+      </w:r>
+      <w:r>
+        <w:rPr>
+          <w:sz w:val="28"/>
+          <w:szCs w:val="28"/>
+          <w:lang w:val="en-GB"/>
+        </w:rPr>
+        <w:t>2019</w:t>
+      </w:r>
+      <w:r>
+        <w:rPr>
+          <w:sz w:val="28"/>
+          <w:szCs w:val="28"/>
+          <w:lang w:val="en-GB"/>
+        </w:rPr>
+        <w:t xml:space="preserve"> </w:t>
       </w:r>
     </w:p>
     <w:p>
@@ -602,23 +587,7 @@
           <w:szCs w:val="28"/>
           <w:lang w:val="en-GB"/>
         </w:rPr>
-        <w:t xml:space="preserve">Software Engineering </w:t>
-      </w:r>
-      <w:r>
-        <w:rPr>
-          <w:sz w:val="28"/>
-          <w:szCs w:val="28"/>
-          <w:lang w:val="en-GB"/>
-        </w:rPr>
-        <w:t>(Degree expected in 2020</w:t>
-      </w:r>
-      <w:r>
-        <w:rPr>
-          <w:sz w:val="28"/>
-          <w:szCs w:val="28"/>
-          <w:lang w:val="en-GB"/>
-        </w:rPr>
-        <w:t>)</w:t>
+        <w:t>Software Engineering</w:t>
       </w:r>
     </w:p>
     <w:p>
@@ -764,23 +733,13 @@
           <w:lang w:val="es-MX"/>
         </w:rPr>
       </w:pPr>
-      <w:proofErr w:type="spellStart"/>
       <w:r>
         <w:rPr>
           <w:sz w:val="28"/>
           <w:szCs w:val="28"/>
           <w:lang w:val="es-ES"/>
         </w:rPr>
-        <w:t>Institute</w:t>
-      </w:r>
-      <w:proofErr w:type="spellEnd"/>
-      <w:r>
-        <w:rPr>
-          <w:sz w:val="28"/>
-          <w:szCs w:val="28"/>
-          <w:lang w:val="es-ES"/>
-        </w:rPr>
-        <w:t xml:space="preserve"> TE</w:t>
+        <w:t>Institute TE</w:t>
       </w:r>
       <w:r>
         <w:rPr>
@@ -1229,36 +1188,8 @@
           <w:szCs w:val="28"/>
           <w:lang w:val="es-ES"/>
         </w:rPr>
-        <w:t xml:space="preserve">Magento 2 </w:t>
-      </w:r>
-      <w:proofErr w:type="spellStart"/>
-      <w:r>
-        <w:rPr>
-          <w:sz w:val="28"/>
-          <w:szCs w:val="28"/>
-          <w:lang w:val="es-ES"/>
-        </w:rPr>
-        <w:t>Certified</w:t>
-      </w:r>
-      <w:proofErr w:type="spellEnd"/>
-      <w:r>
-        <w:rPr>
-          <w:sz w:val="28"/>
-          <w:szCs w:val="28"/>
-          <w:lang w:val="es-ES"/>
-        </w:rPr>
-        <w:t xml:space="preserve"> Professional </w:t>
-      </w:r>
-      <w:proofErr w:type="spellStart"/>
-      <w:r>
-        <w:rPr>
-          <w:sz w:val="28"/>
-          <w:szCs w:val="28"/>
-          <w:lang w:val="es-ES"/>
-        </w:rPr>
-        <w:t>Developer</w:t>
-      </w:r>
-      <w:proofErr w:type="spellEnd"/>
+        <w:t>Magento 2 Certified Professional Developer</w:t>
+      </w:r>
       <w:r>
         <w:rPr>
           <w:sz w:val="28"/>
@@ -1455,54 +1386,8 @@
           <w:szCs w:val="28"/>
           <w:lang w:val="es-ES"/>
         </w:rPr>
-        <w:t xml:space="preserve">Magento 2 </w:t>
-      </w:r>
-      <w:proofErr w:type="spellStart"/>
-      <w:r>
-        <w:rPr>
-          <w:sz w:val="28"/>
-          <w:szCs w:val="28"/>
-          <w:lang w:val="es-ES"/>
-        </w:rPr>
-        <w:t>Certified</w:t>
-      </w:r>
-      <w:proofErr w:type="spellEnd"/>
-      <w:r>
-        <w:rPr>
-          <w:sz w:val="28"/>
-          <w:szCs w:val="28"/>
-          <w:lang w:val="es-ES"/>
-        </w:rPr>
-        <w:t xml:space="preserve"> </w:t>
-      </w:r>
-      <w:proofErr w:type="spellStart"/>
-      <w:r>
-        <w:rPr>
-          <w:sz w:val="28"/>
-          <w:szCs w:val="28"/>
-          <w:lang w:val="es-ES"/>
-        </w:rPr>
-        <w:t>Associate</w:t>
-      </w:r>
-      <w:proofErr w:type="spellEnd"/>
-      <w:r>
-        <w:rPr>
-          <w:sz w:val="28"/>
-          <w:szCs w:val="28"/>
-          <w:lang w:val="es-ES"/>
-        </w:rPr>
-        <w:t xml:space="preserve"> </w:t>
-      </w:r>
-      <w:proofErr w:type="spellStart"/>
-      <w:r>
-        <w:rPr>
-          <w:sz w:val="28"/>
-          <w:szCs w:val="28"/>
-          <w:lang w:val="es-ES"/>
-        </w:rPr>
-        <w:t>Developer</w:t>
-      </w:r>
-      <w:proofErr w:type="spellEnd"/>
+        <w:t>Magento 2 Certified Associate Developer</w:t>
+      </w:r>
       <w:r>
         <w:rPr>
           <w:sz w:val="28"/>
@@ -1831,23 +1716,13 @@
         </w:rPr>
         <w:t xml:space="preserve"> on </w:t>
       </w:r>
-      <w:proofErr w:type="spellStart"/>
-      <w:r>
-        <w:rPr>
-          <w:sz w:val="26"/>
-          <w:szCs w:val="26"/>
-          <w:lang w:val="en-GB"/>
-        </w:rPr>
-        <w:t>Im</w:t>
-      </w:r>
-      <w:proofErr w:type="spellEnd"/>
-      <w:r>
-        <w:rPr>
-          <w:sz w:val="26"/>
-          <w:szCs w:val="26"/>
-          <w:lang w:val="en-GB"/>
-        </w:rPr>
-        <w:t xml:space="preserve"> Digital</w:t>
+      <w:r>
+        <w:rPr>
+          <w:sz w:val="26"/>
+          <w:szCs w:val="26"/>
+          <w:lang w:val="en-GB"/>
+        </w:rPr>
+        <w:t>Im Digital</w:t>
       </w:r>
       <w:r>
         <w:rPr>
@@ -1963,7 +1838,6 @@
         </w:rPr>
         <w:t xml:space="preserve">: Magento Backend Developer on </w:t>
       </w:r>
-      <w:proofErr w:type="spellStart"/>
       <w:r>
         <w:rPr>
           <w:sz w:val="26"/>
@@ -1972,7 +1846,14 @@
         </w:rPr>
         <w:t>Mediotype</w:t>
       </w:r>
-      <w:proofErr w:type="spellEnd"/>
+      <w:r>
+        <w:rPr>
+          <w:sz w:val="26"/>
+          <w:szCs w:val="26"/>
+          <w:lang w:val="en-GB"/>
+        </w:rPr>
+        <w:t xml:space="preserve"> / Blue Acorn ici</w:t>
+      </w:r>
       <w:r>
         <w:rPr>
           <w:sz w:val="26"/>
@@ -2127,25 +2008,7 @@
           <w:szCs w:val="26"/>
           <w:lang w:val="en-GB"/>
         </w:rPr>
-        <w:t xml:space="preserve">Solutions, </w:t>
-      </w:r>
-      <w:proofErr w:type="spellStart"/>
-      <w:r>
-        <w:rPr>
-          <w:sz w:val="26"/>
-          <w:szCs w:val="26"/>
-          <w:lang w:val="en-GB"/>
-        </w:rPr>
-        <w:t>Tandil</w:t>
-      </w:r>
-      <w:proofErr w:type="spellEnd"/>
-      <w:r>
-        <w:rPr>
-          <w:sz w:val="26"/>
-          <w:szCs w:val="26"/>
-          <w:lang w:val="en-GB"/>
-        </w:rPr>
-        <w:t>, Buenos Aires, Argentina.</w:t>
+        <w:t>Solutions, Tandil, Buenos Aires, Argentina.</w:t>
       </w:r>
     </w:p>
     <w:p>
@@ -2195,25 +2058,7 @@
           <w:szCs w:val="26"/>
           <w:lang w:val="en-GB"/>
         </w:rPr>
-        <w:t xml:space="preserve">: Web Developer on Temperies, </w:t>
-      </w:r>
-      <w:proofErr w:type="spellStart"/>
-      <w:r>
-        <w:rPr>
-          <w:sz w:val="26"/>
-          <w:szCs w:val="26"/>
-          <w:lang w:val="en-GB"/>
-        </w:rPr>
-        <w:t>Tandil</w:t>
-      </w:r>
-      <w:proofErr w:type="spellEnd"/>
-      <w:r>
-        <w:rPr>
-          <w:sz w:val="26"/>
-          <w:szCs w:val="26"/>
-          <w:lang w:val="en-GB"/>
-        </w:rPr>
-        <w:t>, Buenos Aires, Argentina.</w:t>
+        <w:t>: Web Developer on Temperies, Tandil, Buenos Aires, Argentina.</w:t>
       </w:r>
     </w:p>
     <w:p>
@@ -2279,25 +2124,7 @@
           <w:szCs w:val="26"/>
           <w:lang w:val="en-GB"/>
         </w:rPr>
-        <w:t xml:space="preserve">, </w:t>
-      </w:r>
-      <w:proofErr w:type="spellStart"/>
-      <w:r>
-        <w:rPr>
-          <w:sz w:val="26"/>
-          <w:szCs w:val="26"/>
-          <w:lang w:val="en-GB"/>
-        </w:rPr>
-        <w:t>Tandil</w:t>
-      </w:r>
-      <w:proofErr w:type="spellEnd"/>
-      <w:r>
-        <w:rPr>
-          <w:sz w:val="26"/>
-          <w:szCs w:val="26"/>
-          <w:lang w:val="en-GB"/>
-        </w:rPr>
-        <w:t>, Buenos Aires, Argentina.</w:t>
+        <w:t>, Tandil, Buenos Aires, Argentina.</w:t>
       </w:r>
     </w:p>
     <w:p>
@@ -2465,7 +2292,7 @@
           <w:szCs w:val="26"/>
           <w:lang w:val="en-GB"/>
         </w:rPr>
-        <w:t>Magento Architect with a solid technical background and working experience in analysis, design and development of web-based applications. During last eight years I specialize in e-commerce development with Magento (1 and 2) platform even I own seven certifications in such platform.</w:t>
+        <w:t>Results-driven Magento Architect with a strong technical foundation in web application development and eleven years of specialized experience in e-commerce using the Magento platform (versions 1 and 2). My seven Magento certifications demonstrate deep expertise in all phases of the development lifecycle, from analysis and design to implementation and optimization. I am adept at building scalable and maintainable e-commerce solutions that meet complex business requirements.</w:t>
       </w:r>
     </w:p>
     <w:p>
@@ -2791,29 +2618,7 @@
           <w:szCs w:val="26"/>
           <w:lang w:val="en-GB"/>
         </w:rPr>
-        <w:t xml:space="preserve">PC </w:t>
-      </w:r>
-      <w:proofErr w:type="spellStart"/>
-      <w:r>
-        <w:rPr>
-          <w:rFonts w:asciiTheme="minorHAnsi" w:hAnsiTheme="minorHAnsi" w:cstheme="minorHAnsi"/>
-          <w:b/>
-          <w:sz w:val="28"/>
-          <w:szCs w:val="26"/>
-          <w:lang w:val="en-GB"/>
-        </w:rPr>
-        <w:t>Líder</w:t>
-      </w:r>
-      <w:proofErr w:type="spellEnd"/>
-      <w:r>
-        <w:rPr>
-          <w:rFonts w:asciiTheme="minorHAnsi" w:hAnsiTheme="minorHAnsi" w:cstheme="minorHAnsi"/>
-          <w:b/>
-          <w:sz w:val="28"/>
-          <w:szCs w:val="26"/>
-          <w:lang w:val="en-GB"/>
-        </w:rPr>
-        <w:t xml:space="preserve"> 2011</w:t>
+        <w:t>PC Líder 2011</w:t>
       </w:r>
     </w:p>
     <w:p>
@@ -2865,18 +2670,34 @@
         </w:rPr>
         <w:t xml:space="preserve"> - </w:t>
       </w:r>
-      <w:r>
-        <w:fldChar w:fldCharType="begin"/>
-      </w:r>
-      <w:r>
-        <w:rPr>
-          <w:lang w:val="en-US"/>
-        </w:rPr>
-        <w:instrText>HYPERLINK "http://www.pclider.com.ar"</w:instrText>
-      </w:r>
-      <w:r>
-        <w:fldChar w:fldCharType="separate"/>
-      </w:r>
+      <w:hyperlink r:id="rId10" w:history="1">
+        <w:r>
+          <w:rPr>
+            <w:rFonts w:asciiTheme="minorHAnsi" w:hAnsiTheme="minorHAnsi" w:cstheme="minorHAnsi"/>
+            <w:b/>
+            <w:color w:val="0000FF"/>
+            <w:sz w:val="26"/>
+            <w:szCs w:val="26"/>
+            <w:u w:val="single"/>
+            <w:lang w:val="en-GB"/>
+          </w:rPr>
+          <w:t>www</w:t>
+        </w:r>
+      </w:hyperlink>
+      <w:hyperlink r:id="rId11" w:history="1">
+        <w:r>
+          <w:rPr>
+            <w:rFonts w:asciiTheme="minorHAnsi" w:hAnsiTheme="minorHAnsi" w:cstheme="minorHAnsi"/>
+            <w:b/>
+            <w:color w:val="0000FF"/>
+            <w:sz w:val="26"/>
+            <w:szCs w:val="26"/>
+            <w:u w:val="single"/>
+            <w:lang w:val="en-GB"/>
+          </w:rPr>
+          <w:t>.</w:t>
+        </w:r>
+      </w:hyperlink>
       <w:r>
         <w:rPr>
           <w:rFonts w:asciiTheme="minorHAnsi" w:hAnsiTheme="minorHAnsi" w:cstheme="minorHAnsi"/>
@@ -2887,236 +2708,64 @@
           <w:u w:val="single"/>
           <w:lang w:val="en-GB"/>
         </w:rPr>
-        <w:t>www</w:t>
-      </w:r>
-      <w:r>
-        <w:rPr>
-          <w:rFonts w:asciiTheme="minorHAnsi" w:hAnsiTheme="minorHAnsi" w:cstheme="minorHAnsi"/>
-          <w:b/>
-          <w:color w:val="0000FF"/>
-          <w:sz w:val="26"/>
-          <w:szCs w:val="26"/>
-          <w:u w:val="single"/>
-          <w:lang w:val="en-GB"/>
-        </w:rPr>
-        <w:fldChar w:fldCharType="end"/>
-      </w:r>
-      <w:r>
-        <w:fldChar w:fldCharType="begin"/>
-      </w:r>
-      <w:r>
-        <w:rPr>
-          <w:lang w:val="en-US"/>
-        </w:rPr>
-        <w:instrText>HYPERLINK "http://www.pclider.com.ar"</w:instrText>
-      </w:r>
-      <w:r>
-        <w:fldChar w:fldCharType="separate"/>
-      </w:r>
-      <w:r>
-        <w:rPr>
-          <w:rFonts w:asciiTheme="minorHAnsi" w:hAnsiTheme="minorHAnsi" w:cstheme="minorHAnsi"/>
-          <w:b/>
-          <w:color w:val="0000FF"/>
-          <w:sz w:val="26"/>
-          <w:szCs w:val="26"/>
-          <w:u w:val="single"/>
-          <w:lang w:val="en-GB"/>
-        </w:rPr>
-        <w:t>.</w:t>
-      </w:r>
-      <w:r>
-        <w:rPr>
-          <w:rFonts w:asciiTheme="minorHAnsi" w:hAnsiTheme="minorHAnsi" w:cstheme="minorHAnsi"/>
-          <w:b/>
-          <w:color w:val="0000FF"/>
-          <w:sz w:val="26"/>
-          <w:szCs w:val="26"/>
-          <w:u w:val="single"/>
-          <w:lang w:val="en-GB"/>
-        </w:rPr>
-        <w:fldChar w:fldCharType="end"/>
-      </w:r>
-      <w:r>
-        <w:fldChar w:fldCharType="begin"/>
-      </w:r>
-      <w:r>
-        <w:rPr>
-          <w:lang w:val="en-US"/>
-        </w:rPr>
-        <w:instrText>HYPERLINK "http://www.pclider.com.ar"</w:instrText>
-      </w:r>
-      <w:r>
-        <w:fldChar w:fldCharType="separate"/>
-      </w:r>
-      <w:r>
-        <w:rPr>
-          <w:rFonts w:asciiTheme="minorHAnsi" w:hAnsiTheme="minorHAnsi" w:cstheme="minorHAnsi"/>
-          <w:b/>
-          <w:color w:val="0000FF"/>
-          <w:sz w:val="26"/>
-          <w:szCs w:val="26"/>
-          <w:u w:val="single"/>
-          <w:lang w:val="en-GB"/>
-        </w:rPr>
         <w:t>pclider</w:t>
       </w:r>
-      <w:r>
-        <w:rPr>
-          <w:rFonts w:asciiTheme="minorHAnsi" w:hAnsiTheme="minorHAnsi" w:cstheme="minorHAnsi"/>
-          <w:b/>
-          <w:color w:val="0000FF"/>
-          <w:sz w:val="26"/>
-          <w:szCs w:val="26"/>
-          <w:u w:val="single"/>
-          <w:lang w:val="en-GB"/>
-        </w:rPr>
-        <w:fldChar w:fldCharType="end"/>
-      </w:r>
-      <w:r>
-        <w:fldChar w:fldCharType="begin"/>
-      </w:r>
-      <w:r>
-        <w:rPr>
-          <w:lang w:val="en-US"/>
-        </w:rPr>
-        <w:instrText>HYPERLINK "http://www.pclider.com.ar"</w:instrText>
-      </w:r>
-      <w:r>
-        <w:fldChar w:fldCharType="separate"/>
-      </w:r>
-      <w:r>
-        <w:rPr>
-          <w:rFonts w:asciiTheme="minorHAnsi" w:hAnsiTheme="minorHAnsi" w:cstheme="minorHAnsi"/>
-          <w:b/>
-          <w:color w:val="0000FF"/>
-          <w:sz w:val="26"/>
-          <w:szCs w:val="26"/>
-          <w:u w:val="single"/>
-          <w:lang w:val="en-GB"/>
-        </w:rPr>
-        <w:t>.</w:t>
-      </w:r>
-      <w:r>
-        <w:rPr>
-          <w:rFonts w:asciiTheme="minorHAnsi" w:hAnsiTheme="minorHAnsi" w:cstheme="minorHAnsi"/>
-          <w:b/>
-          <w:color w:val="0000FF"/>
-          <w:sz w:val="26"/>
-          <w:szCs w:val="26"/>
-          <w:u w:val="single"/>
-          <w:lang w:val="en-GB"/>
-        </w:rPr>
-        <w:fldChar w:fldCharType="end"/>
-      </w:r>
-      <w:r>
-        <w:fldChar w:fldCharType="begin"/>
-      </w:r>
-      <w:r>
-        <w:rPr>
-          <w:lang w:val="en-US"/>
-        </w:rPr>
-        <w:instrText>HYPERLINK "http://www.pclider.com.ar"</w:instrText>
-      </w:r>
-      <w:r>
-        <w:fldChar w:fldCharType="separate"/>
-      </w:r>
-      <w:r>
-        <w:rPr>
-          <w:rFonts w:asciiTheme="minorHAnsi" w:hAnsiTheme="minorHAnsi" w:cstheme="minorHAnsi"/>
-          <w:b/>
-          <w:color w:val="0000FF"/>
-          <w:sz w:val="26"/>
-          <w:szCs w:val="26"/>
-          <w:u w:val="single"/>
-          <w:lang w:val="en-GB"/>
-        </w:rPr>
-        <w:t>com</w:t>
-      </w:r>
-      <w:r>
-        <w:rPr>
-          <w:rFonts w:asciiTheme="minorHAnsi" w:hAnsiTheme="minorHAnsi" w:cstheme="minorHAnsi"/>
-          <w:b/>
-          <w:color w:val="0000FF"/>
-          <w:sz w:val="26"/>
-          <w:szCs w:val="26"/>
-          <w:u w:val="single"/>
-          <w:lang w:val="en-GB"/>
-        </w:rPr>
-        <w:fldChar w:fldCharType="end"/>
-      </w:r>
-      <w:r>
-        <w:fldChar w:fldCharType="begin"/>
-      </w:r>
-      <w:r>
-        <w:rPr>
-          <w:lang w:val="en-US"/>
-        </w:rPr>
-        <w:instrText>HYPERLINK "http://www.pclider.com.ar"</w:instrText>
-      </w:r>
-      <w:r>
-        <w:fldChar w:fldCharType="separate"/>
-      </w:r>
-      <w:r>
-        <w:rPr>
-          <w:rFonts w:asciiTheme="minorHAnsi" w:hAnsiTheme="minorHAnsi" w:cstheme="minorHAnsi"/>
-          <w:b/>
-          <w:color w:val="0000FF"/>
-          <w:sz w:val="26"/>
-          <w:szCs w:val="26"/>
-          <w:u w:val="single"/>
-          <w:lang w:val="en-GB"/>
-        </w:rPr>
-        <w:t>.</w:t>
-      </w:r>
-      <w:r>
-        <w:rPr>
-          <w:rFonts w:asciiTheme="minorHAnsi" w:hAnsiTheme="minorHAnsi" w:cstheme="minorHAnsi"/>
-          <w:b/>
-          <w:color w:val="0000FF"/>
-          <w:sz w:val="26"/>
-          <w:szCs w:val="26"/>
-          <w:u w:val="single"/>
-          <w:lang w:val="en-GB"/>
-        </w:rPr>
-        <w:fldChar w:fldCharType="end"/>
-      </w:r>
-      <w:r>
-        <w:fldChar w:fldCharType="begin"/>
-      </w:r>
-      <w:r>
-        <w:rPr>
-          <w:lang w:val="en-US"/>
-        </w:rPr>
-        <w:instrText>HYPERLINK "http://www.pclider.com.ar"</w:instrText>
-      </w:r>
-      <w:r>
-        <w:fldChar w:fldCharType="separate"/>
-      </w:r>
-      <w:r>
-        <w:rPr>
-          <w:rFonts w:asciiTheme="minorHAnsi" w:hAnsiTheme="minorHAnsi" w:cstheme="minorHAnsi"/>
-          <w:b/>
-          <w:color w:val="0000FF"/>
-          <w:sz w:val="26"/>
-          <w:szCs w:val="26"/>
-          <w:u w:val="single"/>
-          <w:lang w:val="en-GB"/>
-        </w:rPr>
-        <w:t>ar</w:t>
-      </w:r>
-      <w:r>
-        <w:rPr>
-          <w:rFonts w:asciiTheme="minorHAnsi" w:hAnsiTheme="minorHAnsi" w:cstheme="minorHAnsi"/>
-          <w:b/>
-          <w:color w:val="0000FF"/>
-          <w:sz w:val="26"/>
-          <w:szCs w:val="26"/>
-          <w:u w:val="single"/>
-          <w:lang w:val="en-GB"/>
-        </w:rPr>
-        <w:fldChar w:fldCharType="end"/>
-      </w:r>
+      <w:hyperlink r:id="rId12" w:history="1">
+        <w:r>
+          <w:rPr>
+            <w:rFonts w:asciiTheme="minorHAnsi" w:hAnsiTheme="minorHAnsi" w:cstheme="minorHAnsi"/>
+            <w:b/>
+            <w:color w:val="0000FF"/>
+            <w:sz w:val="26"/>
+            <w:szCs w:val="26"/>
+            <w:u w:val="single"/>
+            <w:lang w:val="en-GB"/>
+          </w:rPr>
+          <w:t>.</w:t>
+        </w:r>
+      </w:hyperlink>
+      <w:hyperlink r:id="rId13" w:history="1">
+        <w:r>
+          <w:rPr>
+            <w:rFonts w:asciiTheme="minorHAnsi" w:hAnsiTheme="minorHAnsi" w:cstheme="minorHAnsi"/>
+            <w:b/>
+            <w:color w:val="0000FF"/>
+            <w:sz w:val="26"/>
+            <w:szCs w:val="26"/>
+            <w:u w:val="single"/>
+            <w:lang w:val="en-GB"/>
+          </w:rPr>
+          <w:t>com</w:t>
+        </w:r>
+      </w:hyperlink>
+      <w:hyperlink r:id="rId14" w:history="1">
+        <w:r>
+          <w:rPr>
+            <w:rFonts w:asciiTheme="minorHAnsi" w:hAnsiTheme="minorHAnsi" w:cstheme="minorHAnsi"/>
+            <w:b/>
+            <w:color w:val="0000FF"/>
+            <w:sz w:val="26"/>
+            <w:szCs w:val="26"/>
+            <w:u w:val="single"/>
+            <w:lang w:val="en-GB"/>
+          </w:rPr>
+          <w:t>.</w:t>
+        </w:r>
+      </w:hyperlink>
+      <w:hyperlink r:id="rId15" w:history="1">
+        <w:r>
+          <w:rPr>
+            <w:rFonts w:asciiTheme="minorHAnsi" w:hAnsiTheme="minorHAnsi" w:cstheme="minorHAnsi"/>
+            <w:b/>
+            <w:color w:val="0000FF"/>
+            <w:sz w:val="26"/>
+            <w:szCs w:val="26"/>
+            <w:u w:val="single"/>
+            <w:lang w:val="en-GB"/>
+          </w:rPr>
+          <w:t>ar</w:t>
+        </w:r>
+      </w:hyperlink>
     </w:p>
     <w:p>
       <w:pPr>
@@ -3216,27 +2865,7 @@
           <w:szCs w:val="26"/>
           <w:lang w:val="en-GB"/>
         </w:rPr>
-        <w:t xml:space="preserve"> </w:t>
-      </w:r>
-      <w:proofErr w:type="spellStart"/>
-      <w:r>
-        <w:rPr>
-          <w:rFonts w:asciiTheme="minorHAnsi" w:hAnsiTheme="minorHAnsi" w:cstheme="minorHAnsi"/>
-          <w:sz w:val="26"/>
-          <w:szCs w:val="26"/>
-          <w:lang w:val="en-GB"/>
-        </w:rPr>
-        <w:t>Wordpress</w:t>
-      </w:r>
-      <w:proofErr w:type="spellEnd"/>
-      <w:r>
-        <w:rPr>
-          <w:rFonts w:asciiTheme="minorHAnsi" w:hAnsiTheme="minorHAnsi" w:cstheme="minorHAnsi"/>
-          <w:sz w:val="26"/>
-          <w:szCs w:val="26"/>
-          <w:lang w:val="en-GB"/>
-        </w:rPr>
-        <w:t>.</w:t>
+        <w:t xml:space="preserve"> Wordpress.</w:t>
       </w:r>
     </w:p>
     <w:p>
@@ -3276,27 +2905,7 @@
           <w:szCs w:val="26"/>
           <w:lang w:val="en-GB"/>
         </w:rPr>
-        <w:t xml:space="preserve">HTML, CSS, CMS </w:t>
-      </w:r>
-      <w:proofErr w:type="spellStart"/>
-      <w:r>
-        <w:rPr>
-          <w:rFonts w:asciiTheme="minorHAnsi" w:hAnsiTheme="minorHAnsi" w:cstheme="minorHAnsi"/>
-          <w:sz w:val="26"/>
-          <w:szCs w:val="26"/>
-          <w:lang w:val="en-GB"/>
-        </w:rPr>
-        <w:t>Wordpress</w:t>
-      </w:r>
-      <w:proofErr w:type="spellEnd"/>
-      <w:r>
-        <w:rPr>
-          <w:rFonts w:asciiTheme="minorHAnsi" w:hAnsiTheme="minorHAnsi" w:cstheme="minorHAnsi"/>
-          <w:sz w:val="26"/>
-          <w:szCs w:val="26"/>
-          <w:lang w:val="en-GB"/>
-        </w:rPr>
-        <w:t>, MySQL</w:t>
+        <w:t>HTML, CSS, CMS Wordpress, MySQL</w:t>
       </w:r>
       <w:r>
         <w:rPr>
@@ -3427,40 +3036,19 @@
         </w:rPr>
         <w:t xml:space="preserve"> - </w:t>
       </w:r>
-      <w:r>
-        <w:fldChar w:fldCharType="begin"/>
-      </w:r>
-      <w:r>
-        <w:rPr>
-          <w:lang w:val="en-US"/>
-        </w:rPr>
-        <w:instrText>HYPERLINK "http://www.serviceleotv.com.ar"</w:instrText>
-      </w:r>
-      <w:r>
-        <w:fldChar w:fldCharType="separate"/>
-      </w:r>
-      <w:r>
-        <w:rPr>
-          <w:rStyle w:val="Hipervnculo"/>
-          <w:rFonts w:asciiTheme="minorHAnsi" w:hAnsiTheme="minorHAnsi" w:cstheme="minorHAnsi"/>
-          <w:b/>
-          <w:sz w:val="26"/>
-          <w:szCs w:val="26"/>
-          <w:lang w:val="en-GB"/>
-        </w:rPr>
-        <w:t>www.serviceleotv.com.ar</w:t>
-      </w:r>
-      <w:r>
-        <w:rPr>
-          <w:rStyle w:val="Hipervnculo"/>
-          <w:rFonts w:asciiTheme="minorHAnsi" w:hAnsiTheme="minorHAnsi" w:cstheme="minorHAnsi"/>
-          <w:b/>
-          <w:sz w:val="26"/>
-          <w:szCs w:val="26"/>
-          <w:lang w:val="en-GB"/>
-        </w:rPr>
-        <w:fldChar w:fldCharType="end"/>
-      </w:r>
+      <w:hyperlink r:id="rId16" w:history="1">
+        <w:r>
+          <w:rPr>
+            <w:rStyle w:val="Hipervnculo"/>
+            <w:rFonts w:asciiTheme="minorHAnsi" w:hAnsiTheme="minorHAnsi" w:cstheme="minorHAnsi"/>
+            <w:b/>
+            <w:sz w:val="26"/>
+            <w:szCs w:val="26"/>
+            <w:lang w:val="en-GB"/>
+          </w:rPr>
+          <w:t>www.serviceleotv.com.ar</w:t>
+        </w:r>
+      </w:hyperlink>
     </w:p>
     <w:p>
       <w:pPr>
@@ -3579,47 +3167,7 @@
           <w:szCs w:val="26"/>
           <w:lang w:val="en-GB"/>
         </w:rPr>
-        <w:t xml:space="preserve">PHP, HTML, CSS3, </w:t>
-      </w:r>
-      <w:proofErr w:type="spellStart"/>
-      <w:r>
-        <w:rPr>
-          <w:rFonts w:asciiTheme="minorHAnsi" w:hAnsiTheme="minorHAnsi" w:cstheme="minorHAnsi"/>
-          <w:sz w:val="26"/>
-          <w:szCs w:val="26"/>
-          <w:lang w:val="en-GB"/>
-        </w:rPr>
-        <w:t>Javascript</w:t>
-      </w:r>
-      <w:proofErr w:type="spellEnd"/>
-      <w:r>
-        <w:rPr>
-          <w:rFonts w:asciiTheme="minorHAnsi" w:hAnsiTheme="minorHAnsi" w:cstheme="minorHAnsi"/>
-          <w:sz w:val="26"/>
-          <w:szCs w:val="26"/>
-          <w:lang w:val="en-GB"/>
-        </w:rPr>
-        <w:t xml:space="preserve">, jQuery, Yii Framework, MVC Framework, MySQL, </w:t>
-      </w:r>
-      <w:proofErr w:type="spellStart"/>
-      <w:r>
-        <w:rPr>
-          <w:rFonts w:asciiTheme="minorHAnsi" w:hAnsiTheme="minorHAnsi" w:cstheme="minorHAnsi"/>
-          <w:sz w:val="26"/>
-          <w:szCs w:val="26"/>
-          <w:lang w:val="en-GB"/>
-        </w:rPr>
-        <w:t>PairProgramming</w:t>
-      </w:r>
-      <w:proofErr w:type="spellEnd"/>
-      <w:r>
-        <w:rPr>
-          <w:rFonts w:asciiTheme="minorHAnsi" w:hAnsiTheme="minorHAnsi" w:cstheme="minorHAnsi"/>
-          <w:sz w:val="26"/>
-          <w:szCs w:val="26"/>
-          <w:lang w:val="en-GB"/>
-        </w:rPr>
-        <w:t>, PEAR Framework.</w:t>
+        <w:t>PHP, HTML, CSS3, Javascript, jQuery, Yii Framework, MVC Framework, MySQL, PairProgramming, PEAR Framework.</w:t>
       </w:r>
       <w:r>
         <w:rPr>
@@ -3731,38 +3279,19 @@
         </w:rPr>
         <w:t xml:space="preserve">- </w:t>
       </w:r>
-      <w:r>
-        <w:fldChar w:fldCharType="begin"/>
-      </w:r>
-      <w:r>
-        <w:rPr>
-          <w:lang w:val="en-US"/>
-        </w:rPr>
-        <w:instrText>HYPERLINK "https://marketplace.magento.com/mhidalgo-mhidalgo-static-version.html"</w:instrText>
-      </w:r>
-      <w:r>
-        <w:fldChar w:fldCharType="separate"/>
-      </w:r>
-      <w:r>
-        <w:rPr>
-          <w:rStyle w:val="Hipervnculo"/>
-          <w:b/>
-          <w:sz w:val="26"/>
-          <w:szCs w:val="26"/>
-          <w:lang w:val="en-GB"/>
-        </w:rPr>
-        <w:t>marketplace.magento.com/mhidalgo-mhidalgo-static-version.html</w:t>
-      </w:r>
-      <w:r>
-        <w:rPr>
-          <w:rStyle w:val="Hipervnculo"/>
-          <w:b/>
-          <w:sz w:val="26"/>
-          <w:szCs w:val="26"/>
-          <w:lang w:val="en-GB"/>
-        </w:rPr>
-        <w:fldChar w:fldCharType="end"/>
-      </w:r>
+      <w:hyperlink r:id="rId17" w:history="1">
+        <w:r>
+          <w:rPr>
+            <w:rStyle w:val="Hipervnculo"/>
+            <w:rFonts w:asciiTheme="minorHAnsi" w:hAnsiTheme="minorHAnsi" w:cstheme="minorHAnsi"/>
+            <w:b/>
+            <w:sz w:val="26"/>
+            <w:szCs w:val="26"/>
+            <w:lang w:val="en-GB"/>
+          </w:rPr>
+          <w:t>https://github.com/matiashidalgo/static-version</w:t>
+        </w:r>
+      </w:hyperlink>
     </w:p>
     <w:p>
       <w:pPr>
@@ -3874,47 +3403,7 @@
           <w:szCs w:val="26"/>
           <w:lang w:val="es-ES"/>
         </w:rPr>
-        <w:t xml:space="preserve">OOP, PHP, HTML, </w:t>
-      </w:r>
-      <w:proofErr w:type="spellStart"/>
-      <w:r>
-        <w:rPr>
-          <w:rFonts w:asciiTheme="minorHAnsi" w:hAnsiTheme="minorHAnsi" w:cstheme="minorHAnsi"/>
-          <w:sz w:val="26"/>
-          <w:szCs w:val="26"/>
-          <w:lang w:val="es-ES"/>
-        </w:rPr>
-        <w:t>Javascript</w:t>
-      </w:r>
-      <w:proofErr w:type="spellEnd"/>
-      <w:r>
-        <w:rPr>
-          <w:rFonts w:asciiTheme="minorHAnsi" w:hAnsiTheme="minorHAnsi" w:cstheme="minorHAnsi"/>
-          <w:sz w:val="26"/>
-          <w:szCs w:val="26"/>
-          <w:lang w:val="es-ES"/>
-        </w:rPr>
-        <w:t xml:space="preserve">, Magento CE, Magento EE, Apache, </w:t>
-      </w:r>
-      <w:proofErr w:type="spellStart"/>
-      <w:r>
-        <w:rPr>
-          <w:rFonts w:asciiTheme="minorHAnsi" w:hAnsiTheme="minorHAnsi" w:cstheme="minorHAnsi"/>
-          <w:sz w:val="26"/>
-          <w:szCs w:val="26"/>
-          <w:lang w:val="es-ES"/>
-        </w:rPr>
-        <w:t>Nginx</w:t>
-      </w:r>
-      <w:proofErr w:type="spellEnd"/>
-      <w:r>
-        <w:rPr>
-          <w:rFonts w:asciiTheme="minorHAnsi" w:hAnsiTheme="minorHAnsi" w:cstheme="minorHAnsi"/>
-          <w:sz w:val="26"/>
-          <w:szCs w:val="26"/>
-          <w:lang w:val="es-ES"/>
-        </w:rPr>
-        <w:t>.</w:t>
+        <w:t>OOP, PHP, HTML, Javascript, Magento CE, Magento EE, Apache, Nginx.</w:t>
       </w:r>
     </w:p>
     <w:p>
@@ -3999,27 +3488,15 @@
           <w:lang w:val="en-GB"/>
         </w:rPr>
       </w:pPr>
-      <w:proofErr w:type="spellStart"/>
-      <w:r>
-        <w:rPr>
-          <w:rFonts w:asciiTheme="minorHAnsi" w:hAnsiTheme="minorHAnsi" w:cstheme="minorHAnsi"/>
-          <w:b/>
-          <w:sz w:val="28"/>
-          <w:szCs w:val="26"/>
-          <w:lang w:val="en-GB"/>
-        </w:rPr>
-        <w:t>Crixos</w:t>
-      </w:r>
-      <w:proofErr w:type="spellEnd"/>
-      <w:r>
-        <w:rPr>
-          <w:rFonts w:asciiTheme="minorHAnsi" w:hAnsiTheme="minorHAnsi" w:cstheme="minorHAnsi"/>
-          <w:b/>
-          <w:sz w:val="28"/>
-          <w:szCs w:val="26"/>
-          <w:lang w:val="en-GB"/>
-        </w:rPr>
-        <w:t xml:space="preserve"> 2012</w:t>
+      <w:r>
+        <w:rPr>
+          <w:rFonts w:asciiTheme="minorHAnsi" w:hAnsiTheme="minorHAnsi" w:cstheme="minorHAnsi"/>
+          <w:b/>
+          <w:sz w:val="28"/>
+          <w:szCs w:val="26"/>
+          <w:lang w:val="en-GB"/>
+        </w:rPr>
+        <w:t>Crixos 2012</w:t>
       </w:r>
     </w:p>
     <w:p>
@@ -4192,27 +3669,7 @@
           <w:szCs w:val="26"/>
           <w:lang w:val="en-GB"/>
         </w:rPr>
-        <w:t xml:space="preserve">PHP, HTML, CSS3, </w:t>
-      </w:r>
-      <w:proofErr w:type="spellStart"/>
-      <w:r>
-        <w:rPr>
-          <w:rFonts w:asciiTheme="minorHAnsi" w:hAnsiTheme="minorHAnsi" w:cstheme="minorHAnsi"/>
-          <w:sz w:val="26"/>
-          <w:szCs w:val="26"/>
-          <w:lang w:val="en-GB"/>
-        </w:rPr>
-        <w:t>Javascript</w:t>
-      </w:r>
-      <w:proofErr w:type="spellEnd"/>
-      <w:r>
-        <w:rPr>
-          <w:rFonts w:asciiTheme="minorHAnsi" w:hAnsiTheme="minorHAnsi" w:cstheme="minorHAnsi"/>
-          <w:sz w:val="26"/>
-          <w:szCs w:val="26"/>
-          <w:lang w:val="en-GB"/>
-        </w:rPr>
-        <w:t>, jQuery, Yii Framework, MVC Framework, MySQL, Scrum.</w:t>
+        <w:t>PHP, HTML, CSS3, Javascript, jQuery, Yii Framework, MVC Framework, MySQL, Scrum.</w:t>
       </w:r>
     </w:p>
     <w:p>
@@ -4382,27 +3839,7 @@
           <w:szCs w:val="26"/>
           <w:lang w:val="en-GB"/>
         </w:rPr>
-        <w:t xml:space="preserve">Develop frontend views and </w:t>
-      </w:r>
-      <w:proofErr w:type="spellStart"/>
-      <w:r>
-        <w:rPr>
-          <w:rFonts w:asciiTheme="minorHAnsi" w:hAnsiTheme="minorHAnsi" w:cstheme="minorHAnsi"/>
-          <w:sz w:val="26"/>
-          <w:szCs w:val="26"/>
-          <w:lang w:val="en-GB"/>
-        </w:rPr>
-        <w:t>Javascript</w:t>
-      </w:r>
-      <w:proofErr w:type="spellEnd"/>
-      <w:r>
-        <w:rPr>
-          <w:rFonts w:asciiTheme="minorHAnsi" w:hAnsiTheme="minorHAnsi" w:cstheme="minorHAnsi"/>
-          <w:sz w:val="26"/>
-          <w:szCs w:val="26"/>
-          <w:lang w:val="en-GB"/>
-        </w:rPr>
-        <w:t xml:space="preserve"> code using jQuery based-on IE8.</w:t>
+        <w:t>Develop frontend views and Javascript code using jQuery based-on IE8.</w:t>
       </w:r>
     </w:p>
     <w:p>
@@ -4443,47 +3880,7 @@
           <w:szCs w:val="26"/>
           <w:lang w:val="en-GB"/>
         </w:rPr>
-        <w:t xml:space="preserve">HTML, CSS, </w:t>
-      </w:r>
-      <w:proofErr w:type="spellStart"/>
-      <w:r>
-        <w:rPr>
-          <w:rFonts w:asciiTheme="minorHAnsi" w:hAnsiTheme="minorHAnsi" w:cstheme="minorHAnsi"/>
-          <w:sz w:val="26"/>
-          <w:szCs w:val="26"/>
-          <w:lang w:val="en-GB"/>
-        </w:rPr>
-        <w:t>Javascript</w:t>
-      </w:r>
-      <w:proofErr w:type="spellEnd"/>
-      <w:r>
-        <w:rPr>
-          <w:rFonts w:asciiTheme="minorHAnsi" w:hAnsiTheme="minorHAnsi" w:cstheme="minorHAnsi"/>
-          <w:sz w:val="26"/>
-          <w:szCs w:val="26"/>
-          <w:lang w:val="en-GB"/>
-        </w:rPr>
-        <w:t xml:space="preserve">, jQuery, </w:t>
-      </w:r>
-      <w:proofErr w:type="spellStart"/>
-      <w:r>
-        <w:rPr>
-          <w:rFonts w:asciiTheme="minorHAnsi" w:hAnsiTheme="minorHAnsi" w:cstheme="minorHAnsi"/>
-          <w:sz w:val="26"/>
-          <w:szCs w:val="26"/>
-          <w:lang w:val="en-GB"/>
-        </w:rPr>
-        <w:t>Sharepoint</w:t>
-      </w:r>
-      <w:proofErr w:type="spellEnd"/>
-      <w:r>
-        <w:rPr>
-          <w:rFonts w:asciiTheme="minorHAnsi" w:hAnsiTheme="minorHAnsi" w:cstheme="minorHAnsi"/>
-          <w:sz w:val="26"/>
-          <w:szCs w:val="26"/>
-          <w:lang w:val="en-GB"/>
-        </w:rPr>
-        <w:t>.</w:t>
+        <w:t>HTML, CSS, Javascript, jQuery, Sharepoint.</w:t>
       </w:r>
     </w:p>
     <w:p>
@@ -4544,29 +3941,7 @@
           <w:szCs w:val="26"/>
           <w:lang w:val="en-GB"/>
         </w:rPr>
-        <w:t xml:space="preserve">Rails </w:t>
-      </w:r>
-      <w:proofErr w:type="gramStart"/>
-      <w:r>
-        <w:rPr>
-          <w:rFonts w:asciiTheme="minorHAnsi" w:hAnsiTheme="minorHAnsi" w:cstheme="minorHAnsi"/>
-          <w:b/>
-          <w:sz w:val="28"/>
-          <w:szCs w:val="26"/>
-          <w:lang w:val="en-GB"/>
-        </w:rPr>
-        <w:t>e-Commerce</w:t>
-      </w:r>
-      <w:proofErr w:type="gramEnd"/>
-      <w:r>
-        <w:rPr>
-          <w:rFonts w:asciiTheme="minorHAnsi" w:hAnsiTheme="minorHAnsi" w:cstheme="minorHAnsi"/>
-          <w:b/>
-          <w:sz w:val="28"/>
-          <w:szCs w:val="26"/>
-          <w:lang w:val="en-GB"/>
-        </w:rPr>
-        <w:t xml:space="preserve"> 2013</w:t>
+        <w:t>Rails e-Commerce 2013</w:t>
       </w:r>
     </w:p>
     <w:p>
@@ -4731,19 +4106,8 @@
           <w:szCs w:val="26"/>
           <w:lang w:val="en-GB"/>
         </w:rPr>
-        <w:t xml:space="preserve">, Ruby, </w:t>
-      </w:r>
-      <w:proofErr w:type="spellStart"/>
-      <w:r>
-        <w:rPr>
-          <w:rFonts w:asciiTheme="minorHAnsi" w:hAnsiTheme="minorHAnsi" w:cstheme="minorHAnsi"/>
-          <w:sz w:val="26"/>
-          <w:szCs w:val="26"/>
-          <w:lang w:val="en-GB"/>
-        </w:rPr>
-        <w:t>RubyGems</w:t>
-      </w:r>
-      <w:proofErr w:type="spellEnd"/>
+        <w:t>, Ruby, RubyGems</w:t>
+      </w:r>
       <w:r>
         <w:rPr>
           <w:rFonts w:asciiTheme="minorHAnsi" w:hAnsiTheme="minorHAnsi" w:cstheme="minorHAnsi"/>
@@ -4955,27 +4319,7 @@
           <w:szCs w:val="26"/>
           <w:lang w:val="en-GB"/>
         </w:rPr>
-        <w:t xml:space="preserve">Integrate native code for Android and iOS devices with </w:t>
-      </w:r>
-      <w:proofErr w:type="spellStart"/>
-      <w:r>
-        <w:rPr>
-          <w:rFonts w:asciiTheme="minorHAnsi" w:hAnsiTheme="minorHAnsi" w:cstheme="minorHAnsi"/>
-          <w:sz w:val="26"/>
-          <w:szCs w:val="26"/>
-          <w:lang w:val="en-GB"/>
-        </w:rPr>
-        <w:t>PhoneGAP</w:t>
-      </w:r>
-      <w:proofErr w:type="spellEnd"/>
-      <w:r>
-        <w:rPr>
-          <w:rFonts w:asciiTheme="minorHAnsi" w:hAnsiTheme="minorHAnsi" w:cstheme="minorHAnsi"/>
-          <w:sz w:val="26"/>
-          <w:szCs w:val="26"/>
-          <w:lang w:val="en-GB"/>
-        </w:rPr>
-        <w:t>.</w:t>
+        <w:t>Integrate native code for Android and iOS devices with PhoneGAP.</w:t>
       </w:r>
     </w:p>
     <w:p>
@@ -5030,43 +4374,7 @@
           <w:szCs w:val="26"/>
           <w:lang w:val="en-GB"/>
         </w:rPr>
-        <w:t xml:space="preserve">HTML5, CSS3, </w:t>
-      </w:r>
-      <w:proofErr w:type="spellStart"/>
-      <w:r>
-        <w:rPr>
-          <w:sz w:val="26"/>
-          <w:szCs w:val="26"/>
-          <w:lang w:val="en-GB"/>
-        </w:rPr>
-        <w:t>javascript</w:t>
-      </w:r>
-      <w:proofErr w:type="spellEnd"/>
-      <w:r>
-        <w:rPr>
-          <w:sz w:val="26"/>
-          <w:szCs w:val="26"/>
-          <w:lang w:val="en-GB"/>
-        </w:rPr>
-        <w:t xml:space="preserve">, jQuery, jQuery Mobile, </w:t>
-      </w:r>
-      <w:proofErr w:type="spellStart"/>
-      <w:r>
-        <w:rPr>
-          <w:sz w:val="26"/>
-          <w:szCs w:val="26"/>
-          <w:lang w:val="en-GB"/>
-        </w:rPr>
-        <w:t>PhoneGAP</w:t>
-      </w:r>
-      <w:proofErr w:type="spellEnd"/>
-      <w:r>
-        <w:rPr>
-          <w:sz w:val="26"/>
-          <w:szCs w:val="26"/>
-          <w:lang w:val="en-GB"/>
-        </w:rPr>
-        <w:t xml:space="preserve">, Objective-C </w:t>
+        <w:t xml:space="preserve">HTML5, CSS3, javascript, jQuery, jQuery Mobile, PhoneGAP, Objective-C </w:t>
       </w:r>
       <w:r>
         <w:rPr>
@@ -5158,7 +4466,6 @@
         </w:rPr>
         <w:t xml:space="preserve"> </w:t>
       </w:r>
-      <w:proofErr w:type="spellStart"/>
       <w:r>
         <w:rPr>
           <w:b/>
@@ -5179,7 +4486,6 @@
         </w:rPr>
         <w:t>’s</w:t>
       </w:r>
-      <w:proofErr w:type="spellEnd"/>
       <w:r>
         <w:rPr>
           <w:b/>
@@ -5436,27 +4742,7 @@
           <w:szCs w:val="26"/>
           <w:lang w:val="en-GB"/>
         </w:rPr>
-        <w:t xml:space="preserve">Integrate </w:t>
-      </w:r>
-      <w:proofErr w:type="spellStart"/>
-      <w:r>
-        <w:rPr>
-          <w:rFonts w:asciiTheme="minorHAnsi" w:hAnsiTheme="minorHAnsi" w:cstheme="minorHAnsi"/>
-          <w:sz w:val="26"/>
-          <w:szCs w:val="26"/>
-          <w:lang w:val="en-GB"/>
-        </w:rPr>
-        <w:t>MercadoPago</w:t>
-      </w:r>
-      <w:proofErr w:type="spellEnd"/>
-      <w:r>
-        <w:rPr>
-          <w:rFonts w:asciiTheme="minorHAnsi" w:hAnsiTheme="minorHAnsi" w:cstheme="minorHAnsi"/>
-          <w:sz w:val="26"/>
-          <w:szCs w:val="26"/>
-          <w:lang w:val="en-GB"/>
-        </w:rPr>
-        <w:t xml:space="preserve"> Payment Method.</w:t>
+        <w:t>Integrate MercadoPago Payment Method.</w:t>
       </w:r>
     </w:p>
     <w:p>
@@ -5481,27 +4767,7 @@
           <w:szCs w:val="26"/>
           <w:lang w:val="en-GB"/>
         </w:rPr>
-        <w:t xml:space="preserve">Integrate </w:t>
-      </w:r>
-      <w:proofErr w:type="spellStart"/>
-      <w:r>
-        <w:rPr>
-          <w:rFonts w:asciiTheme="minorHAnsi" w:hAnsiTheme="minorHAnsi" w:cstheme="minorHAnsi"/>
-          <w:sz w:val="26"/>
-          <w:szCs w:val="26"/>
-          <w:lang w:val="en-GB"/>
-        </w:rPr>
-        <w:t>TodoPago</w:t>
-      </w:r>
-      <w:proofErr w:type="spellEnd"/>
-      <w:r>
-        <w:rPr>
-          <w:rFonts w:asciiTheme="minorHAnsi" w:hAnsiTheme="minorHAnsi" w:cstheme="minorHAnsi"/>
-          <w:sz w:val="26"/>
-          <w:szCs w:val="26"/>
-          <w:lang w:val="en-GB"/>
-        </w:rPr>
-        <w:t xml:space="preserve"> Payment Method.</w:t>
+        <w:t>Integrate TodoPago Payment Method.</w:t>
       </w:r>
     </w:p>
     <w:p>
@@ -5526,27 +4792,7 @@
           <w:szCs w:val="26"/>
           <w:lang w:val="en-GB"/>
         </w:rPr>
-        <w:t xml:space="preserve">Integrate SPS </w:t>
-      </w:r>
-      <w:proofErr w:type="spellStart"/>
-      <w:r>
-        <w:rPr>
-          <w:rFonts w:asciiTheme="minorHAnsi" w:hAnsiTheme="minorHAnsi" w:cstheme="minorHAnsi"/>
-          <w:sz w:val="26"/>
-          <w:szCs w:val="26"/>
-          <w:lang w:val="en-GB"/>
-        </w:rPr>
-        <w:t>Decidir</w:t>
-      </w:r>
-      <w:proofErr w:type="spellEnd"/>
-      <w:r>
-        <w:rPr>
-          <w:rFonts w:asciiTheme="minorHAnsi" w:hAnsiTheme="minorHAnsi" w:cstheme="minorHAnsi"/>
-          <w:sz w:val="26"/>
-          <w:szCs w:val="26"/>
-          <w:lang w:val="en-GB"/>
-        </w:rPr>
-        <w:t xml:space="preserve"> Payment Method.</w:t>
+        <w:t>Integrate SPS Decidir Payment Method.</w:t>
       </w:r>
     </w:p>
     <w:p>
@@ -5647,25 +4893,14 @@
         </w:rPr>
         <w:t xml:space="preserve"> SASS, Compass, </w:t>
       </w:r>
-      <w:proofErr w:type="spellStart"/>
-      <w:r>
-        <w:rPr>
-          <w:rFonts w:asciiTheme="minorHAnsi" w:hAnsiTheme="minorHAnsi" w:cstheme="minorHAnsi"/>
-          <w:sz w:val="26"/>
-          <w:szCs w:val="26"/>
-          <w:lang w:val="en-GB"/>
-        </w:rPr>
-        <w:t>Javascript</w:t>
-      </w:r>
-      <w:proofErr w:type="spellEnd"/>
-      <w:r>
-        <w:rPr>
-          <w:rFonts w:asciiTheme="minorHAnsi" w:hAnsiTheme="minorHAnsi" w:cstheme="minorHAnsi"/>
-          <w:sz w:val="26"/>
-          <w:szCs w:val="26"/>
-          <w:lang w:val="en-GB"/>
-        </w:rPr>
-        <w:t>, jQuery</w:t>
+      <w:r>
+        <w:rPr>
+          <w:rFonts w:asciiTheme="minorHAnsi" w:hAnsiTheme="minorHAnsi" w:cstheme="minorHAnsi"/>
+          <w:sz w:val="26"/>
+          <w:szCs w:val="26"/>
+          <w:lang w:val="en-GB"/>
+        </w:rPr>
+        <w:t>Javascript, jQuery</w:t>
       </w:r>
       <w:r>
         <w:rPr>
@@ -5728,67 +4963,7 @@
           <w:szCs w:val="26"/>
           <w:lang w:val="en-GB"/>
         </w:rPr>
-        <w:t xml:space="preserve"> </w:t>
-      </w:r>
-      <w:proofErr w:type="spellStart"/>
-      <w:r>
-        <w:rPr>
-          <w:rFonts w:asciiTheme="minorHAnsi" w:hAnsiTheme="minorHAnsi" w:cstheme="minorHAnsi"/>
-          <w:sz w:val="26"/>
-          <w:szCs w:val="26"/>
-          <w:lang w:val="en-GB"/>
-        </w:rPr>
-        <w:t>TodoPago</w:t>
-      </w:r>
-      <w:proofErr w:type="spellEnd"/>
-      <w:r>
-        <w:rPr>
-          <w:rFonts w:asciiTheme="minorHAnsi" w:hAnsiTheme="minorHAnsi" w:cstheme="minorHAnsi"/>
-          <w:sz w:val="26"/>
-          <w:szCs w:val="26"/>
-          <w:lang w:val="en-GB"/>
-        </w:rPr>
-        <w:t xml:space="preserve"> API, </w:t>
-      </w:r>
-      <w:proofErr w:type="spellStart"/>
-      <w:r>
-        <w:rPr>
-          <w:rFonts w:asciiTheme="minorHAnsi" w:hAnsiTheme="minorHAnsi" w:cstheme="minorHAnsi"/>
-          <w:sz w:val="26"/>
-          <w:szCs w:val="26"/>
-          <w:lang w:val="en-GB"/>
-        </w:rPr>
-        <w:t>MercadoPago</w:t>
-      </w:r>
-      <w:proofErr w:type="spellEnd"/>
-      <w:r>
-        <w:rPr>
-          <w:rFonts w:asciiTheme="minorHAnsi" w:hAnsiTheme="minorHAnsi" w:cstheme="minorHAnsi"/>
-          <w:sz w:val="26"/>
-          <w:szCs w:val="26"/>
-          <w:lang w:val="en-GB"/>
-        </w:rPr>
-        <w:t xml:space="preserve"> API, SPS </w:t>
-      </w:r>
-      <w:proofErr w:type="spellStart"/>
-      <w:r>
-        <w:rPr>
-          <w:rFonts w:asciiTheme="minorHAnsi" w:hAnsiTheme="minorHAnsi" w:cstheme="minorHAnsi"/>
-          <w:sz w:val="26"/>
-          <w:szCs w:val="26"/>
-          <w:lang w:val="en-GB"/>
-        </w:rPr>
-        <w:t>Decidir</w:t>
-      </w:r>
-      <w:proofErr w:type="spellEnd"/>
-      <w:r>
-        <w:rPr>
-          <w:rFonts w:asciiTheme="minorHAnsi" w:hAnsiTheme="minorHAnsi" w:cstheme="minorHAnsi"/>
-          <w:sz w:val="26"/>
-          <w:szCs w:val="26"/>
-          <w:lang w:val="en-GB"/>
-        </w:rPr>
-        <w:t xml:space="preserve"> API,</w:t>
+        <w:t xml:space="preserve"> TodoPago API, MercadoPago API, SPS Decidir API,</w:t>
       </w:r>
       <w:r>
         <w:rPr>
@@ -5865,29 +5040,7 @@
           <w:szCs w:val="26"/>
           <w:lang w:val="es-ES"/>
         </w:rPr>
-        <w:t xml:space="preserve"> (</w:t>
-      </w:r>
-      <w:proofErr w:type="spellStart"/>
-      <w:r>
-        <w:rPr>
-          <w:rFonts w:asciiTheme="minorHAnsi" w:hAnsiTheme="minorHAnsi" w:cstheme="minorHAnsi"/>
-          <w:b/>
-          <w:sz w:val="28"/>
-          <w:szCs w:val="26"/>
-          <w:lang w:val="es-ES"/>
-        </w:rPr>
-        <w:t>Colombian</w:t>
-      </w:r>
-      <w:proofErr w:type="spellEnd"/>
-      <w:r>
-        <w:rPr>
-          <w:rFonts w:asciiTheme="minorHAnsi" w:hAnsiTheme="minorHAnsi" w:cstheme="minorHAnsi"/>
-          <w:b/>
-          <w:sz w:val="28"/>
-          <w:szCs w:val="26"/>
-          <w:lang w:val="es-ES"/>
-        </w:rPr>
-        <w:t>)</w:t>
+        <w:t xml:space="preserve"> (Colombian)</w:t>
       </w:r>
       <w:r>
         <w:rPr>
@@ -6077,27 +5230,7 @@
           <w:szCs w:val="26"/>
           <w:lang w:val="en-GB"/>
         </w:rPr>
-        <w:t xml:space="preserve">OOP, PHP, HTML, CSS3, </w:t>
-      </w:r>
-      <w:proofErr w:type="spellStart"/>
-      <w:r>
-        <w:rPr>
-          <w:rFonts w:asciiTheme="minorHAnsi" w:hAnsiTheme="minorHAnsi" w:cstheme="minorHAnsi"/>
-          <w:sz w:val="26"/>
-          <w:szCs w:val="26"/>
-          <w:lang w:val="en-GB"/>
-        </w:rPr>
-        <w:t>Javascript</w:t>
-      </w:r>
-      <w:proofErr w:type="spellEnd"/>
-      <w:r>
-        <w:rPr>
-          <w:rFonts w:asciiTheme="minorHAnsi" w:hAnsiTheme="minorHAnsi" w:cstheme="minorHAnsi"/>
-          <w:sz w:val="26"/>
-          <w:szCs w:val="26"/>
-          <w:lang w:val="en-GB"/>
-        </w:rPr>
-        <w:t>, jQuery</w:t>
+        <w:t>OOP, PHP, HTML, CSS3, Javascript, jQuery</w:t>
       </w:r>
       <w:r>
         <w:rPr>
@@ -6355,27 +5488,7 @@
           <w:szCs w:val="26"/>
           <w:lang w:val="en-GB"/>
         </w:rPr>
-        <w:t xml:space="preserve">OOP, PHP, HTML, CSS3, </w:t>
-      </w:r>
-      <w:proofErr w:type="spellStart"/>
-      <w:r>
-        <w:rPr>
-          <w:rFonts w:asciiTheme="minorHAnsi" w:hAnsiTheme="minorHAnsi" w:cstheme="minorHAnsi"/>
-          <w:sz w:val="26"/>
-          <w:szCs w:val="26"/>
-          <w:lang w:val="en-GB"/>
-        </w:rPr>
-        <w:t>Javascript</w:t>
-      </w:r>
-      <w:proofErr w:type="spellEnd"/>
-      <w:r>
-        <w:rPr>
-          <w:rFonts w:asciiTheme="minorHAnsi" w:hAnsiTheme="minorHAnsi" w:cstheme="minorHAnsi"/>
-          <w:sz w:val="26"/>
-          <w:szCs w:val="26"/>
-          <w:lang w:val="en-GB"/>
-        </w:rPr>
-        <w:t>, jQuery</w:t>
+        <w:t>OOP, PHP, HTML, CSS3, Javascript, jQuery</w:t>
       </w:r>
       <w:r>
         <w:rPr>
@@ -6648,27 +5761,7 @@
           <w:szCs w:val="26"/>
           <w:lang w:val="en-GB"/>
         </w:rPr>
-        <w:t xml:space="preserve">OOP, PHP, HTML, CSS3, </w:t>
-      </w:r>
-      <w:proofErr w:type="spellStart"/>
-      <w:r>
-        <w:rPr>
-          <w:rFonts w:asciiTheme="minorHAnsi" w:hAnsiTheme="minorHAnsi" w:cstheme="minorHAnsi"/>
-          <w:sz w:val="26"/>
-          <w:szCs w:val="26"/>
-          <w:lang w:val="en-GB"/>
-        </w:rPr>
-        <w:t>Javascript</w:t>
-      </w:r>
-      <w:proofErr w:type="spellEnd"/>
-      <w:r>
-        <w:rPr>
-          <w:rFonts w:asciiTheme="minorHAnsi" w:hAnsiTheme="minorHAnsi" w:cstheme="minorHAnsi"/>
-          <w:sz w:val="26"/>
-          <w:szCs w:val="26"/>
-          <w:lang w:val="en-GB"/>
-        </w:rPr>
-        <w:t>, jQuery</w:t>
+        <w:t>OOP, PHP, HTML, CSS3, Javascript, jQuery</w:t>
       </w:r>
       <w:r>
         <w:rPr>
@@ -6803,27 +5896,7 @@
           <w:szCs w:val="26"/>
           <w:lang w:val="en-GB"/>
         </w:rPr>
-        <w:t xml:space="preserve">Develop Magento responsive theme and </w:t>
-      </w:r>
-      <w:proofErr w:type="spellStart"/>
-      <w:r>
-        <w:rPr>
-          <w:rFonts w:asciiTheme="minorHAnsi" w:hAnsiTheme="minorHAnsi" w:cstheme="minorHAnsi"/>
-          <w:sz w:val="26"/>
-          <w:szCs w:val="26"/>
-          <w:lang w:val="en-GB"/>
-        </w:rPr>
-        <w:t>Javascript</w:t>
-      </w:r>
-      <w:proofErr w:type="spellEnd"/>
-      <w:r>
-        <w:rPr>
-          <w:rFonts w:asciiTheme="minorHAnsi" w:hAnsiTheme="minorHAnsi" w:cstheme="minorHAnsi"/>
-          <w:sz w:val="26"/>
-          <w:szCs w:val="26"/>
-          <w:lang w:val="en-GB"/>
-        </w:rPr>
-        <w:t xml:space="preserve"> to optimize responsive changes.</w:t>
+        <w:t>Develop Magento responsive theme and Javascript to optimize responsive changes.</w:t>
       </w:r>
     </w:p>
     <w:p>
@@ -6909,27 +5982,7 @@
           <w:szCs w:val="26"/>
           <w:lang w:val="en-GB"/>
         </w:rPr>
-        <w:t xml:space="preserve"> </w:t>
-      </w:r>
-      <w:proofErr w:type="spellStart"/>
-      <w:r>
-        <w:rPr>
-          <w:rFonts w:asciiTheme="minorHAnsi" w:hAnsiTheme="minorHAnsi" w:cstheme="minorHAnsi"/>
-          <w:sz w:val="26"/>
-          <w:szCs w:val="26"/>
-          <w:lang w:val="en-GB"/>
-        </w:rPr>
-        <w:t>Javascript</w:t>
-      </w:r>
-      <w:proofErr w:type="spellEnd"/>
-      <w:r>
-        <w:rPr>
-          <w:rFonts w:asciiTheme="minorHAnsi" w:hAnsiTheme="minorHAnsi" w:cstheme="minorHAnsi"/>
-          <w:sz w:val="26"/>
-          <w:szCs w:val="26"/>
-          <w:lang w:val="en-GB"/>
-        </w:rPr>
-        <w:t>, jQuery,</w:t>
+        <w:t xml:space="preserve"> Javascript, jQuery,</w:t>
       </w:r>
       <w:r>
         <w:rPr>
@@ -7191,27 +6244,7 @@
           <w:szCs w:val="26"/>
           <w:lang w:val="en-GB"/>
         </w:rPr>
-        <w:t xml:space="preserve">PHP, HTML, CSS3, SASS, Compass, </w:t>
-      </w:r>
-      <w:proofErr w:type="spellStart"/>
-      <w:r>
-        <w:rPr>
-          <w:rFonts w:asciiTheme="minorHAnsi" w:hAnsiTheme="minorHAnsi" w:cstheme="minorHAnsi"/>
-          <w:sz w:val="26"/>
-          <w:szCs w:val="26"/>
-          <w:lang w:val="en-GB"/>
-        </w:rPr>
-        <w:t>Javascript</w:t>
-      </w:r>
-      <w:proofErr w:type="spellEnd"/>
-      <w:r>
-        <w:rPr>
-          <w:rFonts w:asciiTheme="minorHAnsi" w:hAnsiTheme="minorHAnsi" w:cstheme="minorHAnsi"/>
-          <w:sz w:val="26"/>
-          <w:szCs w:val="26"/>
-          <w:lang w:val="en-GB"/>
-        </w:rPr>
-        <w:t>, Prototype, Magento CE, MySQL, Scrum.</w:t>
+        <w:t>PHP, HTML, CSS3, SASS, Compass, Javascript, Prototype, Magento CE, MySQL, Scrum.</w:t>
       </w:r>
     </w:p>
     <w:p>
@@ -7253,27 +6286,15 @@
           <w:lang w:val="en-GB"/>
         </w:rPr>
       </w:pPr>
-      <w:proofErr w:type="spellStart"/>
-      <w:r>
-        <w:rPr>
-          <w:rFonts w:asciiTheme="minorHAnsi" w:hAnsiTheme="minorHAnsi" w:cstheme="minorHAnsi"/>
-          <w:b/>
-          <w:sz w:val="28"/>
-          <w:szCs w:val="26"/>
-          <w:lang w:val="en-GB"/>
-        </w:rPr>
-        <w:t>Vapeworld</w:t>
-      </w:r>
-      <w:proofErr w:type="spellEnd"/>
-      <w:r>
-        <w:rPr>
-          <w:rFonts w:asciiTheme="minorHAnsi" w:hAnsiTheme="minorHAnsi" w:cstheme="minorHAnsi"/>
-          <w:b/>
-          <w:sz w:val="28"/>
-          <w:szCs w:val="26"/>
-          <w:lang w:val="en-GB"/>
-        </w:rPr>
-        <w:t xml:space="preserve"> (</w:t>
+      <w:r>
+        <w:rPr>
+          <w:rFonts w:asciiTheme="minorHAnsi" w:hAnsiTheme="minorHAnsi" w:cstheme="minorHAnsi"/>
+          <w:b/>
+          <w:sz w:val="28"/>
+          <w:szCs w:val="26"/>
+          <w:lang w:val="en-GB"/>
+        </w:rPr>
+        <w:t>Vapeworld (</w:t>
       </w:r>
       <w:r>
         <w:rPr>
@@ -7491,27 +6512,7 @@
           <w:szCs w:val="26"/>
           <w:lang w:val="en-GB"/>
         </w:rPr>
-        <w:t xml:space="preserve">PHP, HTML, CSS3, SASS, Compass, </w:t>
-      </w:r>
-      <w:proofErr w:type="spellStart"/>
-      <w:r>
-        <w:rPr>
-          <w:rFonts w:asciiTheme="minorHAnsi" w:hAnsiTheme="minorHAnsi" w:cstheme="minorHAnsi"/>
-          <w:sz w:val="26"/>
-          <w:szCs w:val="26"/>
-          <w:lang w:val="en-GB"/>
-        </w:rPr>
-        <w:t>Javascript</w:t>
-      </w:r>
-      <w:proofErr w:type="spellEnd"/>
-      <w:r>
-        <w:rPr>
-          <w:rFonts w:asciiTheme="minorHAnsi" w:hAnsiTheme="minorHAnsi" w:cstheme="minorHAnsi"/>
-          <w:sz w:val="26"/>
-          <w:szCs w:val="26"/>
-          <w:lang w:val="en-GB"/>
-        </w:rPr>
-        <w:t>, Prototype, Magento CE, MySQL, Scrum.</w:t>
+        <w:t>PHP, HTML, CSS3, SASS, Compass, Javascript, Prototype, Magento CE, MySQL, Scrum.</w:t>
       </w:r>
     </w:p>
     <w:p>
@@ -7793,27 +6794,7 @@
           <w:szCs w:val="26"/>
           <w:lang w:val="en-GB"/>
         </w:rPr>
-        <w:t xml:space="preserve">OOP, PHP, HTML, CSS3, </w:t>
-      </w:r>
-      <w:proofErr w:type="spellStart"/>
-      <w:r>
-        <w:rPr>
-          <w:rFonts w:asciiTheme="minorHAnsi" w:hAnsiTheme="minorHAnsi" w:cstheme="minorHAnsi"/>
-          <w:sz w:val="26"/>
-          <w:szCs w:val="26"/>
-          <w:lang w:val="en-GB"/>
-        </w:rPr>
-        <w:t>Javascript</w:t>
-      </w:r>
-      <w:proofErr w:type="spellEnd"/>
-      <w:r>
-        <w:rPr>
-          <w:rFonts w:asciiTheme="minorHAnsi" w:hAnsiTheme="minorHAnsi" w:cstheme="minorHAnsi"/>
-          <w:sz w:val="26"/>
-          <w:szCs w:val="26"/>
-          <w:lang w:val="en-GB"/>
-        </w:rPr>
-        <w:t xml:space="preserve">, jQuery, Magento </w:t>
+        <w:t xml:space="preserve">OOP, PHP, HTML, CSS3, Javascript, jQuery, Magento </w:t>
       </w:r>
       <w:r>
         <w:rPr>
@@ -7899,29 +6880,7 @@
           <w:szCs w:val="26"/>
           <w:lang w:val="es-ES"/>
         </w:rPr>
-        <w:t>Palacio de Hierro (</w:t>
-      </w:r>
-      <w:proofErr w:type="spellStart"/>
-      <w:r>
-        <w:rPr>
-          <w:rFonts w:asciiTheme="minorHAnsi" w:hAnsiTheme="minorHAnsi" w:cstheme="minorHAnsi"/>
-          <w:b/>
-          <w:sz w:val="28"/>
-          <w:szCs w:val="26"/>
-          <w:lang w:val="es-ES"/>
-        </w:rPr>
-        <w:t>Mexican</w:t>
-      </w:r>
-      <w:proofErr w:type="spellEnd"/>
-      <w:r>
-        <w:rPr>
-          <w:rFonts w:asciiTheme="minorHAnsi" w:hAnsiTheme="minorHAnsi" w:cstheme="minorHAnsi"/>
-          <w:b/>
-          <w:sz w:val="28"/>
-          <w:szCs w:val="26"/>
-          <w:lang w:val="es-ES"/>
-        </w:rPr>
-        <w:t>) 2014</w:t>
+        <w:t>Palacio de Hierro (Mexican) 2014</w:t>
       </w:r>
     </w:p>
     <w:p>
@@ -8269,27 +7228,7 @@
           <w:lang w:val="en-GB"/>
         </w:rPr>
         <w:lastRenderedPageBreak/>
-        <w:t xml:space="preserve">Integrate SPS </w:t>
-      </w:r>
-      <w:proofErr w:type="spellStart"/>
-      <w:r>
-        <w:rPr>
-          <w:rFonts w:asciiTheme="minorHAnsi" w:hAnsiTheme="minorHAnsi" w:cstheme="minorHAnsi"/>
-          <w:sz w:val="26"/>
-          <w:szCs w:val="26"/>
-          <w:lang w:val="en-GB"/>
-        </w:rPr>
-        <w:t>Decidir</w:t>
-      </w:r>
-      <w:proofErr w:type="spellEnd"/>
-      <w:r>
-        <w:rPr>
-          <w:rFonts w:asciiTheme="minorHAnsi" w:hAnsiTheme="minorHAnsi" w:cstheme="minorHAnsi"/>
-          <w:sz w:val="26"/>
-          <w:szCs w:val="26"/>
-          <w:lang w:val="en-GB"/>
-        </w:rPr>
-        <w:t xml:space="preserve"> Payment Method.</w:t>
+        <w:t>Integrate SPS Decidir Payment Method.</w:t>
       </w:r>
       <w:r>
         <w:rPr>
@@ -8404,27 +7343,7 @@
           <w:szCs w:val="26"/>
           <w:lang w:val="en-GB"/>
         </w:rPr>
-        <w:t xml:space="preserve">OOP, PHP, HTML, CSS3, SASS, Compass, </w:t>
-      </w:r>
-      <w:proofErr w:type="spellStart"/>
-      <w:r>
-        <w:rPr>
-          <w:rFonts w:asciiTheme="minorHAnsi" w:hAnsiTheme="minorHAnsi" w:cstheme="minorHAnsi"/>
-          <w:sz w:val="26"/>
-          <w:szCs w:val="26"/>
-          <w:lang w:val="en-GB"/>
-        </w:rPr>
-        <w:t>Javascript</w:t>
-      </w:r>
-      <w:proofErr w:type="spellEnd"/>
-      <w:r>
-        <w:rPr>
-          <w:rFonts w:asciiTheme="minorHAnsi" w:hAnsiTheme="minorHAnsi" w:cstheme="minorHAnsi"/>
-          <w:sz w:val="26"/>
-          <w:szCs w:val="26"/>
-          <w:lang w:val="en-GB"/>
-        </w:rPr>
-        <w:t>, Prototype, Magento CE, MySQL,</w:t>
+        <w:t>OOP, PHP, HTML, CSS3, SASS, Compass, Javascript, Prototype, Magento CE, MySQL,</w:t>
       </w:r>
       <w:r>
         <w:rPr>
@@ -8476,27 +7395,15 @@
           <w:lang w:val="en-GB"/>
         </w:rPr>
       </w:pPr>
-      <w:proofErr w:type="spellStart"/>
-      <w:r>
-        <w:rPr>
-          <w:rFonts w:asciiTheme="minorHAnsi" w:hAnsiTheme="minorHAnsi" w:cstheme="minorHAnsi"/>
-          <w:b/>
-          <w:sz w:val="28"/>
-          <w:szCs w:val="26"/>
-          <w:lang w:val="en-GB"/>
-        </w:rPr>
-        <w:t>Stylewatch</w:t>
-      </w:r>
-      <w:proofErr w:type="spellEnd"/>
-      <w:r>
-        <w:rPr>
-          <w:rFonts w:asciiTheme="minorHAnsi" w:hAnsiTheme="minorHAnsi" w:cstheme="minorHAnsi"/>
-          <w:b/>
-          <w:sz w:val="28"/>
-          <w:szCs w:val="26"/>
-          <w:lang w:val="en-GB"/>
-        </w:rPr>
-        <w:t xml:space="preserve"> (Argentinean) 2015 - </w:t>
+      <w:r>
+        <w:rPr>
+          <w:rFonts w:asciiTheme="minorHAnsi" w:hAnsiTheme="minorHAnsi" w:cstheme="minorHAnsi"/>
+          <w:b/>
+          <w:sz w:val="28"/>
+          <w:szCs w:val="26"/>
+          <w:lang w:val="en-GB"/>
+        </w:rPr>
+        <w:t xml:space="preserve">Stylewatch (Argentinean) 2015 - </w:t>
       </w:r>
       <w:r>
         <w:rPr>
@@ -8727,27 +7634,7 @@
           <w:szCs w:val="26"/>
           <w:lang w:val="en-GB"/>
         </w:rPr>
-        <w:t xml:space="preserve">OOP, PHP, HTML, CSS3, SASS, Compass, </w:t>
-      </w:r>
-      <w:proofErr w:type="spellStart"/>
-      <w:r>
-        <w:rPr>
-          <w:rFonts w:asciiTheme="minorHAnsi" w:hAnsiTheme="minorHAnsi" w:cstheme="minorHAnsi"/>
-          <w:sz w:val="26"/>
-          <w:szCs w:val="26"/>
-          <w:lang w:val="en-GB"/>
-        </w:rPr>
-        <w:t>Javascript</w:t>
-      </w:r>
-      <w:proofErr w:type="spellEnd"/>
-      <w:r>
-        <w:rPr>
-          <w:rFonts w:asciiTheme="minorHAnsi" w:hAnsiTheme="minorHAnsi" w:cstheme="minorHAnsi"/>
-          <w:sz w:val="26"/>
-          <w:szCs w:val="26"/>
-          <w:lang w:val="en-GB"/>
-        </w:rPr>
-        <w:t>, Prototype, Magento CE, MySQL, Andreani WS, Scrum.</w:t>
+        <w:t>OOP, PHP, HTML, CSS3, SASS, Compass, Javascript, Prototype, Magento CE, MySQL, Andreani WS, Scrum.</w:t>
       </w:r>
     </w:p>
     <w:p>
@@ -8968,27 +7855,7 @@
           <w:szCs w:val="26"/>
           <w:lang w:val="en-GB"/>
         </w:rPr>
-        <w:t xml:space="preserve">OOP, PHP, HTML, CSS3, SASS, Compass, </w:t>
-      </w:r>
-      <w:proofErr w:type="spellStart"/>
-      <w:r>
-        <w:rPr>
-          <w:rFonts w:asciiTheme="minorHAnsi" w:hAnsiTheme="minorHAnsi" w:cstheme="minorHAnsi"/>
-          <w:sz w:val="26"/>
-          <w:szCs w:val="26"/>
-          <w:lang w:val="en-GB"/>
-        </w:rPr>
-        <w:t>Javascript</w:t>
-      </w:r>
-      <w:proofErr w:type="spellEnd"/>
-      <w:r>
-        <w:rPr>
-          <w:rFonts w:asciiTheme="minorHAnsi" w:hAnsiTheme="minorHAnsi" w:cstheme="minorHAnsi"/>
-          <w:sz w:val="26"/>
-          <w:szCs w:val="26"/>
-          <w:lang w:val="en-GB"/>
-        </w:rPr>
-        <w:t xml:space="preserve">, Prototype, Magento </w:t>
+        <w:t xml:space="preserve">OOP, PHP, HTML, CSS3, SASS, Compass, Javascript, Prototype, Magento </w:t>
       </w:r>
       <w:r>
         <w:rPr>
@@ -9127,27 +7994,7 @@
           <w:szCs w:val="26"/>
           <w:lang w:val="en-GB"/>
         </w:rPr>
-        <w:t xml:space="preserve">Customized </w:t>
-      </w:r>
-      <w:proofErr w:type="spellStart"/>
-      <w:r>
-        <w:rPr>
-          <w:rFonts w:asciiTheme="minorHAnsi" w:hAnsiTheme="minorHAnsi" w:cstheme="minorHAnsi"/>
-          <w:sz w:val="26"/>
-          <w:szCs w:val="26"/>
-          <w:lang w:val="en-GB"/>
-        </w:rPr>
-        <w:t>wordpress</w:t>
-      </w:r>
-      <w:proofErr w:type="spellEnd"/>
-      <w:r>
-        <w:rPr>
-          <w:rFonts w:asciiTheme="minorHAnsi" w:hAnsiTheme="minorHAnsi" w:cstheme="minorHAnsi"/>
-          <w:sz w:val="26"/>
-          <w:szCs w:val="26"/>
-          <w:lang w:val="en-GB"/>
-        </w:rPr>
-        <w:t xml:space="preserve"> templates based-on client requirements. </w:t>
+        <w:t xml:space="preserve">Customized wordpress templates based-on client requirements. </w:t>
       </w:r>
     </w:p>
     <w:p>
@@ -9172,27 +8019,7 @@
           <w:szCs w:val="26"/>
           <w:lang w:val="en-GB"/>
         </w:rPr>
-        <w:t xml:space="preserve">Data entry and </w:t>
-      </w:r>
-      <w:proofErr w:type="spellStart"/>
-      <w:r>
-        <w:rPr>
-          <w:rFonts w:asciiTheme="minorHAnsi" w:hAnsiTheme="minorHAnsi" w:cstheme="minorHAnsi"/>
-          <w:sz w:val="26"/>
-          <w:szCs w:val="26"/>
-          <w:lang w:val="en-GB"/>
-        </w:rPr>
-        <w:t>Wordpress</w:t>
-      </w:r>
-      <w:proofErr w:type="spellEnd"/>
-      <w:r>
-        <w:rPr>
-          <w:rFonts w:asciiTheme="minorHAnsi" w:hAnsiTheme="minorHAnsi" w:cstheme="minorHAnsi"/>
-          <w:sz w:val="26"/>
-          <w:szCs w:val="26"/>
-          <w:lang w:val="en-GB"/>
-        </w:rPr>
-        <w:t xml:space="preserve"> teaching for co-workers.</w:t>
+        <w:t>Data entry and Wordpress teaching for co-workers.</w:t>
       </w:r>
     </w:p>
     <w:p>
@@ -9224,47 +8051,7 @@
           <w:szCs w:val="26"/>
           <w:lang w:val="en-GB"/>
         </w:rPr>
-        <w:t xml:space="preserve">OOP, PHP, HTML, CSS3, </w:t>
-      </w:r>
-      <w:proofErr w:type="spellStart"/>
-      <w:r>
-        <w:rPr>
-          <w:rFonts w:asciiTheme="minorHAnsi" w:hAnsiTheme="minorHAnsi" w:cstheme="minorHAnsi"/>
-          <w:sz w:val="26"/>
-          <w:szCs w:val="26"/>
-          <w:lang w:val="en-GB"/>
-        </w:rPr>
-        <w:t>Javascript</w:t>
-      </w:r>
-      <w:proofErr w:type="spellEnd"/>
-      <w:r>
-        <w:rPr>
-          <w:rFonts w:asciiTheme="minorHAnsi" w:hAnsiTheme="minorHAnsi" w:cstheme="minorHAnsi"/>
-          <w:sz w:val="26"/>
-          <w:szCs w:val="26"/>
-          <w:lang w:val="en-GB"/>
-        </w:rPr>
-        <w:t xml:space="preserve">, jQuery, </w:t>
-      </w:r>
-      <w:proofErr w:type="spellStart"/>
-      <w:r>
-        <w:rPr>
-          <w:rFonts w:asciiTheme="minorHAnsi" w:hAnsiTheme="minorHAnsi" w:cstheme="minorHAnsi"/>
-          <w:sz w:val="26"/>
-          <w:szCs w:val="26"/>
-          <w:lang w:val="en-GB"/>
-        </w:rPr>
-        <w:t>Wordpress</w:t>
-      </w:r>
-      <w:proofErr w:type="spellEnd"/>
-      <w:r>
-        <w:rPr>
-          <w:rFonts w:asciiTheme="minorHAnsi" w:hAnsiTheme="minorHAnsi" w:cstheme="minorHAnsi"/>
-          <w:sz w:val="26"/>
-          <w:szCs w:val="26"/>
-          <w:lang w:val="en-GB"/>
-        </w:rPr>
-        <w:t xml:space="preserve"> 4, MySQL, Scrum.</w:t>
+        <w:t>OOP, PHP, HTML, CSS3, Javascript, jQuery, Wordpress 4, MySQL, Scrum.</w:t>
       </w:r>
     </w:p>
     <w:p>
@@ -9522,27 +8309,7 @@
           <w:szCs w:val="26"/>
           <w:lang w:val="en-GB"/>
         </w:rPr>
-        <w:t xml:space="preserve">Develop Magento extension to integrate </w:t>
-      </w:r>
-      <w:proofErr w:type="spellStart"/>
-      <w:r>
-        <w:rPr>
-          <w:rFonts w:asciiTheme="minorHAnsi" w:hAnsiTheme="minorHAnsi" w:cstheme="minorHAnsi"/>
-          <w:sz w:val="26"/>
-          <w:szCs w:val="26"/>
-          <w:lang w:val="en-GB"/>
-        </w:rPr>
-        <w:t>Fetchr</w:t>
-      </w:r>
-      <w:proofErr w:type="spellEnd"/>
-      <w:r>
-        <w:rPr>
-          <w:rFonts w:asciiTheme="minorHAnsi" w:hAnsiTheme="minorHAnsi" w:cstheme="minorHAnsi"/>
-          <w:sz w:val="26"/>
-          <w:szCs w:val="26"/>
-          <w:lang w:val="en-GB"/>
-        </w:rPr>
-        <w:t xml:space="preserve"> carrier.</w:t>
+        <w:t>Develop Magento extension to integrate Fetchr carrier.</w:t>
       </w:r>
     </w:p>
     <w:p>
@@ -9633,47 +8400,7 @@
           <w:szCs w:val="26"/>
           <w:lang w:val="en-GB"/>
         </w:rPr>
-        <w:t xml:space="preserve">OOP, PHP, HTML, CSS3, SASS, Compass, </w:t>
-      </w:r>
-      <w:proofErr w:type="spellStart"/>
-      <w:r>
-        <w:rPr>
-          <w:rFonts w:asciiTheme="minorHAnsi" w:hAnsiTheme="minorHAnsi" w:cstheme="minorHAnsi"/>
-          <w:sz w:val="26"/>
-          <w:szCs w:val="26"/>
-          <w:lang w:val="en-GB"/>
-        </w:rPr>
-        <w:t>Javascript</w:t>
-      </w:r>
-      <w:proofErr w:type="spellEnd"/>
-      <w:r>
-        <w:rPr>
-          <w:rFonts w:asciiTheme="minorHAnsi" w:hAnsiTheme="minorHAnsi" w:cstheme="minorHAnsi"/>
-          <w:sz w:val="26"/>
-          <w:szCs w:val="26"/>
-          <w:lang w:val="en-GB"/>
-        </w:rPr>
-        <w:t xml:space="preserve">, Prototype, Magento EE, Multi Language, Multi Websites, Custom CRM Integration, Grunt, </w:t>
-      </w:r>
-      <w:proofErr w:type="spellStart"/>
-      <w:r>
-        <w:rPr>
-          <w:rFonts w:asciiTheme="minorHAnsi" w:hAnsiTheme="minorHAnsi" w:cstheme="minorHAnsi"/>
-          <w:sz w:val="26"/>
-          <w:szCs w:val="26"/>
-          <w:lang w:val="en-GB"/>
-        </w:rPr>
-        <w:t>Fetchr</w:t>
-      </w:r>
-      <w:proofErr w:type="spellEnd"/>
-      <w:r>
-        <w:rPr>
-          <w:rFonts w:asciiTheme="minorHAnsi" w:hAnsiTheme="minorHAnsi" w:cstheme="minorHAnsi"/>
-          <w:sz w:val="26"/>
-          <w:szCs w:val="26"/>
-          <w:lang w:val="en-GB"/>
-        </w:rPr>
-        <w:t xml:space="preserve"> Integration, Composer, MySQL, Scrum.</w:t>
+        <w:t>OOP, PHP, HTML, CSS3, SASS, Compass, Javascript, Prototype, Magento EE, Multi Language, Multi Websites, Custom CRM Integration, Grunt, Fetchr Integration, Composer, MySQL, Scrum.</w:t>
       </w:r>
     </w:p>
     <w:p>
@@ -9826,27 +8553,7 @@
           <w:szCs w:val="26"/>
           <w:lang w:val="en-GB"/>
         </w:rPr>
-        <w:t xml:space="preserve">Develop Magento extension to integrate </w:t>
-      </w:r>
-      <w:proofErr w:type="spellStart"/>
-      <w:r>
-        <w:rPr>
-          <w:rFonts w:asciiTheme="minorHAnsi" w:hAnsiTheme="minorHAnsi" w:cstheme="minorHAnsi"/>
-          <w:sz w:val="26"/>
-          <w:szCs w:val="26"/>
-          <w:lang w:val="en-GB"/>
-        </w:rPr>
-        <w:t>Fetchr</w:t>
-      </w:r>
-      <w:proofErr w:type="spellEnd"/>
-      <w:r>
-        <w:rPr>
-          <w:rFonts w:asciiTheme="minorHAnsi" w:hAnsiTheme="minorHAnsi" w:cstheme="minorHAnsi"/>
-          <w:sz w:val="26"/>
-          <w:szCs w:val="26"/>
-          <w:lang w:val="en-GB"/>
-        </w:rPr>
-        <w:t xml:space="preserve"> carrier.</w:t>
+        <w:t>Develop Magento extension to integrate Fetchr carrier.</w:t>
       </w:r>
     </w:p>
     <w:p>
@@ -9937,47 +8644,7 @@
           <w:szCs w:val="26"/>
           <w:lang w:val="en-GB"/>
         </w:rPr>
-        <w:t xml:space="preserve">OOP, PHP, HTML, CSS3, SASS, Compass, </w:t>
-      </w:r>
-      <w:proofErr w:type="spellStart"/>
-      <w:r>
-        <w:rPr>
-          <w:rFonts w:asciiTheme="minorHAnsi" w:hAnsiTheme="minorHAnsi" w:cstheme="minorHAnsi"/>
-          <w:sz w:val="26"/>
-          <w:szCs w:val="26"/>
-          <w:lang w:val="en-GB"/>
-        </w:rPr>
-        <w:t>Javascript</w:t>
-      </w:r>
-      <w:proofErr w:type="spellEnd"/>
-      <w:r>
-        <w:rPr>
-          <w:rFonts w:asciiTheme="minorHAnsi" w:hAnsiTheme="minorHAnsi" w:cstheme="minorHAnsi"/>
-          <w:sz w:val="26"/>
-          <w:szCs w:val="26"/>
-          <w:lang w:val="en-GB"/>
-        </w:rPr>
-        <w:t xml:space="preserve">, Prototype, Magento EE, Multi Language, Multi Websites, Custom Omni-channel Integration, </w:t>
-      </w:r>
-      <w:proofErr w:type="spellStart"/>
-      <w:r>
-        <w:rPr>
-          <w:rFonts w:asciiTheme="minorHAnsi" w:hAnsiTheme="minorHAnsi" w:cstheme="minorHAnsi"/>
-          <w:sz w:val="26"/>
-          <w:szCs w:val="26"/>
-          <w:lang w:val="en-GB"/>
-        </w:rPr>
-        <w:t>Fetchr</w:t>
-      </w:r>
-      <w:proofErr w:type="spellEnd"/>
-      <w:r>
-        <w:rPr>
-          <w:rFonts w:asciiTheme="minorHAnsi" w:hAnsiTheme="minorHAnsi" w:cstheme="minorHAnsi"/>
-          <w:sz w:val="26"/>
-          <w:szCs w:val="26"/>
-          <w:lang w:val="en-GB"/>
-        </w:rPr>
-        <w:t xml:space="preserve"> Integration, Composer, MySQL, Scrum.</w:t>
+        <w:t>OOP, PHP, HTML, CSS3, SASS, Compass, Javascript, Prototype, Magento EE, Multi Language, Multi Websites, Custom Omni-channel Integration, Fetchr Integration, Composer, MySQL, Scrum.</w:t>
       </w:r>
     </w:p>
     <w:p>
@@ -10138,27 +8805,7 @@
           <w:szCs w:val="26"/>
           <w:lang w:val="en-GB"/>
         </w:rPr>
-        <w:t xml:space="preserve">Develop Magento extension to integrate </w:t>
-      </w:r>
-      <w:proofErr w:type="spellStart"/>
-      <w:r>
-        <w:rPr>
-          <w:rFonts w:asciiTheme="minorHAnsi" w:hAnsiTheme="minorHAnsi" w:cstheme="minorHAnsi"/>
-          <w:sz w:val="26"/>
-          <w:szCs w:val="26"/>
-          <w:lang w:val="en-GB"/>
-        </w:rPr>
-        <w:t>Fetchr</w:t>
-      </w:r>
-      <w:proofErr w:type="spellEnd"/>
-      <w:r>
-        <w:rPr>
-          <w:rFonts w:asciiTheme="minorHAnsi" w:hAnsiTheme="minorHAnsi" w:cstheme="minorHAnsi"/>
-          <w:sz w:val="26"/>
-          <w:szCs w:val="26"/>
-          <w:lang w:val="en-GB"/>
-        </w:rPr>
-        <w:t xml:space="preserve"> carrier.</w:t>
+        <w:t>Develop Magento extension to integrate Fetchr carrier.</w:t>
       </w:r>
     </w:p>
     <w:p>
@@ -10250,47 +8897,7 @@
           <w:szCs w:val="26"/>
           <w:lang w:val="en-GB"/>
         </w:rPr>
-        <w:t xml:space="preserve">OOP, PHP, HTML, CSS3, SASS, Compass, </w:t>
-      </w:r>
-      <w:proofErr w:type="spellStart"/>
-      <w:r>
-        <w:rPr>
-          <w:rFonts w:asciiTheme="minorHAnsi" w:hAnsiTheme="minorHAnsi" w:cstheme="minorHAnsi"/>
-          <w:sz w:val="26"/>
-          <w:szCs w:val="26"/>
-          <w:lang w:val="en-GB"/>
-        </w:rPr>
-        <w:t>Javascript</w:t>
-      </w:r>
-      <w:proofErr w:type="spellEnd"/>
-      <w:r>
-        <w:rPr>
-          <w:rFonts w:asciiTheme="minorHAnsi" w:hAnsiTheme="minorHAnsi" w:cstheme="minorHAnsi"/>
-          <w:sz w:val="26"/>
-          <w:szCs w:val="26"/>
-          <w:lang w:val="en-GB"/>
-        </w:rPr>
-        <w:t xml:space="preserve">, Prototype, Magento EE, Multi Language, Multi Websites, Custom Omni-channel Integration, </w:t>
-      </w:r>
-      <w:proofErr w:type="spellStart"/>
-      <w:r>
-        <w:rPr>
-          <w:rFonts w:asciiTheme="minorHAnsi" w:hAnsiTheme="minorHAnsi" w:cstheme="minorHAnsi"/>
-          <w:sz w:val="26"/>
-          <w:szCs w:val="26"/>
-          <w:lang w:val="en-GB"/>
-        </w:rPr>
-        <w:t>Fetchr</w:t>
-      </w:r>
-      <w:proofErr w:type="spellEnd"/>
-      <w:r>
-        <w:rPr>
-          <w:rFonts w:asciiTheme="minorHAnsi" w:hAnsiTheme="minorHAnsi" w:cstheme="minorHAnsi"/>
-          <w:sz w:val="26"/>
-          <w:szCs w:val="26"/>
-          <w:lang w:val="en-GB"/>
-        </w:rPr>
-        <w:t xml:space="preserve"> Integration, Composer, MySQL, Scrum.</w:t>
+        <w:t>OOP, PHP, HTML, CSS3, SASS, Compass, Javascript, Prototype, Magento EE, Multi Language, Multi Websites, Custom Omni-channel Integration, Fetchr Integration, Composer, MySQL, Scrum.</w:t>
       </w:r>
     </w:p>
     <w:p>
@@ -10602,27 +9209,7 @@
           <w:szCs w:val="26"/>
           <w:lang w:val="en-GB"/>
         </w:rPr>
-        <w:t xml:space="preserve">OOP, PHP, HTML, CSS3, SASS, Compass, </w:t>
-      </w:r>
-      <w:proofErr w:type="spellStart"/>
-      <w:r>
-        <w:rPr>
-          <w:rFonts w:asciiTheme="minorHAnsi" w:hAnsiTheme="minorHAnsi" w:cstheme="minorHAnsi"/>
-          <w:sz w:val="26"/>
-          <w:szCs w:val="26"/>
-          <w:lang w:val="en-GB"/>
-        </w:rPr>
-        <w:t>Javascript</w:t>
-      </w:r>
-      <w:proofErr w:type="spellEnd"/>
-      <w:r>
-        <w:rPr>
-          <w:rFonts w:asciiTheme="minorHAnsi" w:hAnsiTheme="minorHAnsi" w:cstheme="minorHAnsi"/>
-          <w:sz w:val="26"/>
-          <w:szCs w:val="26"/>
-          <w:lang w:val="en-GB"/>
-        </w:rPr>
-        <w:t>, Prototype, Magento EE, Multi Language, Multi Websites, Custom Omni-channel Integration, Composer, MySQL, Scrum.</w:t>
+        <w:t>OOP, PHP, HTML, CSS3, SASS, Compass, Javascript, Prototype, Magento EE, Multi Language, Multi Websites, Custom Omni-channel Integration, Composer, MySQL, Scrum.</w:t>
       </w:r>
     </w:p>
     <w:p>
@@ -10664,27 +9251,15 @@
           <w:lang w:val="en-GB"/>
         </w:rPr>
       </w:pPr>
-      <w:proofErr w:type="spellStart"/>
-      <w:r>
-        <w:rPr>
-          <w:rFonts w:asciiTheme="minorHAnsi" w:hAnsiTheme="minorHAnsi" w:cstheme="minorHAnsi"/>
-          <w:b/>
-          <w:sz w:val="28"/>
-          <w:szCs w:val="26"/>
-          <w:lang w:val="en-GB"/>
-        </w:rPr>
-        <w:t>Altayer</w:t>
-      </w:r>
-      <w:proofErr w:type="spellEnd"/>
-      <w:r>
-        <w:rPr>
-          <w:rFonts w:asciiTheme="minorHAnsi" w:hAnsiTheme="minorHAnsi" w:cstheme="minorHAnsi"/>
-          <w:b/>
-          <w:sz w:val="28"/>
-          <w:szCs w:val="26"/>
-          <w:lang w:val="en-GB"/>
-        </w:rPr>
-        <w:t xml:space="preserve"> (</w:t>
+      <w:r>
+        <w:rPr>
+          <w:rFonts w:asciiTheme="minorHAnsi" w:hAnsiTheme="minorHAnsi" w:cstheme="minorHAnsi"/>
+          <w:b/>
+          <w:sz w:val="28"/>
+          <w:szCs w:val="26"/>
+          <w:lang w:val="en-GB"/>
+        </w:rPr>
+        <w:t>Altayer (</w:t>
       </w:r>
       <w:r>
         <w:rPr>
@@ -10935,27 +9510,7 @@
           <w:szCs w:val="26"/>
           <w:lang w:val="en-GB"/>
         </w:rPr>
-        <w:t xml:space="preserve">OOP, PHP, PHP7, HTML, CSS3, SASS, Compass, </w:t>
-      </w:r>
-      <w:proofErr w:type="spellStart"/>
-      <w:r>
-        <w:rPr>
-          <w:rFonts w:asciiTheme="minorHAnsi" w:hAnsiTheme="minorHAnsi" w:cstheme="minorHAnsi"/>
-          <w:sz w:val="26"/>
-          <w:szCs w:val="26"/>
-          <w:lang w:val="en-GB"/>
-        </w:rPr>
-        <w:t>Javascript</w:t>
-      </w:r>
-      <w:proofErr w:type="spellEnd"/>
-      <w:r>
-        <w:rPr>
-          <w:rFonts w:asciiTheme="minorHAnsi" w:hAnsiTheme="minorHAnsi" w:cstheme="minorHAnsi"/>
-          <w:sz w:val="26"/>
-          <w:szCs w:val="26"/>
-          <w:lang w:val="en-GB"/>
-        </w:rPr>
-        <w:t>, Prototype, Magento 2 EE, Multi Language, Multi Websites, API Rest, Service Contracts, Dependency Injection,</w:t>
+        <w:t>OOP, PHP, PHP7, HTML, CSS3, SASS, Compass, Javascript, Prototype, Magento 2 EE, Multi Language, Multi Websites, API Rest, Service Contracts, Dependency Injection,</w:t>
       </w:r>
       <w:r>
         <w:rPr>
@@ -11157,27 +9712,7 @@
           <w:szCs w:val="26"/>
           <w:lang w:val="en-GB"/>
         </w:rPr>
-        <w:t xml:space="preserve">OOP, PHP, PHP7, HTML, CSS3, SASS, Compass, </w:t>
-      </w:r>
-      <w:proofErr w:type="spellStart"/>
-      <w:r>
-        <w:rPr>
-          <w:rFonts w:asciiTheme="minorHAnsi" w:hAnsiTheme="minorHAnsi" w:cstheme="minorHAnsi"/>
-          <w:sz w:val="26"/>
-          <w:szCs w:val="26"/>
-          <w:lang w:val="en-GB"/>
-        </w:rPr>
-        <w:t>Javascript</w:t>
-      </w:r>
-      <w:proofErr w:type="spellEnd"/>
-      <w:r>
-        <w:rPr>
-          <w:rFonts w:asciiTheme="minorHAnsi" w:hAnsiTheme="minorHAnsi" w:cstheme="minorHAnsi"/>
-          <w:sz w:val="26"/>
-          <w:szCs w:val="26"/>
-          <w:lang w:val="en-GB"/>
-        </w:rPr>
-        <w:t>, Prototype, Magento 2 EE, Multi Language, Multi Websites, API Rest, Service Contracts, Dependency Injection, Headless Magento, Composer, MySQL, Scrum.</w:t>
+        <w:t>OOP, PHP, PHP7, HTML, CSS3, SASS, Compass, Javascript, Prototype, Magento 2 EE, Multi Language, Multi Websites, API Rest, Service Contracts, Dependency Injection, Headless Magento, Composer, MySQL, Scrum.</w:t>
       </w:r>
     </w:p>
     <w:p>
@@ -11360,27 +9895,7 @@
           <w:szCs w:val="26"/>
           <w:lang w:val="en-GB"/>
         </w:rPr>
-        <w:t xml:space="preserve">OOP, PHP, PHP7, HTML, CSS3, SASS, Compass, </w:t>
-      </w:r>
-      <w:proofErr w:type="spellStart"/>
-      <w:r>
-        <w:rPr>
-          <w:rFonts w:asciiTheme="minorHAnsi" w:hAnsiTheme="minorHAnsi" w:cstheme="minorHAnsi"/>
-          <w:sz w:val="26"/>
-          <w:szCs w:val="26"/>
-          <w:lang w:val="en-GB"/>
-        </w:rPr>
-        <w:t>Javascript</w:t>
-      </w:r>
-      <w:proofErr w:type="spellEnd"/>
-      <w:r>
-        <w:rPr>
-          <w:rFonts w:asciiTheme="minorHAnsi" w:hAnsiTheme="minorHAnsi" w:cstheme="minorHAnsi"/>
-          <w:sz w:val="26"/>
-          <w:szCs w:val="26"/>
-          <w:lang w:val="en-GB"/>
-        </w:rPr>
-        <w:t>, Prototype, Magento 2 EE, Multi Language, Multi Websites, API Rest, Service Contracts, Dependency Injection, Headless Magento, Composer, MySQL, Scrum.</w:t>
+        <w:t>OOP, PHP, PHP7, HTML, CSS3, SASS, Compass, Javascript, Prototype, Magento 2 EE, Multi Language, Multi Websites, API Rest, Service Contracts, Dependency Injection, Headless Magento, Composer, MySQL, Scrum.</w:t>
       </w:r>
     </w:p>
     <w:p>
@@ -11564,27 +10079,7 @@
           <w:szCs w:val="26"/>
           <w:lang w:val="en-GB"/>
         </w:rPr>
-        <w:t xml:space="preserve">OOP, PHP, PHP7, HTML, CSS3, SASS, Compass, </w:t>
-      </w:r>
-      <w:proofErr w:type="spellStart"/>
-      <w:r>
-        <w:rPr>
-          <w:rFonts w:asciiTheme="minorHAnsi" w:hAnsiTheme="minorHAnsi" w:cstheme="minorHAnsi"/>
-          <w:sz w:val="26"/>
-          <w:szCs w:val="26"/>
-          <w:lang w:val="en-GB"/>
-        </w:rPr>
-        <w:t>Javascript</w:t>
-      </w:r>
-      <w:proofErr w:type="spellEnd"/>
-      <w:r>
-        <w:rPr>
-          <w:rFonts w:asciiTheme="minorHAnsi" w:hAnsiTheme="minorHAnsi" w:cstheme="minorHAnsi"/>
-          <w:sz w:val="26"/>
-          <w:szCs w:val="26"/>
-          <w:lang w:val="en-GB"/>
-        </w:rPr>
-        <w:t>, Prototype, Magento 2 EE, Multi Language, Multi Websites, API Rest, Service Contracts, Dependency Injection, Headless Magento, Composer, MySQL, Scrum.</w:t>
+        <w:t>OOP, PHP, PHP7, HTML, CSS3, SASS, Compass, Javascript, Prototype, Magento 2 EE, Multi Language, Multi Websites, API Rest, Service Contracts, Dependency Injection, Headless Magento, Composer, MySQL, Scrum.</w:t>
       </w:r>
       <w:r>
         <w:rPr>
@@ -11816,27 +10311,7 @@
           <w:szCs w:val="26"/>
           <w:lang w:val="en-GB"/>
         </w:rPr>
-        <w:t xml:space="preserve">OOP, PHP, PHP7, HTML, CSS3, SASS, Compass, </w:t>
-      </w:r>
-      <w:proofErr w:type="spellStart"/>
-      <w:r>
-        <w:rPr>
-          <w:rFonts w:asciiTheme="minorHAnsi" w:hAnsiTheme="minorHAnsi" w:cstheme="minorHAnsi"/>
-          <w:sz w:val="26"/>
-          <w:szCs w:val="26"/>
-          <w:lang w:val="en-GB"/>
-        </w:rPr>
-        <w:t>Javascript</w:t>
-      </w:r>
-      <w:proofErr w:type="spellEnd"/>
-      <w:r>
-        <w:rPr>
-          <w:rFonts w:asciiTheme="minorHAnsi" w:hAnsiTheme="minorHAnsi" w:cstheme="minorHAnsi"/>
-          <w:sz w:val="26"/>
-          <w:szCs w:val="26"/>
-          <w:lang w:val="en-GB"/>
-        </w:rPr>
-        <w:t>, Prototype, Magento 2 EE, Multi Language, Multi Websites, API Rest, Service Contracts, Dependency Injection, Headless Magento, Composer, MySQL, Scrum.</w:t>
+        <w:t>OOP, PHP, PHP7, HTML, CSS3, SASS, Compass, Javascript, Prototype, Magento 2 EE, Multi Language, Multi Websites, API Rest, Service Contracts, Dependency Injection, Headless Magento, Composer, MySQL, Scrum.</w:t>
       </w:r>
     </w:p>
     <w:p>
@@ -12148,27 +10623,7 @@
           <w:szCs w:val="26"/>
           <w:lang w:val="en-GB"/>
         </w:rPr>
-        <w:t xml:space="preserve">OOP, PHP, PHP7, HTML, CSS3, SASS, Compass, </w:t>
-      </w:r>
-      <w:proofErr w:type="spellStart"/>
-      <w:r>
-        <w:rPr>
-          <w:rFonts w:asciiTheme="minorHAnsi" w:hAnsiTheme="minorHAnsi" w:cstheme="minorHAnsi"/>
-          <w:sz w:val="26"/>
-          <w:szCs w:val="26"/>
-          <w:lang w:val="en-GB"/>
-        </w:rPr>
-        <w:t>Javascript</w:t>
-      </w:r>
-      <w:proofErr w:type="spellEnd"/>
-      <w:r>
-        <w:rPr>
-          <w:rFonts w:asciiTheme="minorHAnsi" w:hAnsiTheme="minorHAnsi" w:cstheme="minorHAnsi"/>
-          <w:sz w:val="26"/>
-          <w:szCs w:val="26"/>
-          <w:lang w:val="en-GB"/>
-        </w:rPr>
-        <w:t>, Prototype, Magento 2 EE, Multi Language, Multi Websites, API Rest, Service Contracts, Dependency Injection, Headless Magento, Composer, MySQL, Scrum.</w:t>
+        <w:t>OOP, PHP, PHP7, HTML, CSS3, SASS, Compass, Javascript, Prototype, Magento 2 EE, Multi Language, Multi Websites, API Rest, Service Contracts, Dependency Injection, Headless Magento, Composer, MySQL, Scrum.</w:t>
       </w:r>
     </w:p>
     <w:p>
@@ -12399,27 +10854,7 @@
           <w:szCs w:val="26"/>
           <w:lang w:val="en-GB"/>
         </w:rPr>
-        <w:t xml:space="preserve">OOP, PHP, PHP7, HTML, CSS3, SASS, Compass, </w:t>
-      </w:r>
-      <w:proofErr w:type="spellStart"/>
-      <w:r>
-        <w:rPr>
-          <w:rFonts w:asciiTheme="minorHAnsi" w:hAnsiTheme="minorHAnsi" w:cstheme="minorHAnsi"/>
-          <w:sz w:val="26"/>
-          <w:szCs w:val="26"/>
-          <w:lang w:val="en-GB"/>
-        </w:rPr>
-        <w:t>Javascript</w:t>
-      </w:r>
-      <w:proofErr w:type="spellEnd"/>
-      <w:r>
-        <w:rPr>
-          <w:rFonts w:asciiTheme="minorHAnsi" w:hAnsiTheme="minorHAnsi" w:cstheme="minorHAnsi"/>
-          <w:sz w:val="26"/>
-          <w:szCs w:val="26"/>
-          <w:lang w:val="en-GB"/>
-        </w:rPr>
-        <w:t>, Prototype, Magento 2 EE, Multi Language, Multi Websites, API Rest, Service Contracts, Dependency Injection, Headless Magento, Composer, MySQL, Scrum.</w:t>
+        <w:t>OOP, PHP, PHP7, HTML, CSS3, SASS, Compass, Javascript, Prototype, Magento 2 EE, Multi Language, Multi Websites, API Rest, Service Contracts, Dependency Injection, Headless Magento, Composer, MySQL, Scrum.</w:t>
       </w:r>
     </w:p>
     <w:p>
@@ -12637,27 +11072,7 @@
           <w:szCs w:val="26"/>
           <w:lang w:val="en-GB"/>
         </w:rPr>
-        <w:t xml:space="preserve">OOP, PHP, PHP7, HTML, CSS3, SASS, Compass, </w:t>
-      </w:r>
-      <w:proofErr w:type="spellStart"/>
-      <w:r>
-        <w:rPr>
-          <w:rFonts w:asciiTheme="minorHAnsi" w:hAnsiTheme="minorHAnsi" w:cstheme="minorHAnsi"/>
-          <w:sz w:val="26"/>
-          <w:szCs w:val="26"/>
-          <w:lang w:val="en-GB"/>
-        </w:rPr>
-        <w:t>Javascript</w:t>
-      </w:r>
-      <w:proofErr w:type="spellEnd"/>
-      <w:r>
-        <w:rPr>
-          <w:rFonts w:asciiTheme="minorHAnsi" w:hAnsiTheme="minorHAnsi" w:cstheme="minorHAnsi"/>
-          <w:sz w:val="26"/>
-          <w:szCs w:val="26"/>
-          <w:lang w:val="en-GB"/>
-        </w:rPr>
-        <w:t>, Prototype, Magento 2 EE, Multi Language, Multi Websites, API Rest, Service Contracts, Dependency Injection, Headless Magento, Composer, MySQL, Scrum.</w:t>
+        <w:t>OOP, PHP, PHP7, HTML, CSS3, SASS, Compass, Javascript, Prototype, Magento 2 EE, Multi Language, Multi Websites, API Rest, Service Contracts, Dependency Injection, Headless Magento, Composer, MySQL, Scrum.</w:t>
       </w:r>
     </w:p>
     <w:p>
@@ -12731,7 +11146,6 @@
           <w:lang w:val="en-GB"/>
         </w:rPr>
       </w:pPr>
-      <w:proofErr w:type="spellStart"/>
       <w:r>
         <w:rPr>
           <w:rFonts w:asciiTheme="minorHAnsi" w:hAnsiTheme="minorHAnsi" w:cstheme="minorHAnsi"/>
@@ -12743,7 +11157,6 @@
         <w:lastRenderedPageBreak/>
         <w:t>Nahdi</w:t>
       </w:r>
-      <w:proofErr w:type="spellEnd"/>
       <w:r>
         <w:rPr>
           <w:rFonts w:asciiTheme="minorHAnsi" w:hAnsiTheme="minorHAnsi" w:cstheme="minorHAnsi"/>
@@ -12786,27 +11199,15 @@
           <w:lang w:val="en-GB"/>
         </w:rPr>
       </w:pPr>
-      <w:proofErr w:type="spellStart"/>
-      <w:r>
-        <w:rPr>
-          <w:rFonts w:asciiTheme="minorHAnsi" w:hAnsiTheme="minorHAnsi" w:cstheme="minorHAnsi"/>
-          <w:b/>
-          <w:sz w:val="26"/>
-          <w:szCs w:val="26"/>
-          <w:lang w:val="en-GB"/>
-        </w:rPr>
-        <w:t>Nahdi</w:t>
-      </w:r>
-      <w:proofErr w:type="spellEnd"/>
-      <w:r>
-        <w:rPr>
-          <w:rFonts w:asciiTheme="minorHAnsi" w:hAnsiTheme="minorHAnsi" w:cstheme="minorHAnsi"/>
-          <w:b/>
-          <w:sz w:val="26"/>
-          <w:szCs w:val="26"/>
-          <w:lang w:val="en-GB"/>
-        </w:rPr>
-        <w:t xml:space="preserve"> </w:t>
+      <w:r>
+        <w:rPr>
+          <w:rFonts w:asciiTheme="minorHAnsi" w:hAnsiTheme="minorHAnsi" w:cstheme="minorHAnsi"/>
+          <w:b/>
+          <w:sz w:val="26"/>
+          <w:szCs w:val="26"/>
+          <w:lang w:val="en-GB"/>
+        </w:rPr>
+        <w:t xml:space="preserve">Nahdi </w:t>
       </w:r>
       <w:r>
         <w:rPr>
@@ -13027,27 +11428,7 @@
           <w:szCs w:val="26"/>
           <w:lang w:val="en-GB"/>
         </w:rPr>
-        <w:t xml:space="preserve">Single Sign On integration module development with </w:t>
-      </w:r>
-      <w:proofErr w:type="spellStart"/>
-      <w:r>
-        <w:rPr>
-          <w:rFonts w:asciiTheme="minorHAnsi" w:hAnsiTheme="minorHAnsi" w:cstheme="minorHAnsi"/>
-          <w:sz w:val="26"/>
-          <w:szCs w:val="26"/>
-          <w:lang w:val="en-GB"/>
-        </w:rPr>
-        <w:t>OpenIDConnect</w:t>
-      </w:r>
-      <w:proofErr w:type="spellEnd"/>
-      <w:r>
-        <w:rPr>
-          <w:rFonts w:asciiTheme="minorHAnsi" w:hAnsiTheme="minorHAnsi" w:cstheme="minorHAnsi"/>
-          <w:sz w:val="26"/>
-          <w:szCs w:val="26"/>
-          <w:lang w:val="en-GB"/>
-        </w:rPr>
-        <w:t>.</w:t>
+        <w:t>Single Sign On integration module development with OpenIDConnect.</w:t>
       </w:r>
     </w:p>
     <w:p>
@@ -13103,76 +11484,16 @@
           <w:szCs w:val="26"/>
           <w:lang w:val="en-GB"/>
         </w:rPr>
-        <w:t xml:space="preserve">OOP, PHP, PHP7, HTML, CSS3, SASS, Compass, </w:t>
-      </w:r>
-      <w:proofErr w:type="spellStart"/>
-      <w:r>
-        <w:rPr>
-          <w:rFonts w:asciiTheme="minorHAnsi" w:hAnsiTheme="minorHAnsi" w:cstheme="minorHAnsi"/>
-          <w:sz w:val="26"/>
-          <w:szCs w:val="26"/>
-          <w:lang w:val="en-GB"/>
-        </w:rPr>
-        <w:t>Javascript</w:t>
-      </w:r>
-      <w:proofErr w:type="spellEnd"/>
-      <w:r>
-        <w:rPr>
-          <w:rFonts w:asciiTheme="minorHAnsi" w:hAnsiTheme="minorHAnsi" w:cstheme="minorHAnsi"/>
-          <w:sz w:val="26"/>
-          <w:szCs w:val="26"/>
-          <w:lang w:val="en-GB"/>
-        </w:rPr>
-        <w:t>, Prototype, Magento 2 EE, Multi Language, Multi Websites, API Rest, Service Contracts, Dependency Injection, Headless Magento, Composer, MySQL, Scrum</w:t>
-      </w:r>
-      <w:r>
-        <w:rPr>
-          <w:rFonts w:asciiTheme="minorHAnsi" w:hAnsiTheme="minorHAnsi" w:cstheme="minorHAnsi"/>
-          <w:sz w:val="26"/>
-          <w:szCs w:val="26"/>
-          <w:lang w:val="en-GB"/>
-        </w:rPr>
-        <w:t xml:space="preserve">, </w:t>
-      </w:r>
-      <w:proofErr w:type="spellStart"/>
-      <w:r>
-        <w:rPr>
-          <w:rFonts w:asciiTheme="minorHAnsi" w:hAnsiTheme="minorHAnsi" w:cstheme="minorHAnsi"/>
-          <w:sz w:val="26"/>
-          <w:szCs w:val="26"/>
-          <w:lang w:val="en-GB"/>
-        </w:rPr>
-        <w:t>OpenIDConnect</w:t>
-      </w:r>
-      <w:proofErr w:type="spellEnd"/>
-      <w:r>
-        <w:rPr>
-          <w:rFonts w:asciiTheme="minorHAnsi" w:hAnsiTheme="minorHAnsi" w:cstheme="minorHAnsi"/>
-          <w:sz w:val="26"/>
-          <w:szCs w:val="26"/>
-          <w:lang w:val="en-GB"/>
-        </w:rPr>
-        <w:t xml:space="preserve">, </w:t>
-      </w:r>
-      <w:proofErr w:type="spellStart"/>
-      <w:r>
-        <w:rPr>
-          <w:rFonts w:asciiTheme="minorHAnsi" w:hAnsiTheme="minorHAnsi" w:cstheme="minorHAnsi"/>
-          <w:sz w:val="26"/>
-          <w:szCs w:val="26"/>
-          <w:lang w:val="en-GB"/>
-        </w:rPr>
-        <w:t>MiniOrange</w:t>
-      </w:r>
-      <w:proofErr w:type="spellEnd"/>
-      <w:r>
-        <w:rPr>
-          <w:rFonts w:asciiTheme="minorHAnsi" w:hAnsiTheme="minorHAnsi" w:cstheme="minorHAnsi"/>
-          <w:sz w:val="26"/>
-          <w:szCs w:val="26"/>
-          <w:lang w:val="en-GB"/>
-        </w:rPr>
-        <w:t xml:space="preserve"> SSO</w:t>
+        <w:t>OOP, PHP, PHP7, HTML, CSS3, SASS, Compass, Javascript, Prototype, Magento 2 EE, Multi Language, Multi Websites, API Rest, Service Contracts, Dependency Injection, Headless Magento, Composer, MySQL, Scrum</w:t>
+      </w:r>
+      <w:r>
+        <w:rPr>
+          <w:rFonts w:asciiTheme="minorHAnsi" w:hAnsiTheme="minorHAnsi" w:cstheme="minorHAnsi"/>
+          <w:sz w:val="26"/>
+          <w:szCs w:val="26"/>
+          <w:lang w:val="en-GB"/>
+        </w:rPr>
+        <w:t>, OpenIDConnect, MiniOrange SSO</w:t>
       </w:r>
       <w:r>
         <w:rPr>
@@ -13202,7 +11523,6 @@
           <w:lang w:val="en-GB"/>
         </w:rPr>
       </w:pPr>
-      <w:proofErr w:type="spellStart"/>
       <w:r>
         <w:rPr>
           <w:b/>
@@ -13213,7 +11533,6 @@
         </w:rPr>
         <w:t>Mediotype’s</w:t>
       </w:r>
-      <w:proofErr w:type="spellEnd"/>
       <w:r>
         <w:rPr>
           <w:b/>
@@ -13460,27 +11779,7 @@
           <w:szCs w:val="26"/>
           <w:lang w:val="en-GB"/>
         </w:rPr>
-        <w:t xml:space="preserve">OOP, PHP, HTML, CSS3, SASS, Compass, </w:t>
-      </w:r>
-      <w:proofErr w:type="spellStart"/>
-      <w:r>
-        <w:rPr>
-          <w:rFonts w:asciiTheme="minorHAnsi" w:hAnsiTheme="minorHAnsi" w:cstheme="minorHAnsi"/>
-          <w:sz w:val="26"/>
-          <w:szCs w:val="26"/>
-          <w:lang w:val="en-GB"/>
-        </w:rPr>
-        <w:t>Javascript</w:t>
-      </w:r>
-      <w:proofErr w:type="spellEnd"/>
-      <w:r>
-        <w:rPr>
-          <w:rFonts w:asciiTheme="minorHAnsi" w:hAnsiTheme="minorHAnsi" w:cstheme="minorHAnsi"/>
-          <w:sz w:val="26"/>
-          <w:szCs w:val="26"/>
-          <w:lang w:val="en-GB"/>
-        </w:rPr>
-        <w:t>, Prototype, Magento EE, Composer, MySQL, Scrum.</w:t>
+        <w:t>OOP, PHP, HTML, CSS3, SASS, Compass, Javascript, Prototype, Magento EE, Composer, MySQL, Scrum.</w:t>
       </w:r>
     </w:p>
     <w:p>
@@ -13663,27 +11962,7 @@
           <w:szCs w:val="26"/>
           <w:lang w:val="en-GB"/>
         </w:rPr>
-        <w:t xml:space="preserve">I've developed a complex Middleware implementation </w:t>
-      </w:r>
-      <w:proofErr w:type="gramStart"/>
-      <w:r>
-        <w:rPr>
-          <w:rFonts w:asciiTheme="minorHAnsi" w:hAnsiTheme="minorHAnsi" w:cstheme="minorHAnsi"/>
-          <w:sz w:val="26"/>
-          <w:szCs w:val="26"/>
-          <w:lang w:val="en-GB"/>
-        </w:rPr>
-        <w:t>in order to</w:t>
-      </w:r>
-      <w:proofErr w:type="gramEnd"/>
-      <w:r>
-        <w:rPr>
-          <w:rFonts w:asciiTheme="minorHAnsi" w:hAnsiTheme="minorHAnsi" w:cstheme="minorHAnsi"/>
-          <w:sz w:val="26"/>
-          <w:szCs w:val="26"/>
-          <w:lang w:val="en-GB"/>
-        </w:rPr>
-        <w:t xml:space="preserve"> connect AWS SQS with Magento Order Management JSON RPC 2.0</w:t>
+        <w:t>I've developed a complex Middleware implementation in order to connect AWS SQS with Magento Order Management JSON RPC 2.0</w:t>
       </w:r>
     </w:p>
     <w:p>
@@ -13708,27 +11987,7 @@
           <w:szCs w:val="26"/>
           <w:lang w:val="en-GB"/>
         </w:rPr>
-        <w:t xml:space="preserve">I've used Composer </w:t>
-      </w:r>
-      <w:proofErr w:type="gramStart"/>
-      <w:r>
-        <w:rPr>
-          <w:rFonts w:asciiTheme="minorHAnsi" w:hAnsiTheme="minorHAnsi" w:cstheme="minorHAnsi"/>
-          <w:sz w:val="26"/>
-          <w:szCs w:val="26"/>
-          <w:lang w:val="en-GB"/>
-        </w:rPr>
-        <w:t>in order to</w:t>
-      </w:r>
-      <w:proofErr w:type="gramEnd"/>
-      <w:r>
-        <w:rPr>
-          <w:rFonts w:asciiTheme="minorHAnsi" w:hAnsiTheme="minorHAnsi" w:cstheme="minorHAnsi"/>
-          <w:sz w:val="26"/>
-          <w:szCs w:val="26"/>
-          <w:lang w:val="en-GB"/>
-        </w:rPr>
-        <w:t xml:space="preserve"> modularize the project.</w:t>
+        <w:t>I've used Composer in order to modularize the project.</w:t>
       </w:r>
     </w:p>
     <w:p>
@@ -13759,27 +12018,7 @@
           <w:szCs w:val="26"/>
           <w:lang w:val="en-GB"/>
         </w:rPr>
-        <w:t xml:space="preserve">OOP, PHP, HTML, CSS3, SASS, Compass, </w:t>
-      </w:r>
-      <w:proofErr w:type="spellStart"/>
-      <w:r>
-        <w:rPr>
-          <w:rFonts w:asciiTheme="minorHAnsi" w:hAnsiTheme="minorHAnsi" w:cstheme="minorHAnsi"/>
-          <w:sz w:val="26"/>
-          <w:szCs w:val="26"/>
-          <w:lang w:val="en-GB"/>
-        </w:rPr>
-        <w:t>Javascript</w:t>
-      </w:r>
-      <w:proofErr w:type="spellEnd"/>
-      <w:r>
-        <w:rPr>
-          <w:rFonts w:asciiTheme="minorHAnsi" w:hAnsiTheme="minorHAnsi" w:cstheme="minorHAnsi"/>
-          <w:sz w:val="26"/>
-          <w:szCs w:val="26"/>
-          <w:lang w:val="en-GB"/>
-        </w:rPr>
-        <w:t>, Prototype, Magento EE, Composer, MySQL, Scrum.</w:t>
+        <w:t>OOP, PHP, HTML, CSS3, SASS, Compass, Javascript, Prototype, Magento EE, Composer, MySQL, Scrum.</w:t>
       </w:r>
     </w:p>
     <w:p>
@@ -13981,27 +12220,7 @@
           <w:szCs w:val="26"/>
           <w:lang w:val="en-GB"/>
         </w:rPr>
-        <w:t xml:space="preserve">I've used Composer </w:t>
-      </w:r>
-      <w:proofErr w:type="gramStart"/>
-      <w:r>
-        <w:rPr>
-          <w:rFonts w:asciiTheme="minorHAnsi" w:hAnsiTheme="minorHAnsi" w:cstheme="minorHAnsi"/>
-          <w:sz w:val="26"/>
-          <w:szCs w:val="26"/>
-          <w:lang w:val="en-GB"/>
-        </w:rPr>
-        <w:t>in order to</w:t>
-      </w:r>
-      <w:proofErr w:type="gramEnd"/>
-      <w:r>
-        <w:rPr>
-          <w:rFonts w:asciiTheme="minorHAnsi" w:hAnsiTheme="minorHAnsi" w:cstheme="minorHAnsi"/>
-          <w:sz w:val="26"/>
-          <w:szCs w:val="26"/>
-          <w:lang w:val="en-GB"/>
-        </w:rPr>
-        <w:t xml:space="preserve"> modularize the project.</w:t>
+        <w:t>I've used Composer in order to modularize the project.</w:t>
       </w:r>
     </w:p>
     <w:p>
@@ -14032,27 +12251,7 @@
           <w:szCs w:val="26"/>
           <w:lang w:val="en-GB"/>
         </w:rPr>
-        <w:t xml:space="preserve">OOP, PHP, HTML, CSS3, SASS, Compass, </w:t>
-      </w:r>
-      <w:proofErr w:type="spellStart"/>
-      <w:r>
-        <w:rPr>
-          <w:rFonts w:asciiTheme="minorHAnsi" w:hAnsiTheme="minorHAnsi" w:cstheme="minorHAnsi"/>
-          <w:sz w:val="26"/>
-          <w:szCs w:val="26"/>
-          <w:lang w:val="en-GB"/>
-        </w:rPr>
-        <w:t>Javascript</w:t>
-      </w:r>
-      <w:proofErr w:type="spellEnd"/>
-      <w:r>
-        <w:rPr>
-          <w:rFonts w:asciiTheme="minorHAnsi" w:hAnsiTheme="minorHAnsi" w:cstheme="minorHAnsi"/>
-          <w:sz w:val="26"/>
-          <w:szCs w:val="26"/>
-          <w:lang w:val="en-GB"/>
-        </w:rPr>
-        <w:t>, Prototype, Magento EE, Composer, MySQL, Scrum.</w:t>
+        <w:t>OOP, PHP, HTML, CSS3, SASS, Compass, Javascript, Prototype, Magento EE, Composer, MySQL, Scrum.</w:t>
       </w:r>
     </w:p>
     <w:p>
@@ -14254,27 +12453,7 @@
           <w:szCs w:val="26"/>
           <w:lang w:val="en-GB"/>
         </w:rPr>
-        <w:t xml:space="preserve">I've used Composer </w:t>
-      </w:r>
-      <w:proofErr w:type="gramStart"/>
-      <w:r>
-        <w:rPr>
-          <w:rFonts w:asciiTheme="minorHAnsi" w:hAnsiTheme="minorHAnsi" w:cstheme="minorHAnsi"/>
-          <w:sz w:val="26"/>
-          <w:szCs w:val="26"/>
-          <w:lang w:val="en-GB"/>
-        </w:rPr>
-        <w:t>in order to</w:t>
-      </w:r>
-      <w:proofErr w:type="gramEnd"/>
-      <w:r>
-        <w:rPr>
-          <w:rFonts w:asciiTheme="minorHAnsi" w:hAnsiTheme="minorHAnsi" w:cstheme="minorHAnsi"/>
-          <w:sz w:val="26"/>
-          <w:szCs w:val="26"/>
-          <w:lang w:val="en-GB"/>
-        </w:rPr>
-        <w:t xml:space="preserve"> modularize the project.</w:t>
+        <w:t>I've used Composer in order to modularize the project.</w:t>
       </w:r>
     </w:p>
     <w:p>
@@ -14306,27 +12485,7 @@
           <w:szCs w:val="26"/>
           <w:lang w:val="en-GB"/>
         </w:rPr>
-        <w:t xml:space="preserve">OOP, PHP, HTML, CSS3, SASS, Compass, </w:t>
-      </w:r>
-      <w:proofErr w:type="spellStart"/>
-      <w:r>
-        <w:rPr>
-          <w:rFonts w:asciiTheme="minorHAnsi" w:hAnsiTheme="minorHAnsi" w:cstheme="minorHAnsi"/>
-          <w:sz w:val="26"/>
-          <w:szCs w:val="26"/>
-          <w:lang w:val="en-GB"/>
-        </w:rPr>
-        <w:t>Javascript</w:t>
-      </w:r>
-      <w:proofErr w:type="spellEnd"/>
-      <w:r>
-        <w:rPr>
-          <w:rFonts w:asciiTheme="minorHAnsi" w:hAnsiTheme="minorHAnsi" w:cstheme="minorHAnsi"/>
-          <w:sz w:val="26"/>
-          <w:szCs w:val="26"/>
-          <w:lang w:val="en-GB"/>
-        </w:rPr>
-        <w:t>, Prototype, Magento EE, Composer, MySQL, Scrum.</w:t>
+        <w:t>OOP, PHP, HTML, CSS3, SASS, Compass, Javascript, Prototype, Magento EE, Composer, MySQL, Scrum.</w:t>
       </w:r>
     </w:p>
     <w:p>
@@ -14528,27 +12687,7 @@
           <w:szCs w:val="26"/>
           <w:lang w:val="en-GB"/>
         </w:rPr>
-        <w:t xml:space="preserve">Develop two external API integrations based on a </w:t>
-      </w:r>
-      <w:proofErr w:type="gramStart"/>
-      <w:r>
-        <w:rPr>
-          <w:rFonts w:asciiTheme="minorHAnsi" w:hAnsiTheme="minorHAnsi" w:cstheme="minorHAnsi"/>
-          <w:sz w:val="26"/>
-          <w:szCs w:val="26"/>
-          <w:lang w:val="en-GB"/>
-        </w:rPr>
-        <w:t>provided swagger API docs</w:t>
-      </w:r>
-      <w:proofErr w:type="gramEnd"/>
-      <w:r>
-        <w:rPr>
-          <w:rFonts w:asciiTheme="minorHAnsi" w:hAnsiTheme="minorHAnsi" w:cstheme="minorHAnsi"/>
-          <w:sz w:val="26"/>
-          <w:szCs w:val="26"/>
-          <w:lang w:val="en-GB"/>
-        </w:rPr>
-        <w:t>.</w:t>
+        <w:t>Develop two external API integrations based on a provided swagger API docs.</w:t>
       </w:r>
     </w:p>
     <w:p>
@@ -14573,27 +12712,7 @@
           <w:szCs w:val="26"/>
           <w:lang w:val="en-GB"/>
         </w:rPr>
-        <w:t xml:space="preserve">I've developed a new product type named Subscription which was based on Bundle Product type but contains a big </w:t>
-      </w:r>
-      <w:proofErr w:type="gramStart"/>
-      <w:r>
-        <w:rPr>
-          <w:rFonts w:asciiTheme="minorHAnsi" w:hAnsiTheme="minorHAnsi" w:cstheme="minorHAnsi"/>
-          <w:sz w:val="26"/>
-          <w:szCs w:val="26"/>
-          <w:lang w:val="en-GB"/>
-        </w:rPr>
-        <w:t>amount</w:t>
-      </w:r>
-      <w:proofErr w:type="gramEnd"/>
-      <w:r>
-        <w:rPr>
-          <w:rFonts w:asciiTheme="minorHAnsi" w:hAnsiTheme="minorHAnsi" w:cstheme="minorHAnsi"/>
-          <w:sz w:val="26"/>
-          <w:szCs w:val="26"/>
-          <w:lang w:val="en-GB"/>
-        </w:rPr>
-        <w:t xml:space="preserve"> of customizations.</w:t>
+        <w:t>I've developed a new product type named Subscription which was based on Bundle Product type but contains a big amount of customizations.</w:t>
       </w:r>
     </w:p>
     <w:p>
@@ -14618,27 +12737,7 @@
           <w:szCs w:val="26"/>
           <w:lang w:val="en-GB"/>
         </w:rPr>
-        <w:t xml:space="preserve">I've used Composer </w:t>
-      </w:r>
-      <w:proofErr w:type="gramStart"/>
-      <w:r>
-        <w:rPr>
-          <w:rFonts w:asciiTheme="minorHAnsi" w:hAnsiTheme="minorHAnsi" w:cstheme="minorHAnsi"/>
-          <w:sz w:val="26"/>
-          <w:szCs w:val="26"/>
-          <w:lang w:val="en-GB"/>
-        </w:rPr>
-        <w:t>in order to</w:t>
-      </w:r>
-      <w:proofErr w:type="gramEnd"/>
-      <w:r>
-        <w:rPr>
-          <w:rFonts w:asciiTheme="minorHAnsi" w:hAnsiTheme="minorHAnsi" w:cstheme="minorHAnsi"/>
-          <w:sz w:val="26"/>
-          <w:szCs w:val="26"/>
-          <w:lang w:val="en-GB"/>
-        </w:rPr>
-        <w:t xml:space="preserve"> modularize the project.</w:t>
+        <w:t>I've used Composer in order to modularize the project.</w:t>
       </w:r>
     </w:p>
     <w:p>
@@ -14669,27 +12768,7 @@
           <w:szCs w:val="26"/>
           <w:lang w:val="en-GB"/>
         </w:rPr>
-        <w:t xml:space="preserve">OOP, PHP, HTML, CSS3, SASS, Compass, </w:t>
-      </w:r>
-      <w:proofErr w:type="spellStart"/>
-      <w:r>
-        <w:rPr>
-          <w:rFonts w:asciiTheme="minorHAnsi" w:hAnsiTheme="minorHAnsi" w:cstheme="minorHAnsi"/>
-          <w:sz w:val="26"/>
-          <w:szCs w:val="26"/>
-          <w:lang w:val="en-GB"/>
-        </w:rPr>
-        <w:t>Javascript</w:t>
-      </w:r>
-      <w:proofErr w:type="spellEnd"/>
-      <w:r>
-        <w:rPr>
-          <w:rFonts w:asciiTheme="minorHAnsi" w:hAnsiTheme="minorHAnsi" w:cstheme="minorHAnsi"/>
-          <w:sz w:val="26"/>
-          <w:szCs w:val="26"/>
-          <w:lang w:val="en-GB"/>
-        </w:rPr>
-        <w:t>, Prototype, Magento EE, Composer, MySQL, Scrum.</w:t>
+        <w:t>OOP, PHP, HTML, CSS3, SASS, Compass, Javascript, Prototype, Magento EE, Composer, MySQL, Scrum.</w:t>
       </w:r>
     </w:p>
     <w:p>
@@ -14722,7 +12801,6 @@
           <w:lang w:val="en-GB"/>
         </w:rPr>
       </w:pPr>
-      <w:proofErr w:type="spellStart"/>
       <w:r>
         <w:rPr>
           <w:b/>
@@ -14731,18 +12809,7 @@
           <w:szCs w:val="30"/>
           <w:lang w:val="en-GB"/>
         </w:rPr>
-        <w:t>Im</w:t>
-      </w:r>
-      <w:proofErr w:type="spellEnd"/>
-      <w:r>
-        <w:rPr>
-          <w:b/>
-          <w:bCs/>
-          <w:sz w:val="30"/>
-          <w:szCs w:val="30"/>
-          <w:lang w:val="en-GB"/>
-        </w:rPr>
-        <w:t xml:space="preserve"> Digital</w:t>
+        <w:t>Im Digital</w:t>
       </w:r>
       <w:r>
         <w:rPr>
@@ -14980,27 +13047,7 @@
           <w:szCs w:val="26"/>
           <w:lang w:val="en-GB"/>
         </w:rPr>
-        <w:t xml:space="preserve">I've used Composer </w:t>
-      </w:r>
-      <w:proofErr w:type="gramStart"/>
-      <w:r>
-        <w:rPr>
-          <w:rFonts w:asciiTheme="minorHAnsi" w:hAnsiTheme="minorHAnsi" w:cstheme="minorHAnsi"/>
-          <w:sz w:val="26"/>
-          <w:szCs w:val="26"/>
-          <w:lang w:val="en-GB"/>
-        </w:rPr>
-        <w:t>in order to</w:t>
-      </w:r>
-      <w:proofErr w:type="gramEnd"/>
-      <w:r>
-        <w:rPr>
-          <w:rFonts w:asciiTheme="minorHAnsi" w:hAnsiTheme="minorHAnsi" w:cstheme="minorHAnsi"/>
-          <w:sz w:val="26"/>
-          <w:szCs w:val="26"/>
-          <w:lang w:val="en-GB"/>
-        </w:rPr>
-        <w:t xml:space="preserve"> modularize the project.</w:t>
+        <w:t>I've used Composer in order to modularize the project.</w:t>
       </w:r>
     </w:p>
     <w:p>
@@ -15031,27 +13078,7 @@
           <w:szCs w:val="26"/>
           <w:lang w:val="en-GB"/>
         </w:rPr>
-        <w:t xml:space="preserve">OOP, PHP, HTML, CSS3, SASS, Compass, </w:t>
-      </w:r>
-      <w:proofErr w:type="spellStart"/>
-      <w:r>
-        <w:rPr>
-          <w:rFonts w:asciiTheme="minorHAnsi" w:hAnsiTheme="minorHAnsi" w:cstheme="minorHAnsi"/>
-          <w:sz w:val="26"/>
-          <w:szCs w:val="26"/>
-          <w:lang w:val="en-GB"/>
-        </w:rPr>
-        <w:t>Javascript</w:t>
-      </w:r>
-      <w:proofErr w:type="spellEnd"/>
-      <w:r>
-        <w:rPr>
-          <w:rFonts w:asciiTheme="minorHAnsi" w:hAnsiTheme="minorHAnsi" w:cstheme="minorHAnsi"/>
-          <w:sz w:val="26"/>
-          <w:szCs w:val="26"/>
-          <w:lang w:val="en-GB"/>
-        </w:rPr>
-        <w:t>, Prototype, Magento EE, Composer, MySQL, Scrum.</w:t>
+        <w:t>OOP, PHP, HTML, CSS3, SASS, Compass, Javascript, Prototype, Magento EE, Composer, MySQL, Scrum.</w:t>
       </w:r>
     </w:p>
     <w:p>
@@ -15324,27 +13351,7 @@
           <w:szCs w:val="26"/>
           <w:lang w:val="en-GB"/>
         </w:rPr>
-        <w:t xml:space="preserve">I've used Composer </w:t>
-      </w:r>
-      <w:proofErr w:type="gramStart"/>
-      <w:r>
-        <w:rPr>
-          <w:rFonts w:asciiTheme="minorHAnsi" w:hAnsiTheme="minorHAnsi" w:cstheme="minorHAnsi"/>
-          <w:sz w:val="26"/>
-          <w:szCs w:val="26"/>
-          <w:lang w:val="en-GB"/>
-        </w:rPr>
-        <w:t>in order to</w:t>
-      </w:r>
-      <w:proofErr w:type="gramEnd"/>
-      <w:r>
-        <w:rPr>
-          <w:rFonts w:asciiTheme="minorHAnsi" w:hAnsiTheme="minorHAnsi" w:cstheme="minorHAnsi"/>
-          <w:sz w:val="26"/>
-          <w:szCs w:val="26"/>
-          <w:lang w:val="en-GB"/>
-        </w:rPr>
-        <w:t xml:space="preserve"> modularize the project.</w:t>
+        <w:t>I've used Composer in order to modularize the project.</w:t>
       </w:r>
     </w:p>
     <w:p>
@@ -15375,27 +13382,7 @@
           <w:szCs w:val="26"/>
           <w:lang w:val="en-GB"/>
         </w:rPr>
-        <w:t xml:space="preserve">OOP, PHP, HTML, CSS3, SASS, Compass, </w:t>
-      </w:r>
-      <w:proofErr w:type="spellStart"/>
-      <w:r>
-        <w:rPr>
-          <w:rFonts w:asciiTheme="minorHAnsi" w:hAnsiTheme="minorHAnsi" w:cstheme="minorHAnsi"/>
-          <w:sz w:val="26"/>
-          <w:szCs w:val="26"/>
-          <w:lang w:val="en-GB"/>
-        </w:rPr>
-        <w:t>Javascript</w:t>
-      </w:r>
-      <w:proofErr w:type="spellEnd"/>
-      <w:r>
-        <w:rPr>
-          <w:rFonts w:asciiTheme="minorHAnsi" w:hAnsiTheme="minorHAnsi" w:cstheme="minorHAnsi"/>
-          <w:sz w:val="26"/>
-          <w:szCs w:val="26"/>
-          <w:lang w:val="en-GB"/>
-        </w:rPr>
-        <w:t>, Prototype, Magento EE, Composer, MySQL, Scrum.</w:t>
+        <w:t>OOP, PHP, HTML, CSS3, SASS, Compass, Javascript, Prototype, Magento EE, Composer, MySQL, Scrum.</w:t>
       </w:r>
     </w:p>
     <w:p>
@@ -15429,7 +13416,6 @@
           <w:lang w:val="en-GB"/>
         </w:rPr>
       </w:pPr>
-      <w:proofErr w:type="spellStart"/>
       <w:r>
         <w:rPr>
           <w:rFonts w:asciiTheme="minorHAnsi" w:hAnsiTheme="minorHAnsi" w:cstheme="minorHAnsi"/>
@@ -15440,7 +13426,6 @@
         </w:rPr>
         <w:t>Baublebar</w:t>
       </w:r>
-      <w:proofErr w:type="spellEnd"/>
       <w:r>
         <w:rPr>
           <w:rFonts w:asciiTheme="minorHAnsi" w:hAnsiTheme="minorHAnsi" w:cstheme="minorHAnsi"/>
@@ -15503,7 +13488,6 @@
           <w:lang w:val="en-GB"/>
         </w:rPr>
       </w:pPr>
-      <w:proofErr w:type="spellStart"/>
       <w:r>
         <w:rPr>
           <w:rFonts w:asciiTheme="minorHAnsi" w:hAnsiTheme="minorHAnsi" w:cstheme="minorHAnsi"/>
@@ -15514,7 +13498,6 @@
         </w:rPr>
         <w:t>Baublebar</w:t>
       </w:r>
-      <w:proofErr w:type="spellEnd"/>
       <w:r>
         <w:rPr>
           <w:rFonts w:asciiTheme="minorHAnsi" w:hAnsiTheme="minorHAnsi" w:cstheme="minorHAnsi"/>
@@ -15639,27 +13622,7 @@
           <w:szCs w:val="26"/>
           <w:lang w:val="en-GB"/>
         </w:rPr>
-        <w:t xml:space="preserve">I've used Composer </w:t>
-      </w:r>
-      <w:proofErr w:type="gramStart"/>
-      <w:r>
-        <w:rPr>
-          <w:rFonts w:asciiTheme="minorHAnsi" w:hAnsiTheme="minorHAnsi" w:cstheme="minorHAnsi"/>
-          <w:sz w:val="26"/>
-          <w:szCs w:val="26"/>
-          <w:lang w:val="en-GB"/>
-        </w:rPr>
-        <w:t>in order to</w:t>
-      </w:r>
-      <w:proofErr w:type="gramEnd"/>
-      <w:r>
-        <w:rPr>
-          <w:rFonts w:asciiTheme="minorHAnsi" w:hAnsiTheme="minorHAnsi" w:cstheme="minorHAnsi"/>
-          <w:sz w:val="26"/>
-          <w:szCs w:val="26"/>
-          <w:lang w:val="en-GB"/>
-        </w:rPr>
-        <w:t xml:space="preserve"> modularize the project.</w:t>
+        <w:t>I've used Composer in order to modularize the project.</w:t>
       </w:r>
     </w:p>
     <w:p>
@@ -15690,27 +13653,7 @@
           <w:szCs w:val="26"/>
           <w:lang w:val="en-GB"/>
         </w:rPr>
-        <w:t xml:space="preserve">OOP, PHP, HTML, CSS3, SASS, Compass, </w:t>
-      </w:r>
-      <w:proofErr w:type="spellStart"/>
-      <w:r>
-        <w:rPr>
-          <w:rFonts w:asciiTheme="minorHAnsi" w:hAnsiTheme="minorHAnsi" w:cstheme="minorHAnsi"/>
-          <w:sz w:val="26"/>
-          <w:szCs w:val="26"/>
-          <w:lang w:val="en-GB"/>
-        </w:rPr>
-        <w:t>Javascript</w:t>
-      </w:r>
-      <w:proofErr w:type="spellEnd"/>
-      <w:r>
-        <w:rPr>
-          <w:rFonts w:asciiTheme="minorHAnsi" w:hAnsiTheme="minorHAnsi" w:cstheme="minorHAnsi"/>
-          <w:sz w:val="26"/>
-          <w:szCs w:val="26"/>
-          <w:lang w:val="en-GB"/>
-        </w:rPr>
-        <w:t>, Prototype, Magento EE, Composer, MySQL, Scrum.</w:t>
+        <w:t>OOP, PHP, HTML, CSS3, SASS, Compass, Javascript, Prototype, Magento EE, Composer, MySQL, Scrum.</w:t>
       </w:r>
     </w:p>
     <w:p>
@@ -15960,27 +13903,7 @@
           <w:szCs w:val="26"/>
           <w:lang w:val="en-GB"/>
         </w:rPr>
-        <w:t xml:space="preserve">I've used Composer </w:t>
-      </w:r>
-      <w:proofErr w:type="gramStart"/>
-      <w:r>
-        <w:rPr>
-          <w:rFonts w:asciiTheme="minorHAnsi" w:hAnsiTheme="minorHAnsi" w:cstheme="minorHAnsi"/>
-          <w:sz w:val="26"/>
-          <w:szCs w:val="26"/>
-          <w:lang w:val="en-GB"/>
-        </w:rPr>
-        <w:t>in order to</w:t>
-      </w:r>
-      <w:proofErr w:type="gramEnd"/>
-      <w:r>
-        <w:rPr>
-          <w:rFonts w:asciiTheme="minorHAnsi" w:hAnsiTheme="minorHAnsi" w:cstheme="minorHAnsi"/>
-          <w:sz w:val="26"/>
-          <w:szCs w:val="26"/>
-          <w:lang w:val="en-GB"/>
-        </w:rPr>
-        <w:t xml:space="preserve"> modularize the project.</w:t>
+        <w:t>I've used Composer in order to modularize the project.</w:t>
       </w:r>
     </w:p>
     <w:p>
@@ -16011,27 +13934,7 @@
           <w:szCs w:val="26"/>
           <w:lang w:val="en-GB"/>
         </w:rPr>
-        <w:t xml:space="preserve">OOP, PHP, HTML, CSS3, SASS, Compass, </w:t>
-      </w:r>
-      <w:proofErr w:type="spellStart"/>
-      <w:r>
-        <w:rPr>
-          <w:rFonts w:asciiTheme="minorHAnsi" w:hAnsiTheme="minorHAnsi" w:cstheme="minorHAnsi"/>
-          <w:sz w:val="26"/>
-          <w:szCs w:val="26"/>
-          <w:lang w:val="en-GB"/>
-        </w:rPr>
-        <w:t>Javascript</w:t>
-      </w:r>
-      <w:proofErr w:type="spellEnd"/>
-      <w:r>
-        <w:rPr>
-          <w:rFonts w:asciiTheme="minorHAnsi" w:hAnsiTheme="minorHAnsi" w:cstheme="minorHAnsi"/>
-          <w:sz w:val="26"/>
-          <w:szCs w:val="26"/>
-          <w:lang w:val="en-GB"/>
-        </w:rPr>
-        <w:t>, Prototype, Magento EE, Composer, MySQL, Scrum.</w:t>
+        <w:t>OOP, PHP, HTML, CSS3, SASS, Compass, Javascript, Prototype, Magento EE, Composer, MySQL, Scrum.</w:t>
       </w:r>
     </w:p>
     <w:p>
@@ -16122,7 +14025,17 @@
           <w:szCs w:val="26"/>
           <w:lang w:val="en-GB"/>
         </w:rPr>
-        <w:t>2021 - 2024</w:t>
+        <w:t xml:space="preserve">2021 - </w:t>
+      </w:r>
+      <w:r>
+        <w:rPr>
+          <w:rFonts w:asciiTheme="minorHAnsi" w:hAnsiTheme="minorHAnsi" w:cstheme="minorHAnsi"/>
+          <w:b/>
+          <w:sz w:val="28"/>
+          <w:szCs w:val="26"/>
+          <w:lang w:val="en-GB"/>
+        </w:rPr>
+        <w:t>Currently</w:t>
       </w:r>
     </w:p>
     <w:p>
@@ -16290,27 +14203,7 @@
           <w:szCs w:val="26"/>
           <w:lang w:val="en-GB"/>
         </w:rPr>
-        <w:t xml:space="preserve">I've used Composer </w:t>
-      </w:r>
-      <w:proofErr w:type="gramStart"/>
-      <w:r>
-        <w:rPr>
-          <w:rFonts w:asciiTheme="minorHAnsi" w:hAnsiTheme="minorHAnsi" w:cstheme="minorHAnsi"/>
-          <w:sz w:val="26"/>
-          <w:szCs w:val="26"/>
-          <w:lang w:val="en-GB"/>
-        </w:rPr>
-        <w:t>in order to</w:t>
-      </w:r>
-      <w:proofErr w:type="gramEnd"/>
-      <w:r>
-        <w:rPr>
-          <w:rFonts w:asciiTheme="minorHAnsi" w:hAnsiTheme="minorHAnsi" w:cstheme="minorHAnsi"/>
-          <w:sz w:val="26"/>
-          <w:szCs w:val="26"/>
-          <w:lang w:val="en-GB"/>
-        </w:rPr>
-        <w:t xml:space="preserve"> modularize the project.</w:t>
+        <w:t>I've used Composer in order to modularize the project.</w:t>
       </w:r>
     </w:p>
     <w:p>
@@ -16341,27 +14234,7 @@
           <w:szCs w:val="26"/>
           <w:lang w:val="en-GB"/>
         </w:rPr>
-        <w:t xml:space="preserve">OOP, PHP, HTML, CSS3, SASS, Compass, </w:t>
-      </w:r>
-      <w:proofErr w:type="spellStart"/>
-      <w:r>
-        <w:rPr>
-          <w:rFonts w:asciiTheme="minorHAnsi" w:hAnsiTheme="minorHAnsi" w:cstheme="minorHAnsi"/>
-          <w:sz w:val="26"/>
-          <w:szCs w:val="26"/>
-          <w:lang w:val="en-GB"/>
-        </w:rPr>
-        <w:t>Javascript</w:t>
-      </w:r>
-      <w:proofErr w:type="spellEnd"/>
-      <w:r>
-        <w:rPr>
-          <w:rFonts w:asciiTheme="minorHAnsi" w:hAnsiTheme="minorHAnsi" w:cstheme="minorHAnsi"/>
-          <w:sz w:val="26"/>
-          <w:szCs w:val="26"/>
-          <w:lang w:val="en-GB"/>
-        </w:rPr>
-        <w:t>, Prototype, Magento EE, Composer, MySQL, Scrum</w:t>
+        <w:t>OOP, PHP, HTML, CSS3, SASS, Compass, Javascript, Prototype, Magento EE, Composer, MySQL, Scrum</w:t>
       </w:r>
       <w:r>
         <w:rPr>
@@ -16372,25 +14245,14 @@
         </w:rPr>
         <w:t xml:space="preserve">, </w:t>
       </w:r>
-      <w:proofErr w:type="spellStart"/>
-      <w:r>
-        <w:rPr>
-          <w:rFonts w:asciiTheme="minorHAnsi" w:hAnsiTheme="minorHAnsi" w:cstheme="minorHAnsi"/>
-          <w:sz w:val="26"/>
-          <w:szCs w:val="26"/>
-          <w:lang w:val="en-GB"/>
-        </w:rPr>
-        <w:t>Hyva</w:t>
-      </w:r>
-      <w:proofErr w:type="spellEnd"/>
-      <w:r>
-        <w:rPr>
-          <w:rFonts w:asciiTheme="minorHAnsi" w:hAnsiTheme="minorHAnsi" w:cstheme="minorHAnsi"/>
-          <w:sz w:val="26"/>
-          <w:szCs w:val="26"/>
-          <w:lang w:val="en-GB"/>
-        </w:rPr>
-        <w:t xml:space="preserve"> Themes, React, PHP Unit</w:t>
+      <w:r>
+        <w:rPr>
+          <w:rFonts w:asciiTheme="minorHAnsi" w:hAnsiTheme="minorHAnsi" w:cstheme="minorHAnsi"/>
+          <w:sz w:val="26"/>
+          <w:szCs w:val="26"/>
+          <w:lang w:val="en-GB"/>
+        </w:rPr>
+        <w:t>Hyva Themes, React, PHP Unit</w:t>
       </w:r>
       <w:r>
         <w:rPr>
@@ -16510,7 +14372,17 @@
           <w:szCs w:val="26"/>
           <w:lang w:val="en-GB"/>
         </w:rPr>
-        <w:t>2021 - 2024</w:t>
+        <w:t xml:space="preserve">2021 - </w:t>
+      </w:r>
+      <w:r>
+        <w:rPr>
+          <w:rFonts w:asciiTheme="minorHAnsi" w:hAnsiTheme="minorHAnsi" w:cstheme="minorHAnsi"/>
+          <w:b/>
+          <w:sz w:val="28"/>
+          <w:szCs w:val="26"/>
+          <w:lang w:val="en-GB"/>
+        </w:rPr>
+        <w:t>Currently</w:t>
       </w:r>
     </w:p>
     <w:p>
@@ -16678,27 +14550,7 @@
           <w:szCs w:val="26"/>
           <w:lang w:val="en-GB"/>
         </w:rPr>
-        <w:t xml:space="preserve">I've used Composer </w:t>
-      </w:r>
-      <w:proofErr w:type="gramStart"/>
-      <w:r>
-        <w:rPr>
-          <w:rFonts w:asciiTheme="minorHAnsi" w:hAnsiTheme="minorHAnsi" w:cstheme="minorHAnsi"/>
-          <w:sz w:val="26"/>
-          <w:szCs w:val="26"/>
-          <w:lang w:val="en-GB"/>
-        </w:rPr>
-        <w:t>in order to</w:t>
-      </w:r>
-      <w:proofErr w:type="gramEnd"/>
-      <w:r>
-        <w:rPr>
-          <w:rFonts w:asciiTheme="minorHAnsi" w:hAnsiTheme="minorHAnsi" w:cstheme="minorHAnsi"/>
-          <w:sz w:val="26"/>
-          <w:szCs w:val="26"/>
-          <w:lang w:val="en-GB"/>
-        </w:rPr>
-        <w:t xml:space="preserve"> modularize the project.</w:t>
+        <w:t>I've used Composer in order to modularize the project.</w:t>
       </w:r>
       <w:r>
         <w:rPr>
@@ -16729,27 +14581,7 @@
           <w:szCs w:val="26"/>
           <w:lang w:val="en-GB"/>
         </w:rPr>
-        <w:t xml:space="preserve">I've </w:t>
-      </w:r>
-      <w:proofErr w:type="gramStart"/>
-      <w:r>
-        <w:rPr>
-          <w:rFonts w:asciiTheme="minorHAnsi" w:hAnsiTheme="minorHAnsi" w:cstheme="minorHAnsi"/>
-          <w:sz w:val="26"/>
-          <w:szCs w:val="26"/>
-          <w:lang w:val="en-GB"/>
-        </w:rPr>
-        <w:t>been in charge of</w:t>
-      </w:r>
-      <w:proofErr w:type="gramEnd"/>
-      <w:r>
-        <w:rPr>
-          <w:rFonts w:asciiTheme="minorHAnsi" w:hAnsiTheme="minorHAnsi" w:cstheme="minorHAnsi"/>
-          <w:sz w:val="26"/>
-          <w:szCs w:val="26"/>
-          <w:lang w:val="en-GB"/>
-        </w:rPr>
-        <w:t xml:space="preserve"> migration from Magento 1.9 to Magento 2.4.</w:t>
+        <w:t>I've been in charge of migration from Magento 1.9 to Magento 2.4.</w:t>
       </w:r>
     </w:p>
     <w:p>
@@ -16780,27 +14612,7 @@
           <w:szCs w:val="26"/>
           <w:lang w:val="en-GB"/>
         </w:rPr>
-        <w:t xml:space="preserve">OOP, PHP, HTML, CSS3, SASS, Compass, </w:t>
-      </w:r>
-      <w:proofErr w:type="spellStart"/>
-      <w:r>
-        <w:rPr>
-          <w:rFonts w:asciiTheme="minorHAnsi" w:hAnsiTheme="minorHAnsi" w:cstheme="minorHAnsi"/>
-          <w:sz w:val="26"/>
-          <w:szCs w:val="26"/>
-          <w:lang w:val="en-GB"/>
-        </w:rPr>
-        <w:t>Javascript</w:t>
-      </w:r>
-      <w:proofErr w:type="spellEnd"/>
-      <w:r>
-        <w:rPr>
-          <w:rFonts w:asciiTheme="minorHAnsi" w:hAnsiTheme="minorHAnsi" w:cstheme="minorHAnsi"/>
-          <w:sz w:val="26"/>
-          <w:szCs w:val="26"/>
-          <w:lang w:val="en-GB"/>
-        </w:rPr>
-        <w:t>, Prototype, Magento EE, Composer, MySQL, Scrum</w:t>
+        <w:t>OOP, PHP, HTML, CSS3, SASS, Compass, Javascript, Prototype, Magento EE, Composer, MySQL, Scrum</w:t>
       </w:r>
       <w:r>
         <w:rPr>
@@ -16811,25 +14623,14 @@
         </w:rPr>
         <w:t xml:space="preserve">, </w:t>
       </w:r>
-      <w:proofErr w:type="spellStart"/>
-      <w:r>
-        <w:rPr>
-          <w:rFonts w:asciiTheme="minorHAnsi" w:hAnsiTheme="minorHAnsi" w:cstheme="minorHAnsi"/>
-          <w:sz w:val="26"/>
-          <w:szCs w:val="26"/>
-          <w:lang w:val="en-GB"/>
-        </w:rPr>
-        <w:t>Hyva</w:t>
-      </w:r>
-      <w:proofErr w:type="spellEnd"/>
-      <w:r>
-        <w:rPr>
-          <w:rFonts w:asciiTheme="minorHAnsi" w:hAnsiTheme="minorHAnsi" w:cstheme="minorHAnsi"/>
-          <w:sz w:val="26"/>
-          <w:szCs w:val="26"/>
-          <w:lang w:val="en-GB"/>
-        </w:rPr>
-        <w:t xml:space="preserve"> Themes, React, PHP Unit</w:t>
+      <w:r>
+        <w:rPr>
+          <w:rFonts w:asciiTheme="minorHAnsi" w:hAnsiTheme="minorHAnsi" w:cstheme="minorHAnsi"/>
+          <w:sz w:val="26"/>
+          <w:szCs w:val="26"/>
+          <w:lang w:val="en-GB"/>
+        </w:rPr>
+        <w:t>Hyva Themes, React, PHP Unit</w:t>
       </w:r>
       <w:r>
         <w:rPr>
@@ -16842,12 +14643,12 @@
       </w:r>
     </w:p>
     <w:sectPr>
-      <w:headerReference w:type="even" r:id="rId9"/>
-      <w:headerReference w:type="default" r:id="rId10"/>
-      <w:footerReference w:type="even" r:id="rId11"/>
-      <w:footerReference w:type="default" r:id="rId12"/>
-      <w:headerReference w:type="first" r:id="rId13"/>
-      <w:footerReference w:type="first" r:id="rId14"/>
+      <w:headerReference w:type="even" r:id="rId18"/>
+      <w:headerReference w:type="default" r:id="rId19"/>
+      <w:footerReference w:type="even" r:id="rId20"/>
+      <w:footerReference w:type="default" r:id="rId21"/>
+      <w:headerReference w:type="first" r:id="rId22"/>
+      <w:footerReference w:type="first" r:id="rId23"/>
       <w:pgSz w:w="12240" w:h="15840"/>
       <w:pgMar w:top="1134" w:right="1183" w:bottom="851" w:left="1276" w:header="708" w:footer="170" w:gutter="0"/>
       <w:cols w:space="708"/>
@@ -16858,7 +14659,7 @@
 </file>
 
 <file path=word/endnotes.xml><?xml version="1.0" encoding="utf-8"?>
-<w:endnotes xmlns:wpc="http://schemas.microsoft.com/office/word/2010/wordprocessingCanvas" xmlns:cx="http://schemas.microsoft.com/office/drawing/2014/chartex" xmlns:cx1="http://schemas.microsoft.com/office/drawing/2015/9/8/chartex" xmlns:cx2="http://schemas.microsoft.com/office/drawing/2015/10/21/chartex" xmlns:cx3="http://schemas.microsoft.com/office/drawing/2016/5/9/chartex" xmlns:cx4="http://schemas.microsoft.com/office/drawing/2016/5/10/chartex" xmlns:cx5="http://schemas.microsoft.com/office/drawing/2016/5/11/chartex" xmlns:cx6="http://schemas.microsoft.com/office/drawing/2016/5/12/chartex" xmlns:cx7="http://schemas.microsoft.com/office/drawing/2016/5/13/chartex" xmlns:cx8="http://schemas.microsoft.com/office/drawing/2016/5/14/chartex" xmlns:mc="http://schemas.openxmlformats.org/markup-compatibility/2006" xmlns:aink="http://schemas.microsoft.com/office/drawing/2016/ink" xmlns:am3d="http://schemas.microsoft.com/office/drawing/2017/model3d" xmlns:o="urn:schemas-microsoft-com:office:office" xmlns:oel="http://schemas.microsoft.com/office/2019/extlst" xmlns:r="http://schemas.openxmlformats.org/officeDocument/2006/relationships" xmlns:m="http://schemas.openxmlformats.org/officeDocument/2006/math" xmlns:v="urn:schemas-microsoft-com:vml" xmlns:wp14="http://schemas.microsoft.com/office/word/2010/wordprocessingDrawing" xmlns:wp="http://schemas.openxmlformats.org/drawingml/2006/wordprocessingDrawing" xmlns:w10="urn:schemas-microsoft-com:office:word" xmlns:w="http://schemas.openxmlformats.org/wordprocessingml/2006/main" xmlns:w14="http://schemas.microsoft.com/office/word/2010/wordml" xmlns:w15="http://schemas.microsoft.com/office/word/2012/wordml" xmlns:w16cex="http://schemas.microsoft.com/office/word/2018/wordml/cex" xmlns:w16cid="http://schemas.microsoft.com/office/word/2016/wordml/cid" xmlns:w16="http://schemas.microsoft.com/office/word/2018/wordml" xmlns:w16du="http://schemas.microsoft.com/office/word/2023/wordml/word16du" xmlns:w16sdtdh="http://schemas.microsoft.com/office/word/2020/wordml/sdtdatahash" xmlns:w16se="http://schemas.microsoft.com/office/word/2015/wordml/symex" xmlns:wpg="http://schemas.microsoft.com/office/word/2010/wordprocessingGroup" xmlns:wpi="http://schemas.microsoft.com/office/word/2010/wordprocessingInk" xmlns:wne="http://schemas.microsoft.com/office/word/2006/wordml" xmlns:wps="http://schemas.microsoft.com/office/word/2010/wordprocessingShape" mc:Ignorable="w14 w15 w16se w16cid w16 w16cex w16sdtdh w16du wp14">
+<w:endnotes xmlns:wpc="http://schemas.microsoft.com/office/word/2010/wordprocessingCanvas" xmlns:cx="http://schemas.microsoft.com/office/drawing/2014/chartex" xmlns:cx1="http://schemas.microsoft.com/office/drawing/2015/9/8/chartex" xmlns:cx2="http://schemas.microsoft.com/office/drawing/2015/10/21/chartex" xmlns:cx3="http://schemas.microsoft.com/office/drawing/2016/5/9/chartex" xmlns:cx4="http://schemas.microsoft.com/office/drawing/2016/5/10/chartex" xmlns:cx5="http://schemas.microsoft.com/office/drawing/2016/5/11/chartex" xmlns:cx6="http://schemas.microsoft.com/office/drawing/2016/5/12/chartex" xmlns:cx7="http://schemas.microsoft.com/office/drawing/2016/5/13/chartex" xmlns:cx8="http://schemas.microsoft.com/office/drawing/2016/5/14/chartex" xmlns:mc="http://schemas.openxmlformats.org/markup-compatibility/2006" xmlns:aink="http://schemas.microsoft.com/office/drawing/2016/ink" xmlns:am3d="http://schemas.microsoft.com/office/drawing/2017/model3d" xmlns:o="urn:schemas-microsoft-com:office:office" xmlns:oel="http://schemas.microsoft.com/office/2019/extlst" xmlns:r="http://schemas.openxmlformats.org/officeDocument/2006/relationships" xmlns:m="http://schemas.openxmlformats.org/officeDocument/2006/math" xmlns:v="urn:schemas-microsoft-com:vml" xmlns:wp14="http://schemas.microsoft.com/office/word/2010/wordprocessingDrawing" xmlns:wp="http://schemas.openxmlformats.org/drawingml/2006/wordprocessingDrawing" xmlns:w10="urn:schemas-microsoft-com:office:word" xmlns:w="http://schemas.openxmlformats.org/wordprocessingml/2006/main" xmlns:w14="http://schemas.microsoft.com/office/word/2010/wordml" xmlns:w15="http://schemas.microsoft.com/office/word/2012/wordml" xmlns:w16cex="http://schemas.microsoft.com/office/word/2018/wordml/cex" xmlns:w16cid="http://schemas.microsoft.com/office/word/2016/wordml/cid" xmlns:w16="http://schemas.microsoft.com/office/word/2018/wordml" xmlns:w16du="http://schemas.microsoft.com/office/word/2023/wordml/word16du" xmlns:w16sdtdh="http://schemas.microsoft.com/office/word/2020/wordml/sdtdatahash" xmlns:w16sdtfl="http://schemas.microsoft.com/office/word/2024/wordml/sdtformatlock" xmlns:w16se="http://schemas.microsoft.com/office/word/2015/wordml/symex" xmlns:wpg="http://schemas.microsoft.com/office/word/2010/wordprocessingGroup" xmlns:wpi="http://schemas.microsoft.com/office/word/2010/wordprocessingInk" xmlns:wne="http://schemas.microsoft.com/office/word/2006/wordml" xmlns:wps="http://schemas.microsoft.com/office/word/2010/wordprocessingShape" mc:Ignorable="w14 w15 w16se w16cid w16 w16cex w16sdtdh w16sdtfl w16du wp14">
   <w:endnote w:type="separator" w:id="-1">
     <w:p>
       <w:pPr>
@@ -16883,7 +14684,7 @@
 </file>
 
 <file path=word/footer1.xml><?xml version="1.0" encoding="utf-8"?>
-<w:ftr xmlns:wpc="http://schemas.microsoft.com/office/word/2010/wordprocessingCanvas" xmlns:cx="http://schemas.microsoft.com/office/drawing/2014/chartex" xmlns:cx1="http://schemas.microsoft.com/office/drawing/2015/9/8/chartex" xmlns:cx2="http://schemas.microsoft.com/office/drawing/2015/10/21/chartex" xmlns:cx3="http://schemas.microsoft.com/office/drawing/2016/5/9/chartex" xmlns:cx4="http://schemas.microsoft.com/office/drawing/2016/5/10/chartex" xmlns:cx5="http://schemas.microsoft.com/office/drawing/2016/5/11/chartex" xmlns:cx6="http://schemas.microsoft.com/office/drawing/2016/5/12/chartex" xmlns:cx7="http://schemas.microsoft.com/office/drawing/2016/5/13/chartex" xmlns:cx8="http://schemas.microsoft.com/office/drawing/2016/5/14/chartex" xmlns:mc="http://schemas.openxmlformats.org/markup-compatibility/2006" xmlns:aink="http://schemas.microsoft.com/office/drawing/2016/ink" xmlns:am3d="http://schemas.microsoft.com/office/drawing/2017/model3d" xmlns:o="urn:schemas-microsoft-com:office:office" xmlns:oel="http://schemas.microsoft.com/office/2019/extlst" xmlns:r="http://schemas.openxmlformats.org/officeDocument/2006/relationships" xmlns:m="http://schemas.openxmlformats.org/officeDocument/2006/math" xmlns:v="urn:schemas-microsoft-com:vml" xmlns:wp14="http://schemas.microsoft.com/office/word/2010/wordprocessingDrawing" xmlns:wp="http://schemas.openxmlformats.org/drawingml/2006/wordprocessingDrawing" xmlns:w10="urn:schemas-microsoft-com:office:word" xmlns:w="http://schemas.openxmlformats.org/wordprocessingml/2006/main" xmlns:w14="http://schemas.microsoft.com/office/word/2010/wordml" xmlns:w15="http://schemas.microsoft.com/office/word/2012/wordml" xmlns:w16cex="http://schemas.microsoft.com/office/word/2018/wordml/cex" xmlns:w16cid="http://schemas.microsoft.com/office/word/2016/wordml/cid" xmlns:w16="http://schemas.microsoft.com/office/word/2018/wordml" xmlns:w16du="http://schemas.microsoft.com/office/word/2023/wordml/word16du" xmlns:w16sdtdh="http://schemas.microsoft.com/office/word/2020/wordml/sdtdatahash" xmlns:w16se="http://schemas.microsoft.com/office/word/2015/wordml/symex" xmlns:wpg="http://schemas.microsoft.com/office/word/2010/wordprocessingGroup" xmlns:wpi="http://schemas.microsoft.com/office/word/2010/wordprocessingInk" xmlns:wne="http://schemas.microsoft.com/office/word/2006/wordml" xmlns:wps="http://schemas.microsoft.com/office/word/2010/wordprocessingShape" mc:Ignorable="w14 w15 w16se w16cid w16 w16cex w16sdtdh w16du wp14">
+<w:ftr xmlns:wpc="http://schemas.microsoft.com/office/word/2010/wordprocessingCanvas" xmlns:cx="http://schemas.microsoft.com/office/drawing/2014/chartex" xmlns:cx1="http://schemas.microsoft.com/office/drawing/2015/9/8/chartex" xmlns:cx2="http://schemas.microsoft.com/office/drawing/2015/10/21/chartex" xmlns:cx3="http://schemas.microsoft.com/office/drawing/2016/5/9/chartex" xmlns:cx4="http://schemas.microsoft.com/office/drawing/2016/5/10/chartex" xmlns:cx5="http://schemas.microsoft.com/office/drawing/2016/5/11/chartex" xmlns:cx6="http://schemas.microsoft.com/office/drawing/2016/5/12/chartex" xmlns:cx7="http://schemas.microsoft.com/office/drawing/2016/5/13/chartex" xmlns:cx8="http://schemas.microsoft.com/office/drawing/2016/5/14/chartex" xmlns:mc="http://schemas.openxmlformats.org/markup-compatibility/2006" xmlns:aink="http://schemas.microsoft.com/office/drawing/2016/ink" xmlns:am3d="http://schemas.microsoft.com/office/drawing/2017/model3d" xmlns:o="urn:schemas-microsoft-com:office:office" xmlns:oel="http://schemas.microsoft.com/office/2019/extlst" xmlns:r="http://schemas.openxmlformats.org/officeDocument/2006/relationships" xmlns:m="http://schemas.openxmlformats.org/officeDocument/2006/math" xmlns:v="urn:schemas-microsoft-com:vml" xmlns:wp14="http://schemas.microsoft.com/office/word/2010/wordprocessingDrawing" xmlns:wp="http://schemas.openxmlformats.org/drawingml/2006/wordprocessingDrawing" xmlns:w10="urn:schemas-microsoft-com:office:word" xmlns:w="http://schemas.openxmlformats.org/wordprocessingml/2006/main" xmlns:w14="http://schemas.microsoft.com/office/word/2010/wordml" xmlns:w15="http://schemas.microsoft.com/office/word/2012/wordml" xmlns:w16cex="http://schemas.microsoft.com/office/word/2018/wordml/cex" xmlns:w16cid="http://schemas.microsoft.com/office/word/2016/wordml/cid" xmlns:w16="http://schemas.microsoft.com/office/word/2018/wordml" xmlns:w16du="http://schemas.microsoft.com/office/word/2023/wordml/word16du" xmlns:w16sdtdh="http://schemas.microsoft.com/office/word/2020/wordml/sdtdatahash" xmlns:w16sdtfl="http://schemas.microsoft.com/office/word/2024/wordml/sdtformatlock" xmlns:w16se="http://schemas.microsoft.com/office/word/2015/wordml/symex" xmlns:wpg="http://schemas.microsoft.com/office/word/2010/wordprocessingGroup" xmlns:wpi="http://schemas.microsoft.com/office/word/2010/wordprocessingInk" xmlns:wne="http://schemas.microsoft.com/office/word/2006/wordml" xmlns:wps="http://schemas.microsoft.com/office/word/2010/wordprocessingShape" mc:Ignorable="w14 w15 w16se w16cid w16 w16cex w16sdtdh w16sdtfl w16du wp14">
   <w:p>
     <w:pPr>
       <w:pStyle w:val="Piedepgina"/>
@@ -16893,7 +14694,7 @@
 </file>
 
 <file path=word/footer2.xml><?xml version="1.0" encoding="utf-8"?>
-<w:ftr xmlns:wpc="http://schemas.microsoft.com/office/word/2010/wordprocessingCanvas" xmlns:cx="http://schemas.microsoft.com/office/drawing/2014/chartex" xmlns:cx1="http://schemas.microsoft.com/office/drawing/2015/9/8/chartex" xmlns:cx2="http://schemas.microsoft.com/office/drawing/2015/10/21/chartex" xmlns:cx3="http://schemas.microsoft.com/office/drawing/2016/5/9/chartex" xmlns:cx4="http://schemas.microsoft.com/office/drawing/2016/5/10/chartex" xmlns:cx5="http://schemas.microsoft.com/office/drawing/2016/5/11/chartex" xmlns:cx6="http://schemas.microsoft.com/office/drawing/2016/5/12/chartex" xmlns:cx7="http://schemas.microsoft.com/office/drawing/2016/5/13/chartex" xmlns:cx8="http://schemas.microsoft.com/office/drawing/2016/5/14/chartex" xmlns:mc="http://schemas.openxmlformats.org/markup-compatibility/2006" xmlns:aink="http://schemas.microsoft.com/office/drawing/2016/ink" xmlns:am3d="http://schemas.microsoft.com/office/drawing/2017/model3d" xmlns:o="urn:schemas-microsoft-com:office:office" xmlns:oel="http://schemas.microsoft.com/office/2019/extlst" xmlns:r="http://schemas.openxmlformats.org/officeDocument/2006/relationships" xmlns:m="http://schemas.openxmlformats.org/officeDocument/2006/math" xmlns:v="urn:schemas-microsoft-com:vml" xmlns:wp14="http://schemas.microsoft.com/office/word/2010/wordprocessingDrawing" xmlns:wp="http://schemas.openxmlformats.org/drawingml/2006/wordprocessingDrawing" xmlns:w10="urn:schemas-microsoft-com:office:word" xmlns:w="http://schemas.openxmlformats.org/wordprocessingml/2006/main" xmlns:w14="http://schemas.microsoft.com/office/word/2010/wordml" xmlns:w15="http://schemas.microsoft.com/office/word/2012/wordml" xmlns:w16cex="http://schemas.microsoft.com/office/word/2018/wordml/cex" xmlns:w16cid="http://schemas.microsoft.com/office/word/2016/wordml/cid" xmlns:w16="http://schemas.microsoft.com/office/word/2018/wordml" xmlns:w16du="http://schemas.microsoft.com/office/word/2023/wordml/word16du" xmlns:w16sdtdh="http://schemas.microsoft.com/office/word/2020/wordml/sdtdatahash" xmlns:w16se="http://schemas.microsoft.com/office/word/2015/wordml/symex" xmlns:wpg="http://schemas.microsoft.com/office/word/2010/wordprocessingGroup" xmlns:wpi="http://schemas.microsoft.com/office/word/2010/wordprocessingInk" xmlns:wne="http://schemas.microsoft.com/office/word/2006/wordml" xmlns:wps="http://schemas.microsoft.com/office/word/2010/wordprocessingShape" mc:Ignorable="w14 w15 w16se w16cid w16 w16cex w16sdtdh w16du wp14">
+<w:ftr xmlns:wpc="http://schemas.microsoft.com/office/word/2010/wordprocessingCanvas" xmlns:cx="http://schemas.microsoft.com/office/drawing/2014/chartex" xmlns:cx1="http://schemas.microsoft.com/office/drawing/2015/9/8/chartex" xmlns:cx2="http://schemas.microsoft.com/office/drawing/2015/10/21/chartex" xmlns:cx3="http://schemas.microsoft.com/office/drawing/2016/5/9/chartex" xmlns:cx4="http://schemas.microsoft.com/office/drawing/2016/5/10/chartex" xmlns:cx5="http://schemas.microsoft.com/office/drawing/2016/5/11/chartex" xmlns:cx6="http://schemas.microsoft.com/office/drawing/2016/5/12/chartex" xmlns:cx7="http://schemas.microsoft.com/office/drawing/2016/5/13/chartex" xmlns:cx8="http://schemas.microsoft.com/office/drawing/2016/5/14/chartex" xmlns:mc="http://schemas.openxmlformats.org/markup-compatibility/2006" xmlns:aink="http://schemas.microsoft.com/office/drawing/2016/ink" xmlns:am3d="http://schemas.microsoft.com/office/drawing/2017/model3d" xmlns:o="urn:schemas-microsoft-com:office:office" xmlns:oel="http://schemas.microsoft.com/office/2019/extlst" xmlns:r="http://schemas.openxmlformats.org/officeDocument/2006/relationships" xmlns:m="http://schemas.openxmlformats.org/officeDocument/2006/math" xmlns:v="urn:schemas-microsoft-com:vml" xmlns:wp14="http://schemas.microsoft.com/office/word/2010/wordprocessingDrawing" xmlns:wp="http://schemas.openxmlformats.org/drawingml/2006/wordprocessingDrawing" xmlns:w10="urn:schemas-microsoft-com:office:word" xmlns:w="http://schemas.openxmlformats.org/wordprocessingml/2006/main" xmlns:w14="http://schemas.microsoft.com/office/word/2010/wordml" xmlns:w15="http://schemas.microsoft.com/office/word/2012/wordml" xmlns:w16cex="http://schemas.microsoft.com/office/word/2018/wordml/cex" xmlns:w16cid="http://schemas.microsoft.com/office/word/2016/wordml/cid" xmlns:w16="http://schemas.microsoft.com/office/word/2018/wordml" xmlns:w16du="http://schemas.microsoft.com/office/word/2023/wordml/word16du" xmlns:w16sdtdh="http://schemas.microsoft.com/office/word/2020/wordml/sdtdatahash" xmlns:w16sdtfl="http://schemas.microsoft.com/office/word/2024/wordml/sdtformatlock" xmlns:w16se="http://schemas.microsoft.com/office/word/2015/wordml/symex" xmlns:wpg="http://schemas.microsoft.com/office/word/2010/wordprocessingGroup" xmlns:wpi="http://schemas.microsoft.com/office/word/2010/wordprocessingInk" xmlns:wne="http://schemas.microsoft.com/office/word/2006/wordml" xmlns:wps="http://schemas.microsoft.com/office/word/2010/wordprocessingShape" mc:Ignorable="w14 w15 w16se w16cid w16 w16cex w16sdtdh w16sdtfl w16du wp14">
   <w:p>
     <w:pPr>
       <w:pStyle w:val="Piedepgina"/>
@@ -17255,7 +15056,7 @@
 </file>
 
 <file path=word/footer3.xml><?xml version="1.0" encoding="utf-8"?>
-<w:ftr xmlns:wpc="http://schemas.microsoft.com/office/word/2010/wordprocessingCanvas" xmlns:cx="http://schemas.microsoft.com/office/drawing/2014/chartex" xmlns:cx1="http://schemas.microsoft.com/office/drawing/2015/9/8/chartex" xmlns:cx2="http://schemas.microsoft.com/office/drawing/2015/10/21/chartex" xmlns:cx3="http://schemas.microsoft.com/office/drawing/2016/5/9/chartex" xmlns:cx4="http://schemas.microsoft.com/office/drawing/2016/5/10/chartex" xmlns:cx5="http://schemas.microsoft.com/office/drawing/2016/5/11/chartex" xmlns:cx6="http://schemas.microsoft.com/office/drawing/2016/5/12/chartex" xmlns:cx7="http://schemas.microsoft.com/office/drawing/2016/5/13/chartex" xmlns:cx8="http://schemas.microsoft.com/office/drawing/2016/5/14/chartex" xmlns:mc="http://schemas.openxmlformats.org/markup-compatibility/2006" xmlns:aink="http://schemas.microsoft.com/office/drawing/2016/ink" xmlns:am3d="http://schemas.microsoft.com/office/drawing/2017/model3d" xmlns:o="urn:schemas-microsoft-com:office:office" xmlns:oel="http://schemas.microsoft.com/office/2019/extlst" xmlns:r="http://schemas.openxmlformats.org/officeDocument/2006/relationships" xmlns:m="http://schemas.openxmlformats.org/officeDocument/2006/math" xmlns:v="urn:schemas-microsoft-com:vml" xmlns:wp14="http://schemas.microsoft.com/office/word/2010/wordprocessingDrawing" xmlns:wp="http://schemas.openxmlformats.org/drawingml/2006/wordprocessingDrawing" xmlns:w10="urn:schemas-microsoft-com:office:word" xmlns:w="http://schemas.openxmlformats.org/wordprocessingml/2006/main" xmlns:w14="http://schemas.microsoft.com/office/word/2010/wordml" xmlns:w15="http://schemas.microsoft.com/office/word/2012/wordml" xmlns:w16cex="http://schemas.microsoft.com/office/word/2018/wordml/cex" xmlns:w16cid="http://schemas.microsoft.com/office/word/2016/wordml/cid" xmlns:w16="http://schemas.microsoft.com/office/word/2018/wordml" xmlns:w16du="http://schemas.microsoft.com/office/word/2023/wordml/word16du" xmlns:w16sdtdh="http://schemas.microsoft.com/office/word/2020/wordml/sdtdatahash" xmlns:w16se="http://schemas.microsoft.com/office/word/2015/wordml/symex" xmlns:wpg="http://schemas.microsoft.com/office/word/2010/wordprocessingGroup" xmlns:wpi="http://schemas.microsoft.com/office/word/2010/wordprocessingInk" xmlns:wne="http://schemas.microsoft.com/office/word/2006/wordml" xmlns:wps="http://schemas.microsoft.com/office/word/2010/wordprocessingShape" mc:Ignorable="w14 w15 w16se w16cid w16 w16cex w16sdtdh w16du wp14">
+<w:ftr xmlns:wpc="http://schemas.microsoft.com/office/word/2010/wordprocessingCanvas" xmlns:cx="http://schemas.microsoft.com/office/drawing/2014/chartex" xmlns:cx1="http://schemas.microsoft.com/office/drawing/2015/9/8/chartex" xmlns:cx2="http://schemas.microsoft.com/office/drawing/2015/10/21/chartex" xmlns:cx3="http://schemas.microsoft.com/office/drawing/2016/5/9/chartex" xmlns:cx4="http://schemas.microsoft.com/office/drawing/2016/5/10/chartex" xmlns:cx5="http://schemas.microsoft.com/office/drawing/2016/5/11/chartex" xmlns:cx6="http://schemas.microsoft.com/office/drawing/2016/5/12/chartex" xmlns:cx7="http://schemas.microsoft.com/office/drawing/2016/5/13/chartex" xmlns:cx8="http://schemas.microsoft.com/office/drawing/2016/5/14/chartex" xmlns:mc="http://schemas.openxmlformats.org/markup-compatibility/2006" xmlns:aink="http://schemas.microsoft.com/office/drawing/2016/ink" xmlns:am3d="http://schemas.microsoft.com/office/drawing/2017/model3d" xmlns:o="urn:schemas-microsoft-com:office:office" xmlns:oel="http://schemas.microsoft.com/office/2019/extlst" xmlns:r="http://schemas.openxmlformats.org/officeDocument/2006/relationships" xmlns:m="http://schemas.openxmlformats.org/officeDocument/2006/math" xmlns:v="urn:schemas-microsoft-com:vml" xmlns:wp14="http://schemas.microsoft.com/office/word/2010/wordprocessingDrawing" xmlns:wp="http://schemas.openxmlformats.org/drawingml/2006/wordprocessingDrawing" xmlns:w10="urn:schemas-microsoft-com:office:word" xmlns:w="http://schemas.openxmlformats.org/wordprocessingml/2006/main" xmlns:w14="http://schemas.microsoft.com/office/word/2010/wordml" xmlns:w15="http://schemas.microsoft.com/office/word/2012/wordml" xmlns:w16cex="http://schemas.microsoft.com/office/word/2018/wordml/cex" xmlns:w16cid="http://schemas.microsoft.com/office/word/2016/wordml/cid" xmlns:w16="http://schemas.microsoft.com/office/word/2018/wordml" xmlns:w16du="http://schemas.microsoft.com/office/word/2023/wordml/word16du" xmlns:w16sdtdh="http://schemas.microsoft.com/office/word/2020/wordml/sdtdatahash" xmlns:w16sdtfl="http://schemas.microsoft.com/office/word/2024/wordml/sdtformatlock" xmlns:w16se="http://schemas.microsoft.com/office/word/2015/wordml/symex" xmlns:wpg="http://schemas.microsoft.com/office/word/2010/wordprocessingGroup" xmlns:wpi="http://schemas.microsoft.com/office/word/2010/wordprocessingInk" xmlns:wne="http://schemas.microsoft.com/office/word/2006/wordml" xmlns:wps="http://schemas.microsoft.com/office/word/2010/wordprocessingShape" mc:Ignorable="w14 w15 w16se w16cid w16 w16cex w16sdtdh w16sdtfl w16du wp14">
   <w:p>
     <w:pPr>
       <w:pStyle w:val="Piedepgina"/>
@@ -17265,7 +15066,7 @@
 </file>
 
 <file path=word/footnotes.xml><?xml version="1.0" encoding="utf-8"?>
-<w:footnotes xmlns:wpc="http://schemas.microsoft.com/office/word/2010/wordprocessingCanvas" xmlns:cx="http://schemas.microsoft.com/office/drawing/2014/chartex" xmlns:cx1="http://schemas.microsoft.com/office/drawing/2015/9/8/chartex" xmlns:cx2="http://schemas.microsoft.com/office/drawing/2015/10/21/chartex" xmlns:cx3="http://schemas.microsoft.com/office/drawing/2016/5/9/chartex" xmlns:cx4="http://schemas.microsoft.com/office/drawing/2016/5/10/chartex" xmlns:cx5="http://schemas.microsoft.com/office/drawing/2016/5/11/chartex" xmlns:cx6="http://schemas.microsoft.com/office/drawing/2016/5/12/chartex" xmlns:cx7="http://schemas.microsoft.com/office/drawing/2016/5/13/chartex" xmlns:cx8="http://schemas.microsoft.com/office/drawing/2016/5/14/chartex" xmlns:mc="http://schemas.openxmlformats.org/markup-compatibility/2006" xmlns:aink="http://schemas.microsoft.com/office/drawing/2016/ink" xmlns:am3d="http://schemas.microsoft.com/office/drawing/2017/model3d" xmlns:o="urn:schemas-microsoft-com:office:office" xmlns:oel="http://schemas.microsoft.com/office/2019/extlst" xmlns:r="http://schemas.openxmlformats.org/officeDocument/2006/relationships" xmlns:m="http://schemas.openxmlformats.org/officeDocument/2006/math" xmlns:v="urn:schemas-microsoft-com:vml" xmlns:wp14="http://schemas.microsoft.com/office/word/2010/wordprocessingDrawing" xmlns:wp="http://schemas.openxmlformats.org/drawingml/2006/wordprocessingDrawing" xmlns:w10="urn:schemas-microsoft-com:office:word" xmlns:w="http://schemas.openxmlformats.org/wordprocessingml/2006/main" xmlns:w14="http://schemas.microsoft.com/office/word/2010/wordml" xmlns:w15="http://schemas.microsoft.com/office/word/2012/wordml" xmlns:w16cex="http://schemas.microsoft.com/office/word/2018/wordml/cex" xmlns:w16cid="http://schemas.microsoft.com/office/word/2016/wordml/cid" xmlns:w16="http://schemas.microsoft.com/office/word/2018/wordml" xmlns:w16du="http://schemas.microsoft.com/office/word/2023/wordml/word16du" xmlns:w16sdtdh="http://schemas.microsoft.com/office/word/2020/wordml/sdtdatahash" xmlns:w16se="http://schemas.microsoft.com/office/word/2015/wordml/symex" xmlns:wpg="http://schemas.microsoft.com/office/word/2010/wordprocessingGroup" xmlns:wpi="http://schemas.microsoft.com/office/word/2010/wordprocessingInk" xmlns:wne="http://schemas.microsoft.com/office/word/2006/wordml" xmlns:wps="http://schemas.microsoft.com/office/word/2010/wordprocessingShape" mc:Ignorable="w14 w15 w16se w16cid w16 w16cex w16sdtdh w16du wp14">
+<w:footnotes xmlns:wpc="http://schemas.microsoft.com/office/word/2010/wordprocessingCanvas" xmlns:cx="http://schemas.microsoft.com/office/drawing/2014/chartex" xmlns:cx1="http://schemas.microsoft.com/office/drawing/2015/9/8/chartex" xmlns:cx2="http://schemas.microsoft.com/office/drawing/2015/10/21/chartex" xmlns:cx3="http://schemas.microsoft.com/office/drawing/2016/5/9/chartex" xmlns:cx4="http://schemas.microsoft.com/office/drawing/2016/5/10/chartex" xmlns:cx5="http://schemas.microsoft.com/office/drawing/2016/5/11/chartex" xmlns:cx6="http://schemas.microsoft.com/office/drawing/2016/5/12/chartex" xmlns:cx7="http://schemas.microsoft.com/office/drawing/2016/5/13/chartex" xmlns:cx8="http://schemas.microsoft.com/office/drawing/2016/5/14/chartex" xmlns:mc="http://schemas.openxmlformats.org/markup-compatibility/2006" xmlns:aink="http://schemas.microsoft.com/office/drawing/2016/ink" xmlns:am3d="http://schemas.microsoft.com/office/drawing/2017/model3d" xmlns:o="urn:schemas-microsoft-com:office:office" xmlns:oel="http://schemas.microsoft.com/office/2019/extlst" xmlns:r="http://schemas.openxmlformats.org/officeDocument/2006/relationships" xmlns:m="http://schemas.openxmlformats.org/officeDocument/2006/math" xmlns:v="urn:schemas-microsoft-com:vml" xmlns:wp14="http://schemas.microsoft.com/office/word/2010/wordprocessingDrawing" xmlns:wp="http://schemas.openxmlformats.org/drawingml/2006/wordprocessingDrawing" xmlns:w10="urn:schemas-microsoft-com:office:word" xmlns:w="http://schemas.openxmlformats.org/wordprocessingml/2006/main" xmlns:w14="http://schemas.microsoft.com/office/word/2010/wordml" xmlns:w15="http://schemas.microsoft.com/office/word/2012/wordml" xmlns:w16cex="http://schemas.microsoft.com/office/word/2018/wordml/cex" xmlns:w16cid="http://schemas.microsoft.com/office/word/2016/wordml/cid" xmlns:w16="http://schemas.microsoft.com/office/word/2018/wordml" xmlns:w16du="http://schemas.microsoft.com/office/word/2023/wordml/word16du" xmlns:w16sdtdh="http://schemas.microsoft.com/office/word/2020/wordml/sdtdatahash" xmlns:w16sdtfl="http://schemas.microsoft.com/office/word/2024/wordml/sdtformatlock" xmlns:w16se="http://schemas.microsoft.com/office/word/2015/wordml/symex" xmlns:wpg="http://schemas.microsoft.com/office/word/2010/wordprocessingGroup" xmlns:wpi="http://schemas.microsoft.com/office/word/2010/wordprocessingInk" xmlns:wne="http://schemas.microsoft.com/office/word/2006/wordml" xmlns:wps="http://schemas.microsoft.com/office/word/2010/wordprocessingShape" mc:Ignorable="w14 w15 w16se w16cid w16 w16cex w16sdtdh w16sdtfl w16du wp14">
   <w:footnote w:type="separator" w:id="-1">
     <w:p>
       <w:pPr>
@@ -17290,7 +15091,7 @@
 </file>
 
 <file path=word/header1.xml><?xml version="1.0" encoding="utf-8"?>
-<w:hdr xmlns:wpc="http://schemas.microsoft.com/office/word/2010/wordprocessingCanvas" xmlns:cx="http://schemas.microsoft.com/office/drawing/2014/chartex" xmlns:cx1="http://schemas.microsoft.com/office/drawing/2015/9/8/chartex" xmlns:cx2="http://schemas.microsoft.com/office/drawing/2015/10/21/chartex" xmlns:cx3="http://schemas.microsoft.com/office/drawing/2016/5/9/chartex" xmlns:cx4="http://schemas.microsoft.com/office/drawing/2016/5/10/chartex" xmlns:cx5="http://schemas.microsoft.com/office/drawing/2016/5/11/chartex" xmlns:cx6="http://schemas.microsoft.com/office/drawing/2016/5/12/chartex" xmlns:cx7="http://schemas.microsoft.com/office/drawing/2016/5/13/chartex" xmlns:cx8="http://schemas.microsoft.com/office/drawing/2016/5/14/chartex" xmlns:mc="http://schemas.openxmlformats.org/markup-compatibility/2006" xmlns:aink="http://schemas.microsoft.com/office/drawing/2016/ink" xmlns:am3d="http://schemas.microsoft.com/office/drawing/2017/model3d" xmlns:o="urn:schemas-microsoft-com:office:office" xmlns:oel="http://schemas.microsoft.com/office/2019/extlst" xmlns:r="http://schemas.openxmlformats.org/officeDocument/2006/relationships" xmlns:m="http://schemas.openxmlformats.org/officeDocument/2006/math" xmlns:v="urn:schemas-microsoft-com:vml" xmlns:wp14="http://schemas.microsoft.com/office/word/2010/wordprocessingDrawing" xmlns:wp="http://schemas.openxmlformats.org/drawingml/2006/wordprocessingDrawing" xmlns:w10="urn:schemas-microsoft-com:office:word" xmlns:w="http://schemas.openxmlformats.org/wordprocessingml/2006/main" xmlns:w14="http://schemas.microsoft.com/office/word/2010/wordml" xmlns:w15="http://schemas.microsoft.com/office/word/2012/wordml" xmlns:w16cex="http://schemas.microsoft.com/office/word/2018/wordml/cex" xmlns:w16cid="http://schemas.microsoft.com/office/word/2016/wordml/cid" xmlns:w16="http://schemas.microsoft.com/office/word/2018/wordml" xmlns:w16du="http://schemas.microsoft.com/office/word/2023/wordml/word16du" xmlns:w16sdtdh="http://schemas.microsoft.com/office/word/2020/wordml/sdtdatahash" xmlns:w16se="http://schemas.microsoft.com/office/word/2015/wordml/symex" xmlns:wpg="http://schemas.microsoft.com/office/word/2010/wordprocessingGroup" xmlns:wpi="http://schemas.microsoft.com/office/word/2010/wordprocessingInk" xmlns:wne="http://schemas.microsoft.com/office/word/2006/wordml" xmlns:wps="http://schemas.microsoft.com/office/word/2010/wordprocessingShape" mc:Ignorable="w14 w15 w16se w16cid w16 w16cex w16sdtdh w16du wp14">
+<w:hdr xmlns:wpc="http://schemas.microsoft.com/office/word/2010/wordprocessingCanvas" xmlns:cx="http://schemas.microsoft.com/office/drawing/2014/chartex" xmlns:cx1="http://schemas.microsoft.com/office/drawing/2015/9/8/chartex" xmlns:cx2="http://schemas.microsoft.com/office/drawing/2015/10/21/chartex" xmlns:cx3="http://schemas.microsoft.com/office/drawing/2016/5/9/chartex" xmlns:cx4="http://schemas.microsoft.com/office/drawing/2016/5/10/chartex" xmlns:cx5="http://schemas.microsoft.com/office/drawing/2016/5/11/chartex" xmlns:cx6="http://schemas.microsoft.com/office/drawing/2016/5/12/chartex" xmlns:cx7="http://schemas.microsoft.com/office/drawing/2016/5/13/chartex" xmlns:cx8="http://schemas.microsoft.com/office/drawing/2016/5/14/chartex" xmlns:mc="http://schemas.openxmlformats.org/markup-compatibility/2006" xmlns:aink="http://schemas.microsoft.com/office/drawing/2016/ink" xmlns:am3d="http://schemas.microsoft.com/office/drawing/2017/model3d" xmlns:o="urn:schemas-microsoft-com:office:office" xmlns:oel="http://schemas.microsoft.com/office/2019/extlst" xmlns:r="http://schemas.openxmlformats.org/officeDocument/2006/relationships" xmlns:m="http://schemas.openxmlformats.org/officeDocument/2006/math" xmlns:v="urn:schemas-microsoft-com:vml" xmlns:wp14="http://schemas.microsoft.com/office/word/2010/wordprocessingDrawing" xmlns:wp="http://schemas.openxmlformats.org/drawingml/2006/wordprocessingDrawing" xmlns:w10="urn:schemas-microsoft-com:office:word" xmlns:w="http://schemas.openxmlformats.org/wordprocessingml/2006/main" xmlns:w14="http://schemas.microsoft.com/office/word/2010/wordml" xmlns:w15="http://schemas.microsoft.com/office/word/2012/wordml" xmlns:w16cex="http://schemas.microsoft.com/office/word/2018/wordml/cex" xmlns:w16cid="http://schemas.microsoft.com/office/word/2016/wordml/cid" xmlns:w16="http://schemas.microsoft.com/office/word/2018/wordml" xmlns:w16du="http://schemas.microsoft.com/office/word/2023/wordml/word16du" xmlns:w16sdtdh="http://schemas.microsoft.com/office/word/2020/wordml/sdtdatahash" xmlns:w16sdtfl="http://schemas.microsoft.com/office/word/2024/wordml/sdtformatlock" xmlns:w16se="http://schemas.microsoft.com/office/word/2015/wordml/symex" xmlns:wpg="http://schemas.microsoft.com/office/word/2010/wordprocessingGroup" xmlns:wpi="http://schemas.microsoft.com/office/word/2010/wordprocessingInk" xmlns:wne="http://schemas.microsoft.com/office/word/2006/wordml" xmlns:wps="http://schemas.microsoft.com/office/word/2010/wordprocessingShape" mc:Ignorable="w14 w15 w16se w16cid w16 w16cex w16sdtdh w16sdtfl w16du wp14">
   <w:p>
     <w:pPr>
       <w:pStyle w:val="Encabezado"/>
@@ -17300,7 +15101,7 @@
 </file>
 
 <file path=word/header2.xml><?xml version="1.0" encoding="utf-8"?>
-<w:hdr xmlns:wpc="http://schemas.microsoft.com/office/word/2010/wordprocessingCanvas" xmlns:cx="http://schemas.microsoft.com/office/drawing/2014/chartex" xmlns:cx1="http://schemas.microsoft.com/office/drawing/2015/9/8/chartex" xmlns:cx2="http://schemas.microsoft.com/office/drawing/2015/10/21/chartex" xmlns:cx3="http://schemas.microsoft.com/office/drawing/2016/5/9/chartex" xmlns:cx4="http://schemas.microsoft.com/office/drawing/2016/5/10/chartex" xmlns:cx5="http://schemas.microsoft.com/office/drawing/2016/5/11/chartex" xmlns:cx6="http://schemas.microsoft.com/office/drawing/2016/5/12/chartex" xmlns:cx7="http://schemas.microsoft.com/office/drawing/2016/5/13/chartex" xmlns:cx8="http://schemas.microsoft.com/office/drawing/2016/5/14/chartex" xmlns:mc="http://schemas.openxmlformats.org/markup-compatibility/2006" xmlns:aink="http://schemas.microsoft.com/office/drawing/2016/ink" xmlns:am3d="http://schemas.microsoft.com/office/drawing/2017/model3d" xmlns:o="urn:schemas-microsoft-com:office:office" xmlns:oel="http://schemas.microsoft.com/office/2019/extlst" xmlns:r="http://schemas.openxmlformats.org/officeDocument/2006/relationships" xmlns:m="http://schemas.openxmlformats.org/officeDocument/2006/math" xmlns:v="urn:schemas-microsoft-com:vml" xmlns:wp14="http://schemas.microsoft.com/office/word/2010/wordprocessingDrawing" xmlns:wp="http://schemas.openxmlformats.org/drawingml/2006/wordprocessingDrawing" xmlns:w10="urn:schemas-microsoft-com:office:word" xmlns:w="http://schemas.openxmlformats.org/wordprocessingml/2006/main" xmlns:w14="http://schemas.microsoft.com/office/word/2010/wordml" xmlns:w15="http://schemas.microsoft.com/office/word/2012/wordml" xmlns:w16cex="http://schemas.microsoft.com/office/word/2018/wordml/cex" xmlns:w16cid="http://schemas.microsoft.com/office/word/2016/wordml/cid" xmlns:w16="http://schemas.microsoft.com/office/word/2018/wordml" xmlns:w16du="http://schemas.microsoft.com/office/word/2023/wordml/word16du" xmlns:w16sdtdh="http://schemas.microsoft.com/office/word/2020/wordml/sdtdatahash" xmlns:w16se="http://schemas.microsoft.com/office/word/2015/wordml/symex" xmlns:wpg="http://schemas.microsoft.com/office/word/2010/wordprocessingGroup" xmlns:wpi="http://schemas.microsoft.com/office/word/2010/wordprocessingInk" xmlns:wne="http://schemas.microsoft.com/office/word/2006/wordml" xmlns:wps="http://schemas.microsoft.com/office/word/2010/wordprocessingShape" mc:Ignorable="w14 w15 w16se w16cid w16 w16cex w16sdtdh w16du wp14">
+<w:hdr xmlns:wpc="http://schemas.microsoft.com/office/word/2010/wordprocessingCanvas" xmlns:cx="http://schemas.microsoft.com/office/drawing/2014/chartex" xmlns:cx1="http://schemas.microsoft.com/office/drawing/2015/9/8/chartex" xmlns:cx2="http://schemas.microsoft.com/office/drawing/2015/10/21/chartex" xmlns:cx3="http://schemas.microsoft.com/office/drawing/2016/5/9/chartex" xmlns:cx4="http://schemas.microsoft.com/office/drawing/2016/5/10/chartex" xmlns:cx5="http://schemas.microsoft.com/office/drawing/2016/5/11/chartex" xmlns:cx6="http://schemas.microsoft.com/office/drawing/2016/5/12/chartex" xmlns:cx7="http://schemas.microsoft.com/office/drawing/2016/5/13/chartex" xmlns:cx8="http://schemas.microsoft.com/office/drawing/2016/5/14/chartex" xmlns:mc="http://schemas.openxmlformats.org/markup-compatibility/2006" xmlns:aink="http://schemas.microsoft.com/office/drawing/2016/ink" xmlns:am3d="http://schemas.microsoft.com/office/drawing/2017/model3d" xmlns:o="urn:schemas-microsoft-com:office:office" xmlns:oel="http://schemas.microsoft.com/office/2019/extlst" xmlns:r="http://schemas.openxmlformats.org/officeDocument/2006/relationships" xmlns:m="http://schemas.openxmlformats.org/officeDocument/2006/math" xmlns:v="urn:schemas-microsoft-com:vml" xmlns:wp14="http://schemas.microsoft.com/office/word/2010/wordprocessingDrawing" xmlns:wp="http://schemas.openxmlformats.org/drawingml/2006/wordprocessingDrawing" xmlns:w10="urn:schemas-microsoft-com:office:word" xmlns:w="http://schemas.openxmlformats.org/wordprocessingml/2006/main" xmlns:w14="http://schemas.microsoft.com/office/word/2010/wordml" xmlns:w15="http://schemas.microsoft.com/office/word/2012/wordml" xmlns:w16cex="http://schemas.microsoft.com/office/word/2018/wordml/cex" xmlns:w16cid="http://schemas.microsoft.com/office/word/2016/wordml/cid" xmlns:w16="http://schemas.microsoft.com/office/word/2018/wordml" xmlns:w16du="http://schemas.microsoft.com/office/word/2023/wordml/word16du" xmlns:w16sdtdh="http://schemas.microsoft.com/office/word/2020/wordml/sdtdatahash" xmlns:w16sdtfl="http://schemas.microsoft.com/office/word/2024/wordml/sdtformatlock" xmlns:w16se="http://schemas.microsoft.com/office/word/2015/wordml/symex" xmlns:wpg="http://schemas.microsoft.com/office/word/2010/wordprocessingGroup" xmlns:wpi="http://schemas.microsoft.com/office/word/2010/wordprocessingInk" xmlns:wne="http://schemas.microsoft.com/office/word/2006/wordml" xmlns:wps="http://schemas.microsoft.com/office/word/2010/wordprocessingShape" mc:Ignorable="w14 w15 w16se w16cid w16 w16cex w16sdtdh w16sdtfl w16du wp14">
   <w:p>
     <w:pPr>
       <w:pBdr>
@@ -17359,7 +15160,7 @@
 </file>
 
 <file path=word/header3.xml><?xml version="1.0" encoding="utf-8"?>
-<w:hdr xmlns:wpc="http://schemas.microsoft.com/office/word/2010/wordprocessingCanvas" xmlns:cx="http://schemas.microsoft.com/office/drawing/2014/chartex" xmlns:cx1="http://schemas.microsoft.com/office/drawing/2015/9/8/chartex" xmlns:cx2="http://schemas.microsoft.com/office/drawing/2015/10/21/chartex" xmlns:cx3="http://schemas.microsoft.com/office/drawing/2016/5/9/chartex" xmlns:cx4="http://schemas.microsoft.com/office/drawing/2016/5/10/chartex" xmlns:cx5="http://schemas.microsoft.com/office/drawing/2016/5/11/chartex" xmlns:cx6="http://schemas.microsoft.com/office/drawing/2016/5/12/chartex" xmlns:cx7="http://schemas.microsoft.com/office/drawing/2016/5/13/chartex" xmlns:cx8="http://schemas.microsoft.com/office/drawing/2016/5/14/chartex" xmlns:mc="http://schemas.openxmlformats.org/markup-compatibility/2006" xmlns:aink="http://schemas.microsoft.com/office/drawing/2016/ink" xmlns:am3d="http://schemas.microsoft.com/office/drawing/2017/model3d" xmlns:o="urn:schemas-microsoft-com:office:office" xmlns:oel="http://schemas.microsoft.com/office/2019/extlst" xmlns:r="http://schemas.openxmlformats.org/officeDocument/2006/relationships" xmlns:m="http://schemas.openxmlformats.org/officeDocument/2006/math" xmlns:v="urn:schemas-microsoft-com:vml" xmlns:wp14="http://schemas.microsoft.com/office/word/2010/wordprocessingDrawing" xmlns:wp="http://schemas.openxmlformats.org/drawingml/2006/wordprocessingDrawing" xmlns:w10="urn:schemas-microsoft-com:office:word" xmlns:w="http://schemas.openxmlformats.org/wordprocessingml/2006/main" xmlns:w14="http://schemas.microsoft.com/office/word/2010/wordml" xmlns:w15="http://schemas.microsoft.com/office/word/2012/wordml" xmlns:w16cex="http://schemas.microsoft.com/office/word/2018/wordml/cex" xmlns:w16cid="http://schemas.microsoft.com/office/word/2016/wordml/cid" xmlns:w16="http://schemas.microsoft.com/office/word/2018/wordml" xmlns:w16du="http://schemas.microsoft.com/office/word/2023/wordml/word16du" xmlns:w16sdtdh="http://schemas.microsoft.com/office/word/2020/wordml/sdtdatahash" xmlns:w16se="http://schemas.microsoft.com/office/word/2015/wordml/symex" xmlns:wpg="http://schemas.microsoft.com/office/word/2010/wordprocessingGroup" xmlns:wpi="http://schemas.microsoft.com/office/word/2010/wordprocessingInk" xmlns:wne="http://schemas.microsoft.com/office/word/2006/wordml" xmlns:wps="http://schemas.microsoft.com/office/word/2010/wordprocessingShape" mc:Ignorable="w14 w15 w16se w16cid w16 w16cex w16sdtdh w16du wp14">
+<w:hdr xmlns:wpc="http://schemas.microsoft.com/office/word/2010/wordprocessingCanvas" xmlns:cx="http://schemas.microsoft.com/office/drawing/2014/chartex" xmlns:cx1="http://schemas.microsoft.com/office/drawing/2015/9/8/chartex" xmlns:cx2="http://schemas.microsoft.com/office/drawing/2015/10/21/chartex" xmlns:cx3="http://schemas.microsoft.com/office/drawing/2016/5/9/chartex" xmlns:cx4="http://schemas.microsoft.com/office/drawing/2016/5/10/chartex" xmlns:cx5="http://schemas.microsoft.com/office/drawing/2016/5/11/chartex" xmlns:cx6="http://schemas.microsoft.com/office/drawing/2016/5/12/chartex" xmlns:cx7="http://schemas.microsoft.com/office/drawing/2016/5/13/chartex" xmlns:cx8="http://schemas.microsoft.com/office/drawing/2016/5/14/chartex" xmlns:mc="http://schemas.openxmlformats.org/markup-compatibility/2006" xmlns:aink="http://schemas.microsoft.com/office/drawing/2016/ink" xmlns:am3d="http://schemas.microsoft.com/office/drawing/2017/model3d" xmlns:o="urn:schemas-microsoft-com:office:office" xmlns:oel="http://schemas.microsoft.com/office/2019/extlst" xmlns:r="http://schemas.openxmlformats.org/officeDocument/2006/relationships" xmlns:m="http://schemas.openxmlformats.org/officeDocument/2006/math" xmlns:v="urn:schemas-microsoft-com:vml" xmlns:wp14="http://schemas.microsoft.com/office/word/2010/wordprocessingDrawing" xmlns:wp="http://schemas.openxmlformats.org/drawingml/2006/wordprocessingDrawing" xmlns:w10="urn:schemas-microsoft-com:office:word" xmlns:w="http://schemas.openxmlformats.org/wordprocessingml/2006/main" xmlns:w14="http://schemas.microsoft.com/office/word/2010/wordml" xmlns:w15="http://schemas.microsoft.com/office/word/2012/wordml" xmlns:w16cex="http://schemas.microsoft.com/office/word/2018/wordml/cex" xmlns:w16cid="http://schemas.microsoft.com/office/word/2016/wordml/cid" xmlns:w16="http://schemas.microsoft.com/office/word/2018/wordml" xmlns:w16du="http://schemas.microsoft.com/office/word/2023/wordml/word16du" xmlns:w16sdtdh="http://schemas.microsoft.com/office/word/2020/wordml/sdtdatahash" xmlns:w16sdtfl="http://schemas.microsoft.com/office/word/2024/wordml/sdtformatlock" xmlns:w16se="http://schemas.microsoft.com/office/word/2015/wordml/symex" xmlns:wpg="http://schemas.microsoft.com/office/word/2010/wordprocessingGroup" xmlns:wpi="http://schemas.microsoft.com/office/word/2010/wordprocessingInk" xmlns:wne="http://schemas.microsoft.com/office/word/2006/wordml" xmlns:wps="http://schemas.microsoft.com/office/word/2010/wordprocessingShape" mc:Ignorable="w14 w15 w16se w16cid w16 w16cex w16sdtdh w16sdtfl w16du wp14">
   <w:p>
     <w:pPr>
       <w:pStyle w:val="Encabezado"/>
@@ -17369,7 +15170,7 @@
 </file>
 
 <file path=word/numbering.xml><?xml version="1.0" encoding="utf-8"?>
-<w:numbering xmlns:wpc="http://schemas.microsoft.com/office/word/2010/wordprocessingCanvas" xmlns:cx="http://schemas.microsoft.com/office/drawing/2014/chartex" xmlns:cx1="http://schemas.microsoft.com/office/drawing/2015/9/8/chartex" xmlns:cx2="http://schemas.microsoft.com/office/drawing/2015/10/21/chartex" xmlns:cx3="http://schemas.microsoft.com/office/drawing/2016/5/9/chartex" xmlns:cx4="http://schemas.microsoft.com/office/drawing/2016/5/10/chartex" xmlns:cx5="http://schemas.microsoft.com/office/drawing/2016/5/11/chartex" xmlns:cx6="http://schemas.microsoft.com/office/drawing/2016/5/12/chartex" xmlns:cx7="http://schemas.microsoft.com/office/drawing/2016/5/13/chartex" xmlns:cx8="http://schemas.microsoft.com/office/drawing/2016/5/14/chartex" xmlns:mc="http://schemas.openxmlformats.org/markup-compatibility/2006" xmlns:aink="http://schemas.microsoft.com/office/drawing/2016/ink" xmlns:am3d="http://schemas.microsoft.com/office/drawing/2017/model3d" xmlns:o="urn:schemas-microsoft-com:office:office" xmlns:oel="http://schemas.microsoft.com/office/2019/extlst" xmlns:r="http://schemas.openxmlformats.org/officeDocument/2006/relationships" xmlns:m="http://schemas.openxmlformats.org/officeDocument/2006/math" xmlns:v="urn:schemas-microsoft-com:vml" xmlns:wp14="http://schemas.microsoft.com/office/word/2010/wordprocessingDrawing" xmlns:wp="http://schemas.openxmlformats.org/drawingml/2006/wordprocessingDrawing" xmlns:w10="urn:schemas-microsoft-com:office:word" xmlns:w="http://schemas.openxmlformats.org/wordprocessingml/2006/main" xmlns:w14="http://schemas.microsoft.com/office/word/2010/wordml" xmlns:w15="http://schemas.microsoft.com/office/word/2012/wordml" xmlns:w16cex="http://schemas.microsoft.com/office/word/2018/wordml/cex" xmlns:w16cid="http://schemas.microsoft.com/office/word/2016/wordml/cid" xmlns:w16="http://schemas.microsoft.com/office/word/2018/wordml" xmlns:w16du="http://schemas.microsoft.com/office/word/2023/wordml/word16du" xmlns:w16sdtdh="http://schemas.microsoft.com/office/word/2020/wordml/sdtdatahash" xmlns:w16se="http://schemas.microsoft.com/office/word/2015/wordml/symex" xmlns:wpg="http://schemas.microsoft.com/office/word/2010/wordprocessingGroup" xmlns:wpi="http://schemas.microsoft.com/office/word/2010/wordprocessingInk" xmlns:wne="http://schemas.microsoft.com/office/word/2006/wordml" xmlns:wps="http://schemas.microsoft.com/office/word/2010/wordprocessingShape" mc:Ignorable="w14 w15 w16se w16cid w16 w16cex w16sdtdh w16du wp14">
+<w:numbering xmlns:wpc="http://schemas.microsoft.com/office/word/2010/wordprocessingCanvas" xmlns:cx="http://schemas.microsoft.com/office/drawing/2014/chartex" xmlns:cx1="http://schemas.microsoft.com/office/drawing/2015/9/8/chartex" xmlns:cx2="http://schemas.microsoft.com/office/drawing/2015/10/21/chartex" xmlns:cx3="http://schemas.microsoft.com/office/drawing/2016/5/9/chartex" xmlns:cx4="http://schemas.microsoft.com/office/drawing/2016/5/10/chartex" xmlns:cx5="http://schemas.microsoft.com/office/drawing/2016/5/11/chartex" xmlns:cx6="http://schemas.microsoft.com/office/drawing/2016/5/12/chartex" xmlns:cx7="http://schemas.microsoft.com/office/drawing/2016/5/13/chartex" xmlns:cx8="http://schemas.microsoft.com/office/drawing/2016/5/14/chartex" xmlns:mc="http://schemas.openxmlformats.org/markup-compatibility/2006" xmlns:aink="http://schemas.microsoft.com/office/drawing/2016/ink" xmlns:am3d="http://schemas.microsoft.com/office/drawing/2017/model3d" xmlns:o="urn:schemas-microsoft-com:office:office" xmlns:oel="http://schemas.microsoft.com/office/2019/extlst" xmlns:r="http://schemas.openxmlformats.org/officeDocument/2006/relationships" xmlns:m="http://schemas.openxmlformats.org/officeDocument/2006/math" xmlns:v="urn:schemas-microsoft-com:vml" xmlns:wp14="http://schemas.microsoft.com/office/word/2010/wordprocessingDrawing" xmlns:wp="http://schemas.openxmlformats.org/drawingml/2006/wordprocessingDrawing" xmlns:w10="urn:schemas-microsoft-com:office:word" xmlns:w="http://schemas.openxmlformats.org/wordprocessingml/2006/main" xmlns:w14="http://schemas.microsoft.com/office/word/2010/wordml" xmlns:w15="http://schemas.microsoft.com/office/word/2012/wordml" xmlns:w16cex="http://schemas.microsoft.com/office/word/2018/wordml/cex" xmlns:w16cid="http://schemas.microsoft.com/office/word/2016/wordml/cid" xmlns:w16="http://schemas.microsoft.com/office/word/2018/wordml" xmlns:w16du="http://schemas.microsoft.com/office/word/2023/wordml/word16du" xmlns:w16sdtdh="http://schemas.microsoft.com/office/word/2020/wordml/sdtdatahash" xmlns:w16sdtfl="http://schemas.microsoft.com/office/word/2024/wordml/sdtformatlock" xmlns:w16se="http://schemas.microsoft.com/office/word/2015/wordml/symex" xmlns:wpg="http://schemas.microsoft.com/office/word/2010/wordprocessingGroup" xmlns:wpi="http://schemas.microsoft.com/office/word/2010/wordprocessingInk" xmlns:wne="http://schemas.microsoft.com/office/word/2006/wordml" xmlns:wps="http://schemas.microsoft.com/office/word/2010/wordprocessingShape" mc:Ignorable="w14 w15 w16se w16cid w16 w16cex w16sdtdh w16sdtfl w16du wp14">
   <w:abstractNum w:abstractNumId="0" w15:restartNumberingAfterBreak="0">
     <w:nsid w:val="00000003"/>
     <w:multiLevelType w:val="singleLevel"/>
@@ -17859,7 +15660,7 @@
 </file>
 
 <file path=word/styles.xml><?xml version="1.0" encoding="utf-8"?>
-<w:styles xmlns:mc="http://schemas.openxmlformats.org/markup-compatibility/2006" xmlns:r="http://schemas.openxmlformats.org/officeDocument/2006/relationships" xmlns:w="http://schemas.openxmlformats.org/wordprocessingml/2006/main" xmlns:w14="http://schemas.microsoft.com/office/word/2010/wordml" xmlns:w15="http://schemas.microsoft.com/office/word/2012/wordml" xmlns:w16cex="http://schemas.microsoft.com/office/word/2018/wordml/cex" xmlns:w16cid="http://schemas.microsoft.com/office/word/2016/wordml/cid" xmlns:w16="http://schemas.microsoft.com/office/word/2018/wordml" xmlns:w16du="http://schemas.microsoft.com/office/word/2023/wordml/word16du" xmlns:w16sdtdh="http://schemas.microsoft.com/office/word/2020/wordml/sdtdatahash" xmlns:w16se="http://schemas.microsoft.com/office/word/2015/wordml/symex" mc:Ignorable="w14 w15 w16se w16cid w16 w16cex w16sdtdh w16du">
+<w:styles xmlns:mc="http://schemas.openxmlformats.org/markup-compatibility/2006" xmlns:r="http://schemas.openxmlformats.org/officeDocument/2006/relationships" xmlns:w="http://schemas.openxmlformats.org/wordprocessingml/2006/main" xmlns:w14="http://schemas.microsoft.com/office/word/2010/wordml" xmlns:w15="http://schemas.microsoft.com/office/word/2012/wordml" xmlns:w16cex="http://schemas.microsoft.com/office/word/2018/wordml/cex" xmlns:w16cid="http://schemas.microsoft.com/office/word/2016/wordml/cid" xmlns:w16="http://schemas.microsoft.com/office/word/2018/wordml" xmlns:w16du="http://schemas.microsoft.com/office/word/2023/wordml/word16du" xmlns:w16sdtdh="http://schemas.microsoft.com/office/word/2020/wordml/sdtdatahash" xmlns:w16sdtfl="http://schemas.microsoft.com/office/word/2024/wordml/sdtformatlock" xmlns:w16se="http://schemas.microsoft.com/office/word/2015/wordml/symex" mc:Ignorable="w14 w15 w16se w16cid w16 w16cex w16sdtdh w16sdtfl w16du">
   <w:docDefaults>
     <w:rPrDefault>
       <w:rPr>

</xml_diff>

<commit_message>
Update CVs and website
</commit_message>
<xml_diff>
--- a/docs/CV-mhidalgo-EN.docx
+++ b/docs/CV-mhidalgo-EN.docx
@@ -1658,7 +1658,7 @@
           <w:szCs w:val="26"/>
           <w:lang w:val="en-GB"/>
         </w:rPr>
-        <w:t>3</w:t>
+        <w:t>7</w:t>
       </w:r>
       <w:r>
         <w:rPr>
@@ -1674,7 +1674,15 @@
           <w:szCs w:val="26"/>
           <w:lang w:val="en-GB"/>
         </w:rPr>
-        <w:t>21</w:t>
+        <w:t>2</w:t>
+      </w:r>
+      <w:r>
+        <w:rPr>
+          <w:sz w:val="26"/>
+          <w:szCs w:val="26"/>
+          <w:lang w:val="en-GB"/>
+        </w:rPr>
+        <w:t>5</w:t>
       </w:r>
       <w:r>
         <w:rPr>
@@ -1706,7 +1714,7 @@
           <w:szCs w:val="26"/>
           <w:lang w:val="en-GB"/>
         </w:rPr>
-        <w:t>Architect</w:t>
+        <w:t>Tech Lead and SRE</w:t>
       </w:r>
       <w:r>
         <w:rPr>
@@ -1722,7 +1730,15 @@
           <w:szCs w:val="26"/>
           <w:lang w:val="en-GB"/>
         </w:rPr>
-        <w:t>Im Digital</w:t>
+        <w:t>McFadyen</w:t>
+      </w:r>
+      <w:r>
+        <w:rPr>
+          <w:sz w:val="26"/>
+          <w:szCs w:val="26"/>
+          <w:lang w:val="en-GB"/>
+        </w:rPr>
+        <w:t xml:space="preserve"> Digital</w:t>
       </w:r>
       <w:r>
         <w:rPr>
@@ -1747,6 +1763,48 @@
           <w:lang w:val="en-GB"/>
         </w:rPr>
         <w:t>.</w:t>
+      </w:r>
+    </w:p>
+    <w:p>
+      <w:pPr>
+        <w:pBdr>
+          <w:top w:val="nil"/>
+          <w:left w:val="nil"/>
+          <w:bottom w:val="nil"/>
+          <w:right w:val="nil"/>
+          <w:between w:val="nil"/>
+          <w:bar w:val="nil"/>
+        </w:pBdr>
+        <w:jc w:val="both"/>
+        <w:rPr>
+          <w:sz w:val="26"/>
+          <w:szCs w:val="26"/>
+          <w:lang w:val="en-GB"/>
+        </w:rPr>
+      </w:pPr>
+      <w:r>
+        <w:rPr>
+          <w:sz w:val="26"/>
+          <w:szCs w:val="26"/>
+          <w:lang w:val="en-GB"/>
+        </w:rPr>
+        <w:t xml:space="preserve">03/21 – </w:t>
+      </w:r>
+      <w:r>
+        <w:rPr>
+          <w:sz w:val="26"/>
+          <w:szCs w:val="26"/>
+          <w:lang w:val="en-GB"/>
+        </w:rPr>
+        <w:t>06/25</w:t>
+      </w:r>
+      <w:r>
+        <w:rPr>
+          <w:sz w:val="26"/>
+          <w:szCs w:val="26"/>
+          <w:lang w:val="en-GB"/>
+        </w:rPr>
+        <w:t>: Magento Architect on Im Digital, Remote.</w:t>
       </w:r>
     </w:p>
     <w:p>
@@ -14035,7 +14093,7 @@
           <w:szCs w:val="26"/>
           <w:lang w:val="en-GB"/>
         </w:rPr>
-        <w:t>Currently</w:t>
+        <w:t>2025</w:t>
       </w:r>
     </w:p>
     <w:p>
@@ -14382,7 +14440,7 @@
           <w:szCs w:val="26"/>
           <w:lang w:val="en-GB"/>
         </w:rPr>
-        <w:t>Currently</w:t>
+        <w:t>2025</w:t>
       </w:r>
     </w:p>
     <w:p>
@@ -14641,6 +14699,519 @@
         </w:rPr>
         <w:t>.</w:t>
       </w:r>
+    </w:p>
+    <w:p>
+      <w:pPr>
+        <w:ind w:left="720"/>
+        <w:jc w:val="both"/>
+        <w:rPr>
+          <w:rFonts w:asciiTheme="minorHAnsi" w:hAnsiTheme="minorHAnsi" w:cstheme="minorHAnsi"/>
+          <w:sz w:val="26"/>
+          <w:szCs w:val="26"/>
+          <w:lang w:val="en-GB"/>
+        </w:rPr>
+      </w:pPr>
+    </w:p>
+    <w:p>
+      <w:pPr>
+        <w:pBdr>
+          <w:top w:val="single" w:sz="4" w:space="1" w:color="auto"/>
+          <w:left w:val="nil"/>
+          <w:bottom w:val="nil"/>
+          <w:right w:val="nil"/>
+          <w:between w:val="nil"/>
+          <w:bar w:val="nil"/>
+        </w:pBdr>
+        <w:rPr>
+          <w:b/>
+          <w:bCs/>
+          <w:sz w:val="30"/>
+          <w:szCs w:val="30"/>
+          <w:lang w:val="en-GB"/>
+        </w:rPr>
+      </w:pPr>
+      <w:r>
+        <w:rPr>
+          <w:b/>
+          <w:bCs/>
+          <w:sz w:val="30"/>
+          <w:szCs w:val="30"/>
+          <w:lang w:val="en-GB"/>
+        </w:rPr>
+        <w:t>McFadyen</w:t>
+      </w:r>
+      <w:r>
+        <w:rPr>
+          <w:b/>
+          <w:bCs/>
+          <w:sz w:val="30"/>
+          <w:szCs w:val="30"/>
+          <w:lang w:val="en-GB"/>
+        </w:rPr>
+        <w:t xml:space="preserve"> Digital</w:t>
+      </w:r>
+      <w:r>
+        <w:rPr>
+          <w:b/>
+          <w:bCs/>
+          <w:sz w:val="30"/>
+          <w:szCs w:val="30"/>
+          <w:lang w:val="en-GB"/>
+        </w:rPr>
+        <w:t>’s</w:t>
+      </w:r>
+      <w:r>
+        <w:rPr>
+          <w:b/>
+          <w:bCs/>
+          <w:sz w:val="30"/>
+          <w:szCs w:val="30"/>
+          <w:lang w:val="en-GB"/>
+        </w:rPr>
+        <w:t xml:space="preserve"> Projects:</w:t>
+      </w:r>
+    </w:p>
+    <w:p>
+      <w:pPr>
+        <w:pBdr>
+          <w:top w:val="nil"/>
+          <w:left w:val="nil"/>
+          <w:bottom w:val="nil"/>
+          <w:right w:val="nil"/>
+          <w:between w:val="nil"/>
+          <w:bar w:val="nil"/>
+        </w:pBdr>
+        <w:jc w:val="both"/>
+        <w:rPr>
+          <w:rFonts w:asciiTheme="minorHAnsi" w:hAnsiTheme="minorHAnsi" w:cstheme="minorHAnsi"/>
+          <w:b/>
+          <w:sz w:val="28"/>
+          <w:szCs w:val="26"/>
+          <w:lang w:val="en-GB"/>
+        </w:rPr>
+      </w:pPr>
+      <w:r>
+        <w:rPr>
+          <w:rFonts w:asciiTheme="minorHAnsi" w:hAnsiTheme="minorHAnsi" w:cstheme="minorHAnsi"/>
+          <w:b/>
+          <w:sz w:val="28"/>
+          <w:szCs w:val="26"/>
+          <w:lang w:val="en-GB"/>
+        </w:rPr>
+        <w:t>FedEx</w:t>
+      </w:r>
+      <w:r>
+        <w:rPr>
+          <w:rFonts w:asciiTheme="minorHAnsi" w:hAnsiTheme="minorHAnsi" w:cstheme="minorHAnsi"/>
+          <w:b/>
+          <w:sz w:val="28"/>
+          <w:szCs w:val="26"/>
+          <w:lang w:val="en-GB"/>
+        </w:rPr>
+        <w:t xml:space="preserve"> </w:t>
+      </w:r>
+      <w:r>
+        <w:rPr>
+          <w:rFonts w:asciiTheme="minorHAnsi" w:hAnsiTheme="minorHAnsi" w:cstheme="minorHAnsi"/>
+          <w:b/>
+          <w:sz w:val="28"/>
+          <w:szCs w:val="26"/>
+          <w:lang w:val="en-GB"/>
+        </w:rPr>
+        <w:t>(</w:t>
+      </w:r>
+      <w:r>
+        <w:rPr>
+          <w:rFonts w:asciiTheme="minorHAnsi" w:hAnsiTheme="minorHAnsi" w:cstheme="minorHAnsi"/>
+          <w:b/>
+          <w:sz w:val="28"/>
+          <w:szCs w:val="26"/>
+          <w:lang w:val="en-GB"/>
+        </w:rPr>
+        <w:t>American</w:t>
+      </w:r>
+      <w:r>
+        <w:rPr>
+          <w:rFonts w:asciiTheme="minorHAnsi" w:hAnsiTheme="minorHAnsi" w:cstheme="minorHAnsi"/>
+          <w:b/>
+          <w:sz w:val="28"/>
+          <w:szCs w:val="26"/>
+          <w:lang w:val="en-GB"/>
+        </w:rPr>
+        <w:t xml:space="preserve">) </w:t>
+      </w:r>
+      <w:r>
+        <w:rPr>
+          <w:rFonts w:asciiTheme="minorHAnsi" w:hAnsiTheme="minorHAnsi" w:cstheme="minorHAnsi"/>
+          <w:b/>
+          <w:sz w:val="28"/>
+          <w:szCs w:val="26"/>
+          <w:lang w:val="en-GB"/>
+        </w:rPr>
+        <w:t>202</w:t>
+      </w:r>
+      <w:r>
+        <w:rPr>
+          <w:rFonts w:asciiTheme="minorHAnsi" w:hAnsiTheme="minorHAnsi" w:cstheme="minorHAnsi"/>
+          <w:b/>
+          <w:sz w:val="28"/>
+          <w:szCs w:val="26"/>
+          <w:lang w:val="en-GB"/>
+        </w:rPr>
+        <w:t>5</w:t>
+      </w:r>
+      <w:r>
+        <w:rPr>
+          <w:rFonts w:asciiTheme="minorHAnsi" w:hAnsiTheme="minorHAnsi" w:cstheme="minorHAnsi"/>
+          <w:b/>
+          <w:sz w:val="28"/>
+          <w:szCs w:val="26"/>
+          <w:lang w:val="en-GB"/>
+        </w:rPr>
+        <w:t xml:space="preserve"> - Currently</w:t>
+      </w:r>
+    </w:p>
+    <w:p>
+      <w:pPr>
+        <w:jc w:val="both"/>
+        <w:rPr>
+          <w:rFonts w:asciiTheme="minorHAnsi" w:hAnsiTheme="minorHAnsi" w:cstheme="minorHAnsi"/>
+          <w:b/>
+          <w:sz w:val="26"/>
+          <w:szCs w:val="26"/>
+          <w:lang w:val="en-GB"/>
+        </w:rPr>
+      </w:pPr>
+      <w:r>
+        <w:rPr>
+          <w:rFonts w:asciiTheme="minorHAnsi" w:hAnsiTheme="minorHAnsi" w:cstheme="minorHAnsi"/>
+          <w:b/>
+          <w:sz w:val="28"/>
+          <w:szCs w:val="26"/>
+          <w:lang w:val="en-GB"/>
+        </w:rPr>
+        <w:t>FedEx Office</w:t>
+      </w:r>
+      <w:r>
+        <w:rPr>
+          <w:rFonts w:asciiTheme="minorHAnsi" w:hAnsiTheme="minorHAnsi" w:cstheme="minorHAnsi"/>
+          <w:b/>
+          <w:sz w:val="28"/>
+          <w:szCs w:val="26"/>
+          <w:lang w:val="en-GB"/>
+        </w:rPr>
+        <w:t xml:space="preserve"> </w:t>
+      </w:r>
+      <w:r>
+        <w:rPr>
+          <w:rFonts w:asciiTheme="minorHAnsi" w:hAnsiTheme="minorHAnsi" w:cstheme="minorHAnsi"/>
+          <w:b/>
+          <w:sz w:val="26"/>
+          <w:szCs w:val="26"/>
+          <w:lang w:val="en-GB"/>
+        </w:rPr>
+        <w:t>Project:</w:t>
+      </w:r>
+    </w:p>
+    <w:p>
+      <w:pPr>
+        <w:ind w:left="720"/>
+        <w:jc w:val="both"/>
+        <w:rPr>
+          <w:rFonts w:asciiTheme="minorHAnsi" w:hAnsiTheme="minorHAnsi" w:cstheme="minorHAnsi"/>
+          <w:sz w:val="26"/>
+          <w:szCs w:val="26"/>
+          <w:lang w:val="en-GB"/>
+        </w:rPr>
+      </w:pPr>
+      <w:r>
+        <w:rPr>
+          <w:rFonts w:asciiTheme="minorHAnsi" w:hAnsiTheme="minorHAnsi" w:cstheme="minorHAnsi"/>
+          <w:sz w:val="26"/>
+          <w:szCs w:val="26"/>
+          <w:lang w:val="en-GB"/>
+        </w:rPr>
+        <w:t xml:space="preserve">Senior </w:t>
+      </w:r>
+      <w:r>
+        <w:rPr>
+          <w:rFonts w:asciiTheme="minorHAnsi" w:hAnsiTheme="minorHAnsi" w:cstheme="minorHAnsi"/>
+          <w:sz w:val="26"/>
+          <w:szCs w:val="26"/>
+          <w:lang w:val="en-GB"/>
+        </w:rPr>
+        <w:t>PHP</w:t>
+      </w:r>
+      <w:r>
+        <w:rPr>
+          <w:rFonts w:asciiTheme="minorHAnsi" w:hAnsiTheme="minorHAnsi" w:cstheme="minorHAnsi"/>
+          <w:sz w:val="26"/>
+          <w:szCs w:val="26"/>
+          <w:lang w:val="en-GB"/>
+        </w:rPr>
+        <w:t xml:space="preserve"> </w:t>
+      </w:r>
+      <w:r>
+        <w:rPr>
+          <w:rFonts w:asciiTheme="minorHAnsi" w:hAnsiTheme="minorHAnsi" w:cstheme="minorHAnsi"/>
+          <w:sz w:val="26"/>
+          <w:szCs w:val="26"/>
+          <w:lang w:val="en-GB"/>
+        </w:rPr>
+        <w:t>8</w:t>
+      </w:r>
+      <w:r>
+        <w:rPr>
+          <w:rFonts w:asciiTheme="minorHAnsi" w:hAnsiTheme="minorHAnsi" w:cstheme="minorHAnsi"/>
+          <w:sz w:val="26"/>
+          <w:szCs w:val="26"/>
+          <w:lang w:val="en-GB"/>
+        </w:rPr>
+        <w:t xml:space="preserve"> and Magento </w:t>
+      </w:r>
+      <w:r>
+        <w:rPr>
+          <w:rFonts w:asciiTheme="minorHAnsi" w:hAnsiTheme="minorHAnsi" w:cstheme="minorHAnsi"/>
+          <w:sz w:val="26"/>
+          <w:szCs w:val="26"/>
+          <w:lang w:val="en-GB"/>
+        </w:rPr>
+        <w:t xml:space="preserve">2 </w:t>
+      </w:r>
+      <w:r>
+        <w:rPr>
+          <w:rFonts w:asciiTheme="minorHAnsi" w:hAnsiTheme="minorHAnsi" w:cstheme="minorHAnsi"/>
+          <w:sz w:val="26"/>
+          <w:szCs w:val="26"/>
+          <w:lang w:val="en-GB"/>
+        </w:rPr>
+        <w:t>Tech Lead and SRE</w:t>
+      </w:r>
+    </w:p>
+    <w:p>
+      <w:pPr>
+        <w:numPr>
+          <w:ilvl w:val="0"/>
+          <w:numId w:val="5"/>
+        </w:numPr>
+        <w:ind w:left="1440"/>
+        <w:jc w:val="both"/>
+        <w:rPr>
+          <w:rFonts w:asciiTheme="minorHAnsi" w:hAnsiTheme="minorHAnsi" w:cstheme="minorHAnsi"/>
+          <w:sz w:val="26"/>
+          <w:szCs w:val="26"/>
+          <w:lang w:val="en-GB"/>
+        </w:rPr>
+      </w:pPr>
+      <w:r>
+        <w:rPr>
+          <w:rFonts w:asciiTheme="minorHAnsi" w:hAnsiTheme="minorHAnsi" w:cstheme="minorHAnsi"/>
+          <w:sz w:val="26"/>
+          <w:szCs w:val="26"/>
+          <w:lang w:val="en-GB"/>
+        </w:rPr>
+        <w:t xml:space="preserve">Develop Magento modules to customize e-commerce platform based-on client requirements. </w:t>
+      </w:r>
+    </w:p>
+    <w:p>
+      <w:pPr>
+        <w:numPr>
+          <w:ilvl w:val="0"/>
+          <w:numId w:val="5"/>
+        </w:numPr>
+        <w:ind w:left="1440"/>
+        <w:jc w:val="both"/>
+        <w:rPr>
+          <w:rFonts w:asciiTheme="minorHAnsi" w:hAnsiTheme="minorHAnsi" w:cstheme="minorHAnsi"/>
+          <w:sz w:val="26"/>
+          <w:szCs w:val="26"/>
+          <w:lang w:val="en-GB"/>
+        </w:rPr>
+      </w:pPr>
+      <w:r>
+        <w:rPr>
+          <w:rFonts w:asciiTheme="minorHAnsi" w:hAnsiTheme="minorHAnsi" w:cstheme="minorHAnsi"/>
+          <w:sz w:val="26"/>
+          <w:szCs w:val="26"/>
+          <w:lang w:val="en-GB"/>
+        </w:rPr>
+        <w:lastRenderedPageBreak/>
+        <w:t>Provide support as SRE, working along with high stakeholders, suggesting improvements and acting during Outages.</w:t>
+      </w:r>
+    </w:p>
+    <w:p>
+      <w:pPr>
+        <w:numPr>
+          <w:ilvl w:val="0"/>
+          <w:numId w:val="5"/>
+        </w:numPr>
+        <w:ind w:left="1440"/>
+        <w:jc w:val="both"/>
+        <w:rPr>
+          <w:rFonts w:asciiTheme="minorHAnsi" w:hAnsiTheme="minorHAnsi" w:cstheme="minorHAnsi"/>
+          <w:sz w:val="26"/>
+          <w:szCs w:val="26"/>
+          <w:lang w:val="en-GB"/>
+        </w:rPr>
+      </w:pPr>
+      <w:r>
+        <w:rPr>
+          <w:rFonts w:asciiTheme="minorHAnsi" w:hAnsiTheme="minorHAnsi" w:cstheme="minorHAnsi"/>
+          <w:sz w:val="26"/>
+          <w:szCs w:val="26"/>
+          <w:lang w:val="en-GB"/>
+        </w:rPr>
+        <w:t>Built several New Relic Dashboards to provide visibility and find action items on the data that was already being produced by logging, metrics, and transactions.</w:t>
+      </w:r>
+    </w:p>
+    <w:p>
+      <w:pPr>
+        <w:numPr>
+          <w:ilvl w:val="0"/>
+          <w:numId w:val="5"/>
+        </w:numPr>
+        <w:ind w:left="1440"/>
+        <w:jc w:val="both"/>
+        <w:rPr>
+          <w:rFonts w:asciiTheme="minorHAnsi" w:hAnsiTheme="minorHAnsi" w:cstheme="minorHAnsi"/>
+          <w:sz w:val="26"/>
+          <w:szCs w:val="26"/>
+          <w:lang w:val="en-GB"/>
+        </w:rPr>
+      </w:pPr>
+      <w:r>
+        <w:rPr>
+          <w:rFonts w:asciiTheme="minorHAnsi" w:hAnsiTheme="minorHAnsi" w:cstheme="minorHAnsi"/>
+          <w:sz w:val="26"/>
+          <w:szCs w:val="26"/>
+          <w:lang w:val="en-GB"/>
+        </w:rPr>
+        <w:t>Led support team on different initiatives to provide stability, performance improvement, and reliability of the production environment.</w:t>
+      </w:r>
+    </w:p>
+    <w:p>
+      <w:pPr>
+        <w:ind w:left="720"/>
+        <w:jc w:val="both"/>
+        <w:rPr>
+          <w:rFonts w:asciiTheme="minorHAnsi" w:hAnsiTheme="minorHAnsi" w:cstheme="minorHAnsi"/>
+          <w:sz w:val="26"/>
+          <w:szCs w:val="26"/>
+          <w:lang w:val="en-GB"/>
+        </w:rPr>
+      </w:pPr>
+      <w:r>
+        <w:rPr>
+          <w:rFonts w:asciiTheme="minorHAnsi" w:hAnsiTheme="minorHAnsi" w:cstheme="minorHAnsi"/>
+          <w:b/>
+          <w:sz w:val="26"/>
+          <w:szCs w:val="26"/>
+          <w:lang w:val="en-GB"/>
+        </w:rPr>
+        <w:t xml:space="preserve">Technologies: </w:t>
+      </w:r>
+      <w:r>
+        <w:rPr>
+          <w:rFonts w:asciiTheme="minorHAnsi" w:hAnsiTheme="minorHAnsi" w:cstheme="minorHAnsi"/>
+          <w:sz w:val="26"/>
+          <w:szCs w:val="26"/>
+          <w:lang w:val="en-GB"/>
+        </w:rPr>
+        <w:t>OOP, PHP</w:t>
+      </w:r>
+      <w:r>
+        <w:rPr>
+          <w:rFonts w:asciiTheme="minorHAnsi" w:hAnsiTheme="minorHAnsi" w:cstheme="minorHAnsi"/>
+          <w:sz w:val="26"/>
+          <w:szCs w:val="26"/>
+          <w:lang w:val="en-GB"/>
+        </w:rPr>
+        <w:t>8</w:t>
+      </w:r>
+      <w:r>
+        <w:rPr>
+          <w:rFonts w:asciiTheme="minorHAnsi" w:hAnsiTheme="minorHAnsi" w:cstheme="minorHAnsi"/>
+          <w:sz w:val="26"/>
+          <w:szCs w:val="26"/>
+          <w:lang w:val="en-GB"/>
+        </w:rPr>
+        <w:t xml:space="preserve">, </w:t>
+      </w:r>
+      <w:r>
+        <w:rPr>
+          <w:rFonts w:asciiTheme="minorHAnsi" w:hAnsiTheme="minorHAnsi" w:cstheme="minorHAnsi"/>
+          <w:sz w:val="26"/>
+          <w:szCs w:val="26"/>
+          <w:lang w:val="en-GB"/>
+        </w:rPr>
+        <w:t xml:space="preserve">New Relic, </w:t>
+      </w:r>
+      <w:r>
+        <w:rPr>
+          <w:rFonts w:asciiTheme="minorHAnsi" w:hAnsiTheme="minorHAnsi" w:cstheme="minorHAnsi"/>
+          <w:sz w:val="26"/>
+          <w:szCs w:val="26"/>
+          <w:lang w:val="en-GB"/>
+        </w:rPr>
+        <w:t xml:space="preserve">HTML, CSS3, Javascript, Prototype, Magento </w:t>
+      </w:r>
+      <w:r>
+        <w:rPr>
+          <w:rFonts w:asciiTheme="minorHAnsi" w:hAnsiTheme="minorHAnsi" w:cstheme="minorHAnsi"/>
+          <w:sz w:val="26"/>
+          <w:szCs w:val="26"/>
+          <w:lang w:val="en-GB"/>
+        </w:rPr>
+        <w:t>Cloud</w:t>
+      </w:r>
+      <w:r>
+        <w:rPr>
+          <w:rFonts w:asciiTheme="minorHAnsi" w:hAnsiTheme="minorHAnsi" w:cstheme="minorHAnsi"/>
+          <w:sz w:val="26"/>
+          <w:szCs w:val="26"/>
+          <w:lang w:val="en-GB"/>
+        </w:rPr>
+        <w:t>, Composer, MySQL, Scrum</w:t>
+      </w:r>
+      <w:r>
+        <w:rPr>
+          <w:rFonts w:asciiTheme="minorHAnsi" w:hAnsiTheme="minorHAnsi" w:cstheme="minorHAnsi"/>
+          <w:sz w:val="26"/>
+          <w:szCs w:val="26"/>
+          <w:lang w:val="en-GB"/>
+        </w:rPr>
+        <w:t xml:space="preserve">, </w:t>
+      </w:r>
+      <w:r>
+        <w:rPr>
+          <w:rFonts w:asciiTheme="minorHAnsi" w:hAnsiTheme="minorHAnsi" w:cstheme="minorHAnsi"/>
+          <w:sz w:val="26"/>
+          <w:szCs w:val="26"/>
+          <w:lang w:val="en-GB"/>
+        </w:rPr>
+        <w:t>PHP Unit</w:t>
+      </w:r>
+      <w:r>
+        <w:rPr>
+          <w:rFonts w:asciiTheme="minorHAnsi" w:hAnsiTheme="minorHAnsi" w:cstheme="minorHAnsi"/>
+          <w:sz w:val="26"/>
+          <w:szCs w:val="26"/>
+          <w:lang w:val="en-GB"/>
+        </w:rPr>
+        <w:t>.</w:t>
+      </w:r>
+    </w:p>
+    <w:p>
+      <w:pPr>
+        <w:ind w:left="720"/>
+        <w:jc w:val="both"/>
+        <w:rPr>
+          <w:rFonts w:asciiTheme="minorHAnsi" w:hAnsiTheme="minorHAnsi" w:cstheme="minorHAnsi"/>
+          <w:sz w:val="26"/>
+          <w:szCs w:val="26"/>
+          <w:lang w:val="en-GB"/>
+        </w:rPr>
+      </w:pPr>
     </w:p>
     <w:sectPr>
       <w:headerReference w:type="even" r:id="rId18"/>
@@ -16044,7 +16615,7 @@
   <w:style w:type="paragraph" w:default="1" w:styleId="Normal">
     <w:name w:val="Normal"/>
     <w:qFormat/>
-    <w:rsid w:val="00815EB4"/>
+    <w:rsid w:val="005247A4"/>
     <w:pPr>
       <w:spacing w:after="200" w:line="276" w:lineRule="auto"/>
     </w:pPr>
@@ -16165,7 +16736,6 @@
   <w:style w:type="character" w:default="1" w:styleId="Fuentedeprrafopredeter">
     <w:name w:val="Default Paragraph Font"/>
     <w:uiPriority w:val="1"/>
-    <w:semiHidden/>
     <w:unhideWhenUsed/>
   </w:style>
   <w:style w:type="table" w:default="1" w:styleId="Tablanormal">

</xml_diff>